<commit_message>
feat: paper sau review (tạm ổn)
</commit_message>
<xml_diff>
--- a/papers/PaperID 804 final.docx
+++ b/papers/PaperID 804 final.docx
@@ -9,6 +9,7 @@
       <w:r>
         <w:rPr>
           <w:color w:val="000000"/>
+          <w:sz w:val="24"/>
         </w:rPr>
         <w:t>LAVA: A Lightweight Benchmarking Framework for Robust and Efficient Deepfake Voice Detection</w:t>
       </w:r>
@@ -148,6 +149,9 @@
         <w:ind w:firstLine="0"/>
       </w:pPr>
       <w:r>
+        <w:rPr>
+          <w:sz w:val="18"/>
+        </w:rPr>
         <w:t>Abstract. LAVA compares heterogeneous deepfake-voice detectors under common integrity, P(FAKE), stress-diagnostic, and runtime contracts. Four locally trained Mel-sequence artifacts and externally pretrained RawNet2 and AASIST references were evaluated on a checksum-group-disjoint test set of 2,737 recordings. ShuffleNetV2 achieved F1 0.9824, ROC-AUC 0.9929, PR-AUC 0.9898, specificity 0.9848, and EER 1.46%. On one single-thread desktop CPU, MobileNetV3 had the lowest end-to-end latency (43.81 ms; RTF 0.0146). A fixed 100-recording diagnostic covered four AWGN levels, four codec round trips, and simulated replay; low-SNR noise was the main observed weakness. MobileNetV3 and ShuffleNetV2 were non-dominated under the evaluated objectives. The evidence supports offline deployment-oriented comparison, not full-test robustness, unseen-corpus, physical-replay, streaming, edge-device, or multi-seed claims.</w:t>
       </w:r>
     </w:p>
@@ -160,45 +164,51 @@
         <w:rPr>
           <w:b/>
           <w:color w:val="000000"/>
+          <w:sz w:val="18"/>
         </w:rPr>
         <w:t>Keywords:</w:t>
       </w:r>
       <w:r>
+        <w:rPr>
+          <w:color w:val="000000"/>
+          <w:sz w:val="18"/>
+        </w:rPr>
+        <w:t xml:space="preserve"> Deepfake voice detection, audio anti-spoofing, lightweight deep learning, robustness, computational efficiency, Pareto analysis.</w:t>
+      </w:r>
+    </w:p>
+    <w:p>
+      <w:pPr>
+        <w:pStyle w:val="heading1"/>
+        <w:spacing w:after="0" w:line="240" w:lineRule="atLeast"/>
+      </w:pPr>
+      <w:r>
+        <w:t>Introduction</w:t>
+      </w:r>
+    </w:p>
+    <w:p>
+      <w:pPr>
+        <w:pStyle w:val="p1a"/>
+        <w:spacing w:before="60"/>
         <w:rPr>
           <w:color w:val="000000"/>
         </w:rPr>
-        <w:t xml:space="preserve"> Deepfake voice detection, audio anti-spoofing, lightweight deep learning, robustness, computational efficiency, Pareto analysis.</w:t>
+      </w:pPr>
+      <w:r>
+        <w:rPr>
+          <w:sz w:val="20"/>
+        </w:rPr>
+        <w:t>Synthetic and converted speech pose risks to speaker verification and human decision-making. Surveys document rapid progress in deepfake voice detection [1], [2]. Shared resources such as ASVspoof and WaveFake support evaluation [3], [4]. Comparisons nevertheless remain difficult because studies differ in partitions, labels, duration, preprocessing, calibration, and runtime boundaries; byte-identical recordings across splits add an integrity risk.</w:t>
       </w:r>
     </w:p>
     <w:p>
       <w:pPr>
-        <w:pStyle w:val="heading1"/>
-        <w:spacing w:after="0" w:line="240" w:lineRule="atLeast"/>
-      </w:pPr>
-      <w:r>
-        <w:t>Introduction</w:t>
-      </w:r>
-    </w:p>
-    <w:p>
-      <w:pPr>
         <w:pStyle w:val="p1a"/>
-        <w:spacing w:before="240"/>
+        <w:spacing w:before="60"/>
+      </w:pPr>
+      <w:r>
         <w:rPr>
           <w:color w:val="000000"/>
-        </w:rPr>
-      </w:pPr>
-      <w:r>
-        <w:t>Synthetic and converted speech pose risks to speaker verification and human decision-making. Surveys document rapid progress in deepfake voice detection [1], [2]. Shared resources such as ASVspoof and WaveFake support evaluation [3], [4]. Comparisons nevertheless remain difficult because studies differ in partitions, labels, duration, preprocessing, calibration, and runtime boundaries; byte-identical recordings across splits add an integrity risk.</w:t>
-      </w:r>
-    </w:p>
-    <w:p>
-      <w:pPr>
-        <w:pStyle w:val="p1a"/>
-        <w:spacing w:before="240"/>
-      </w:pPr>
-      <w:r>
-        <w:rPr>
-          <w:color w:val="000000"/>
+          <w:sz w:val="20"/>
         </w:rPr>
         <w:lastRenderedPageBreak/>
         <w:t>LAVA compares heterogeneous deployed artifacts through one interface while preserving their Mel-sequence or raw-waveform pipelines. It standardizes integrity checks, P(FAKE) semantics, stress conditions, outputs, and timing. Four artifacts were trained locally; RawNet2 and AASIST are external references. Clean evaluation uses the full test set, stress diagnostics use a fixed subset, and timing uses one desktop CPU, so the evidence does not establish general robustness, streaming, or edge-device operation. The study addresses:</w:t>
@@ -300,7 +310,7 @@
     <w:p>
       <w:pPr>
         <w:pStyle w:val="NormalWeb"/>
-        <w:spacing w:before="240" w:beforeAutospacing="0" w:afterAutospacing="0" w:line="240" w:lineRule="atLeast"/>
+        <w:spacing w:before="60" w:beforeAutospacing="0" w:afterAutospacing="0" w:line="240" w:lineRule="atLeast"/>
         <w:jc w:val="both"/>
         <w:rPr>
           <w:sz w:val="20"/>
@@ -308,6 +318,9 @@
         </w:rPr>
       </w:pPr>
       <w:r>
+        <w:rPr>
+          <w:sz w:val="20"/>
+        </w:rPr>
         <w:t>The study makes three evidence-backed contributions:</w:t>
       </w:r>
     </w:p>
@@ -316,6 +329,9 @@
         <w:pStyle w:val="NormalWeb"/>
       </w:pPr>
       <w:r>
+        <w:rPr>
+          <w:sz w:val="20"/>
+        </w:rPr>
         <w:t>• A checksum-group-disjoint, artifact-traceable clean evaluation contract centered on ROC-AUC/EER, calibrated score semantics, and explicit provenance.</w:t>
       </w:r>
     </w:p>
@@ -324,6 +340,9 @@
         <w:pStyle w:val="NormalWeb"/>
       </w:pPr>
       <w:r>
+        <w:rPr>
+          <w:sz w:val="20"/>
+        </w:rPr>
         <w:t>• Matched fixed-subset diagnostics for multiple noise levels, codec settings, and simulated replay, with aggregate failure-pattern analysis.</w:t>
       </w:r>
     </w:p>
@@ -332,6 +351,9 @@
         <w:pStyle w:val="NormalWeb"/>
       </w:pPr>
       <w:r>
+        <w:rPr>
+          <w:sz w:val="20"/>
+        </w:rPr>
         <w:t>• Single-thread desktop-CPU timing and exploratory three-objective Pareto analysis for scenario-specific artifact selection.</w:t>
       </w:r>
     </w:p>
@@ -357,7 +379,10 @@
         <w:pStyle w:val="p1a"/>
       </w:pPr>
       <w:r>
-        <w:t>ASVspoof 2019 separates logical-access synthesis and conversion from replay-oriented physical access [3], [5]. ASVspoof 2021 adds channel, compression, and real-environment replay variation [6]. WaveFake covers multiple generators and two languages [4]. RawNet2 and SincNet represent raw-waveform modeling [8], [9]. AASIST and wav2vec 2.0 broaden graph and self-supervised representations [10], [11]. LCNN provides a complementary synthetic-speech baseline [12]. Scores remain tied to each dataset, attack partition, preprocessing, and decision protocol.</w:t>
+        <w:rPr>
+          <w:sz w:val="20"/>
+        </w:rPr>
+        <w:t>ASVspoof 2019 separates logical-access synthesis and conversion from replay-oriented physical access [3]. ASVspoof 2021 adds channel, compression, and real-environment replay variation [5]. WaveFake covers multiple generators and two languages [4]. RawNet2 and SincNet represent raw-waveform modeling [6], [7]. AASIST and wav2vec 2.0 broaden graph and self-supervised representations [8], [9]. Scores remain tied to each dataset, attack partition, preprocessing, and decision protocol.</w:t>
       </w:r>
     </w:p>
     <w:p>
@@ -373,7 +398,10 @@
         <w:pStyle w:val="p1a"/>
       </w:pPr>
       <w:r>
-        <w:t>Robustness and generalization concern different shifts. ASVspoof tasks cover simulated or real-environment replay and channel variation [3], [6]. A wav2vec 2.0 system addresses unmatched codec, attack, and source-domain variation [11]. Cross-source studies test generalization beyond one partition [13], [14]. Other work examines attack-agnostic data and the nature of domain shift [15], [16]. Cross-domain corpora extend this evidence [17]. Recent studies examine non-semantic representations and physical speaker-microphone replay [25], [26]. Multilingual cross-domain evaluation is also emerging [27]. These protocols are not interchangeable.</w:t>
+        <w:rPr>
+          <w:sz w:val="20"/>
+        </w:rPr>
+        <w:t>Robustness and generalization concern different shifts. ASVspoof tasks cover simulated or real-environment replay and channel variation [3], [5]. A wav2vec 2.0 system addresses unmatched codec, attack, and source-domain variation [9]. Cross-source studies test generalization beyond one partition [10], [11]. Other work examines attack-agnostic data and the nature of domain shift [12], [13]. Cross-domain corpora extend this evidence [14]. Recent studies examine non-semantic representations and physical speaker-microphone replay [22], [23]. Multilingual cross-domain evaluation is also emerging [24]. These protocols are not interchangeable.</w:t>
       </w:r>
     </w:p>
     <w:p>
@@ -390,7 +418,10 @@
         <w:pStyle w:val="p1a"/>
       </w:pPr>
       <w:r>
-        <w:t>Deployment evidence requires a common workload and timing boundary. MobileNet variants report efficiency for vision workloads [18], [20]. ShuffleNet variants do likewise [19], [21]. MnasNet and EfficientNet target mobile or compound scaling [22], [23]. These are not complete audio-pipeline measurements. Anti-spoofing studies mainly emphasize EER or t-DCF [8], [10]. Wav2vec-based work also focuses on detection rather than matched end-to-end timing [11]. Model size alone is not a deployment proxy.</w:t>
+        <w:rPr>
+          <w:sz w:val="20"/>
+        </w:rPr>
+        <w:t>Deployment evidence requires a common workload and timing boundary. MobileNet variants report efficiency for vision workloads [15], [17]. ShuffleNet variants do likewise [16], [18]. MnasNet and EfficientNet target mobile or compound scaling [19], [20]. These are not complete audio-pipeline measurements. Anti-spoofing studies mainly emphasize EER or t-DCF [6], [8]. Wav2vec-based work also focuses on detection rather than matched end-to-end timing [9]. Model size alone is not a deployment proxy.</w:t>
       </w:r>
     </w:p>
     <w:p>
@@ -399,6 +430,9 @@
         <w:ind w:firstLine="227"/>
       </w:pPr>
       <w:r>
+        <w:rPr>
+          <w:sz w:val="20"/>
+        </w:rPr>
         <w:t>The surveyed studies assess clean discrimination, robustness or generalization, and efficiency under different protocols, making deployment-oriented comparison across heterogeneous artifacts difficult. LAVA addresses this comparability gap with one artifact-traceable offline contract; it does not claim unseen-corpus generalization, physical-replay robustness, streaming, or edge-device validation.</w:t>
       </w:r>
     </w:p>
@@ -417,7 +451,7 @@
     <w:p>
       <w:pPr>
         <w:pStyle w:val="heading2"/>
-        <w:spacing w:before="240" w:after="0"/>
+        <w:spacing w:before="120" w:after="0"/>
       </w:pPr>
       <w:r>
         <w:t>LAVA Framework and Experimental Protocol</w:t>
@@ -426,16 +460,19 @@
     <w:p>
       <w:pPr>
         <w:pStyle w:val="p1a"/>
-        <w:spacing w:before="240"/>
-      </w:pPr>
-      <w:r>
-        <w:t>LAVA separates canonical data and integrity, registered detectors, conditions, measurements, and analyses. The registry records each artifact's input, duration, threshold, and provenance; adapters preserve native computation while exposing common scores and resource measures. Figure 1 summarizes the integrity-controlled evaluation flow.</w:t>
+        <w:spacing w:before="60"/>
+      </w:pPr>
+      <w:r>
+        <w:rPr>
+          <w:sz w:val="20"/>
+        </w:rPr>
+        <w:t>LAVA separates canonical data and integrity, registered detectors, conditions, measurements, and analyses. The registry records each artifact's input, duration, threshold, and provenance; adapters preserve native computation while exposing common scores and resource measures. Figure 1 summarizes the six-detector contract, and Figure 2 shows the integrity-controlled data flow.</w:t>
       </w:r>
     </w:p>
     <w:p>
       <w:pPr>
         <w:keepNext/>
-        <w:spacing w:before="240"/>
+        <w:spacing w:before="60"/>
         <w:jc w:val="center"/>
         <w:sectPr>
           <w:pgSz w:w="11906" w:h="16838"/>
@@ -449,13 +486,73 @@
     <w:p>
       <w:pPr>
         <w:keepNext/>
-        <w:spacing w:before="240" w:after="120"/>
+        <w:spacing w:before="60"/>
+        <w:jc w:val="center"/>
+      </w:pPr>
+      <w:r>
+        <w:rPr>
+          <w:noProof/>
+          <w:sz w:val="20"/>
+        </w:rPr>
+        <w:drawing>
+          <wp:inline distT="0" distB="0" distL="0" distR="0" wp14:anchorId="35F32EB2" wp14:editId="1EAD13D0">
+            <wp:extent cx="1866900" cy="1663700"/>
+            <wp:effectExtent l="0" t="0" r="0" b="0"/>
+            <wp:docPr id="2" name="Image 2"/>
+            <wp:cNvGraphicFramePr/>
+            <a:graphic xmlns:a="http://schemas.openxmlformats.org/drawingml/2006/main">
+              <a:graphicData uri="http://schemas.openxmlformats.org/drawingml/2006/picture">
+                <pic:pic xmlns:pic="http://schemas.openxmlformats.org/drawingml/2006/picture">
+                  <pic:nvPicPr>
+                    <pic:cNvPr id="2" name="Image 2"/>
+                    <pic:cNvPicPr/>
+                  </pic:nvPicPr>
+                  <pic:blipFill>
+                    <a:blip r:embed="rId8" cstate="print"/>
+                    <a:stretch>
+                      <a:fillRect/>
+                    </a:stretch>
+                  </pic:blipFill>
+                  <pic:spPr>
+                    <a:xfrm>
+                      <a:off x="0" y="0"/>
+                      <a:ext cx="1866900" cy="1663700"/>
+                    </a:xfrm>
+                    <a:prstGeom prst="rect">
+                      <a:avLst/>
+                    </a:prstGeom>
+                  </pic:spPr>
+                </pic:pic>
+              </a:graphicData>
+            </a:graphic>
+          </wp:inline>
+        </w:drawing>
+      </w:r>
+    </w:p>
+    <w:p>
+      <w:pPr>
+        <w:pStyle w:val="Caption"/>
+        <w:spacing w:before="60"/>
+        <w:jc w:val="center"/>
+        <w:rPr>
+          <w:rFonts w:ascii="Times New Roman" w:eastAsia="Times New Roman" w:hAnsi="Times New Roman" w:cs="Times New Roman"/>
+        </w:rPr>
+      </w:pPr>
+      <w:r>
+        <w:t>Fig. 1. Six detectors under the unified LAVA evaluation contract.</w:t>
+      </w:r>
+    </w:p>
+    <w:p>
+      <w:pPr>
+        <w:keepNext/>
+        <w:spacing w:before="60" w:after="120"/>
         <w:ind w:firstLine="0"/>
         <w:jc w:val="center"/>
       </w:pPr>
       <w:r>
         <w:rPr>
           <w:noProof/>
+          <w:sz w:val="20"/>
         </w:rPr>
         <w:drawing>
           <wp:inline distT="0" distB="0" distL="0" distR="0" wp14:anchorId="0BA1456C" wp14:editId="09BD01B2">
@@ -507,13 +604,13 @@
         </w:rPr>
       </w:pPr>
       <w:r>
-        <w:t>Fig. 1. SHA-256 conflict quarantine, canonicalization, and checksum-group-disjoint splitting.</w:t>
+        <w:t>Fig. 2. SHA-256 conflict quarantine, canonicalization, and checksum-group-disjoint splitting.</w:t>
       </w:r>
     </w:p>
     <w:p>
       <w:pPr>
         <w:pStyle w:val="heading2"/>
-        <w:spacing w:before="240" w:after="0"/>
+        <w:spacing w:before="120" w:after="0"/>
         <w:sectPr>
           <w:type w:val="continuous"/>
           <w:pgSz w:w="11906" w:h="16838"/>
@@ -527,7 +624,7 @@
     <w:p>
       <w:pPr>
         <w:pStyle w:val="heading2"/>
-        <w:spacing w:before="240" w:after="0"/>
+        <w:spacing w:before="120" w:after="0"/>
       </w:pPr>
       <w:r>
         <w:t>Dataset Integrity and Canonical Split</w:t>
@@ -545,7 +642,7 @@
     </w:p>
     <w:p>
       <w:pPr>
-        <w:spacing w:before="240"/>
+        <w:spacing w:before="60"/>
         <w:ind w:firstLine="220"/>
       </w:pPr>
       <m:oMathPara>
@@ -895,7 +992,7 @@
     <w:p>
       <w:pPr>
         <w:pStyle w:val="Caption"/>
-        <w:spacing w:before="240" w:after="120"/>
+        <w:spacing w:before="60" w:after="120"/>
         <w:ind w:firstLine="221"/>
         <w:jc w:val="center"/>
         <w:rPr>
@@ -1372,7 +1469,7 @@
     <w:p>
       <w:pPr>
         <w:pStyle w:val="heading2"/>
-        <w:spacing w:before="240" w:after="0"/>
+        <w:spacing w:before="120" w:after="0"/>
       </w:pPr>
       <w:r>
         <w:lastRenderedPageBreak/>
@@ -1381,56 +1478,20 @@
     </w:p>
     <w:p>
       <w:pPr>
-        <w:spacing w:before="240"/>
+        <w:spacing w:before="60"/>
         <w:ind w:firstLine="0"/>
       </w:pPr>
       <w:r>
         <w:rPr>
-          <w:noProof/>
+          <w:sz w:val="20"/>
         </w:rPr>
-        <w:t xml:space="preserve">Lightweight inputs are decoded, channel-averaged, polyphase-resampled to 22,050 Hz, and padded/truncated to 3.0 s. Six chronological 0.5-s segments use a Hann STFT (N = 2048, hop 512), 128 HTK-style Mel filters spanning 20–8,000 Hz, relative dB mapping clipped to 80 dB, [0, 255] scaling, bilinear 224 × 224 resizing, and RGB replication </w:t>
-      </w:r>
-      <w:r>
-        <w:rPr>
-          <w:noProof/>
-        </w:rPr>
-        <w:fldChar w:fldCharType="begin"/>
-      </w:r>
-      <w:r>
-        <w:rPr>
-          <w:noProof/>
-        </w:rPr>
-        <w:instrText xml:space="preserve"> ADDIN EN.CITE &lt;EndNote&gt;&lt;Cite&gt;&lt;Author&gt;McFee&lt;/Author&gt;&lt;Year&gt;2015&lt;/Year&gt;&lt;RecNum&gt;24&lt;/RecNum&gt;&lt;DisplayText&gt;[24]&lt;/DisplayText&gt;&lt;record&gt;&lt;rec-number&gt;24&lt;/rec-number&gt;&lt;foreign-keys&gt;&lt;key app="EN" db-id="5rd5wpevbrtwflexee6p2fwbe2stesptrxw9" timestamp="1788702341"&gt;24&lt;/key&gt;&lt;/foreign-keys&gt;&lt;ref-type name="Conference Proceedings"&gt;10&lt;/ref-type&gt;&lt;contributors&gt;&lt;authors&gt;&lt;author&gt;McFee, Brian&lt;/author&gt;&lt;author&gt;Raffel, Colin&lt;/author&gt;&lt;author&gt;Liang, Dawen&lt;/author&gt;&lt;author&gt;Ellis, Daniel P. W.&lt;/author&gt;&lt;author&gt;McVicar, Matt&lt;/author&gt;&lt;author&gt;Battenberg, Eric&lt;/author&gt;&lt;author&gt;Nieto, Oriol&lt;/author&gt;&lt;/authors&gt;&lt;/contributors&gt;&lt;titles&gt;&lt;title&gt;librosa: Audio and music signal analysis in Python&lt;/title&gt;&lt;secondary-title&gt;Proceedings of the 14th Python in Science Conference&lt;/secondary-title&gt;&lt;/titles&gt;&lt;pages&gt;18-25&lt;/pages&gt;&lt;dates&gt;&lt;year&gt;2015&lt;/year&gt;&lt;pub-dates&gt;&lt;date&gt;06-12 July&lt;/date&gt;&lt;/pub-dates&gt;&lt;/dates&gt;&lt;urls&gt;&lt;related-urls&gt;&lt;url&gt;https://scipy-proceedings.scipy.org/paper_files/scipy2015/paper_files/brian_mcfee/brian_mcfee.pdf&lt;/url&gt;&lt;/related-urls&gt;&lt;/urls&gt;&lt;electronic-resource-num&gt;10.25080/Majora-7b98e3ed-003&lt;/electronic-resource-num&gt;&lt;/record&gt;&lt;/Cite&gt;&lt;/EndNote&gt;</w:instrText>
-      </w:r>
-      <w:r>
-        <w:rPr>
-          <w:noProof/>
-        </w:rPr>
-        <w:fldChar w:fldCharType="separate"/>
-      </w:r>
-      <w:r>
-        <w:rPr>
-          <w:noProof/>
-        </w:rPr>
-        <w:t>[24]</w:t>
-      </w:r>
-      <w:r>
-        <w:rPr>
-          <w:noProof/>
-        </w:rPr>
-        <w:fldChar w:fldCharType="end"/>
-      </w:r>
-      <w:r>
-        <w:rPr>
-          <w:noProof/>
-        </w:rPr>
-        <w:t>. For segment t</w:t>
+        <w:t>Lightweight inputs are decoded, channel-averaged, polyphase-resampled to 22,050 Hz, and padded/truncated to 3.0 s. Six chronological 0.5-s segments use a Hann STFT (N = 2048, hop 512), 128 HTK-style Mel filters spanning 20–8,000 Hz, relative dB mapping clipped to 80 dB, [0, 255] scaling, bilinear 224 × 224 resizing, and RGB replication [21]. For segment t</w:t>
       </w:r>
     </w:p>
     <w:p>
       <w:pPr>
         <w:pStyle w:val="heading2"/>
-        <w:spacing w:before="240" w:after="0"/>
+        <w:spacing w:before="120" w:after="0"/>
       </w:pPr>
       <w:r>
         <w:t>Evaluated Detector Architectures</w:t>
@@ -1438,17 +1499,20 @@
     </w:p>
     <w:p>
       <w:pPr>
-        <w:spacing w:before="240"/>
+        <w:spacing w:before="60"/>
         <w:ind w:firstLine="0"/>
       </w:pPr>
       <w:r>
-        <w:t>The lightweight family uses TimeDistributed MobileNetV3Small, ShuffleNetV2-1.0x, MnasNet-A1-1.0, or EfficientNet-B0 segment encoders. Each encoder produces six embeddings, an LSTM with 128 units aggregates them, and a 64-unit ReLU layer plus dropout 0.4 feeds a sigmoid. RawNet2 instead uses a Sinc-style waveform front end, residual temporal blocks, attention, a GRU, and a two-class head [8], [9]. AASIST combines a raw-waveform front end with spectral-temporal graph attention, heterogeneous graph interaction, pooling, and two-class readout [7], [10]:</w:t>
+        <w:rPr>
+          <w:sz w:val="20"/>
+        </w:rPr>
+        <w:t>The lightweight family uses TimeDistributed MobileNetV3Small, ShuffleNetV2-1.0x, MnasNet-A1-1.0, or EfficientNet-B0 segment encoders. Each encoder produces six embeddings, an LSTM with 128 units aggregates them, and a 64-unit ReLU layer plus dropout 0.4 feeds a sigmoid. RawNet2 instead uses a Sinc-style waveform front end, residual temporal blocks, attention, a GRU, and a two-class head [6], [7]. AASIST combines a raw-waveform front end with spectral-temporal graph attention, heterogeneous graph interaction, pooling, and two-class readout [8]. Figure 3 summarizes architecture and provenance:</w:t>
       </w:r>
     </w:p>
     <w:p>
       <w:pPr>
         <w:pStyle w:val="heading2"/>
-        <w:spacing w:before="240" w:after="0"/>
+        <w:spacing w:before="120" w:after="0"/>
       </w:pPr>
       <w:r>
         <w:rPr>
@@ -1459,17 +1523,20 @@
     </w:p>
     <w:p>
       <w:pPr>
-        <w:spacing w:before="240"/>
+        <w:spacing w:before="60"/>
         <w:ind w:firstLine="0"/>
       </w:pPr>
       <w:r>
+        <w:rPr>
+          <w:sz w:val="20"/>
+        </w:rPr>
         <w:t>MobileNet and EfficientNet use ImageNet initialization; EfficientNet-B0 is the available warm-up checkpoint, not a completed fine-tuning result. MnasNet and ShuffleNet were trained from scratch, while RawNet2 and AASIST are external references (Table 1).</w:t>
       </w:r>
     </w:p>
     <w:p>
       <w:pPr>
         <w:keepNext/>
-        <w:spacing w:before="240"/>
+        <w:spacing w:before="60"/>
         <w:ind w:firstLine="0"/>
         <w:sectPr>
           <w:type w:val="continuous"/>
@@ -1483,8 +1550,71 @@
     </w:p>
     <w:p>
       <w:pPr>
+        <w:keepNext/>
+        <w:spacing w:before="60"/>
+        <w:ind w:firstLine="0"/>
+        <w:jc w:val="center"/>
+      </w:pPr>
+      <w:r>
+        <w:rPr>
+          <w:noProof/>
+          <w:sz w:val="20"/>
+        </w:rPr>
+        <w:drawing>
+          <wp:inline distT="0" distB="0" distL="0" distR="0" wp14:anchorId="145418F4" wp14:editId="6267AEA6">
+            <wp:extent cx="1884460" cy="1872532"/>
+            <wp:effectExtent l="0" t="0" r="1905" b="0"/>
+            <wp:docPr id="7" name="Image 7"/>
+            <wp:cNvGraphicFramePr>
+              <a:graphicFrameLocks xmlns:a="http://schemas.openxmlformats.org/drawingml/2006/main"/>
+            </wp:cNvGraphicFramePr>
+            <a:graphic xmlns:a="http://schemas.openxmlformats.org/drawingml/2006/main">
+              <a:graphicData uri="http://schemas.openxmlformats.org/drawingml/2006/picture">
+                <pic:pic xmlns:pic="http://schemas.openxmlformats.org/drawingml/2006/picture">
+                  <pic:nvPicPr>
+                    <pic:cNvPr id="7" name="Image 7"/>
+                    <pic:cNvPicPr/>
+                  </pic:nvPicPr>
+                  <pic:blipFill>
+                    <a:blip r:embed="rId10" cstate="print">
+                      <a:extLst>
+                        <a:ext uri="{28A0092B-C50C-407E-A947-70E740481C1C}">
+                          <a14:useLocalDpi xmlns:a14="http://schemas.microsoft.com/office/drawing/2010/main" val="0"/>
+                        </a:ext>
+                      </a:extLst>
+                    </a:blip>
+                    <a:stretch>
+                      <a:fillRect/>
+                    </a:stretch>
+                  </pic:blipFill>
+                  <pic:spPr>
+                    <a:xfrm>
+                      <a:off x="0" y="0"/>
+                      <a:ext cx="1903316" cy="1891269"/>
+                    </a:xfrm>
+                    <a:prstGeom prst="rect">
+                      <a:avLst/>
+                    </a:prstGeom>
+                  </pic:spPr>
+                </pic:pic>
+              </a:graphicData>
+            </a:graphic>
+          </wp:inline>
+        </w:drawing>
+      </w:r>
+      <w:r>
+        <w:rPr>
+          <w:color w:val="000000"/>
+          <w:sz w:val="20"/>
+        </w:rPr>
+        <w:br/>
+        <w:t>(a) Mel-sequence temporal path</w:t>
+      </w:r>
+    </w:p>
+    <w:p>
+      <w:pPr>
         <w:pStyle w:val="Caption"/>
-        <w:spacing w:before="240"/>
+        <w:spacing w:before="60"/>
         <w:ind w:firstLine="0"/>
         <w:rPr>
           <w:rFonts w:ascii="Times New Roman" w:eastAsia="Times New Roman" w:hAnsi="Times New Roman" w:cs="Times New Roman"/>
@@ -1493,8 +1623,92 @@
     </w:p>
     <w:p>
       <w:pPr>
+        <w:keepNext/>
+        <w:spacing w:before="60"/>
+        <w:ind w:firstLine="0"/>
+      </w:pPr>
+      <w:r>
+        <w:rPr>
+          <w:noProof/>
+          <w:sz w:val="20"/>
+        </w:rPr>
+        <w:drawing>
+          <wp:inline distT="0" distB="0" distL="0" distR="0" wp14:anchorId="3E8BEB0E" wp14:editId="33F9D08F">
+            <wp:extent cx="2007235" cy="1717482"/>
+            <wp:effectExtent l="0" t="0" r="0" b="0"/>
+            <wp:docPr id="6" name="Image 6"/>
+            <wp:cNvGraphicFramePr>
+              <a:graphicFrameLocks xmlns:a="http://schemas.openxmlformats.org/drawingml/2006/main"/>
+            </wp:cNvGraphicFramePr>
+            <a:graphic xmlns:a="http://schemas.openxmlformats.org/drawingml/2006/main">
+              <a:graphicData uri="http://schemas.openxmlformats.org/drawingml/2006/picture">
+                <pic:pic xmlns:pic="http://schemas.openxmlformats.org/drawingml/2006/picture">
+                  <pic:nvPicPr>
+                    <pic:cNvPr id="6" name="Image 6"/>
+                    <pic:cNvPicPr/>
+                  </pic:nvPicPr>
+                  <pic:blipFill>
+                    <a:blip r:embed="rId11" cstate="print"/>
+                    <a:stretch>
+                      <a:fillRect/>
+                    </a:stretch>
+                  </pic:blipFill>
+                  <pic:spPr>
+                    <a:xfrm>
+                      <a:off x="0" y="0"/>
+                      <a:ext cx="2023966" cy="1731798"/>
+                    </a:xfrm>
+                    <a:prstGeom prst="rect">
+                      <a:avLst/>
+                    </a:prstGeom>
+                  </pic:spPr>
+                </pic:pic>
+              </a:graphicData>
+            </a:graphic>
+          </wp:inline>
+        </w:drawing>
+      </w:r>
+    </w:p>
+    <w:p>
+      <w:pPr>
+        <w:keepNext/>
+        <w:spacing w:before="60"/>
+        <w:ind w:firstLine="0"/>
+        <w:jc w:val="center"/>
+        <w:sectPr>
+          <w:type w:val="continuous"/>
+          <w:pgSz w:w="11906" w:h="16838"/>
+          <w:pgMar w:top="2948" w:right="2494" w:bottom="2948" w:left="2494" w:header="2381" w:footer="2324" w:gutter="0"/>
+          <w:cols w:num="2" w:space="227"/>
+          <w:titlePg/>
+          <w:docGrid w:linePitch="240"/>
+        </w:sectPr>
+      </w:pPr>
+      <w:r>
+        <w:rPr>
+          <w:color w:val="000000"/>
+          <w:sz w:val="20"/>
+        </w:rPr>
+        <w:t>(b) Artifact provenance</w:t>
+      </w:r>
+    </w:p>
+    <w:p>
+      <w:pPr>
         <w:pStyle w:val="Caption"/>
-        <w:spacing w:before="240" w:after="120"/>
+        <w:jc w:val="center"/>
+        <w:rPr>
+          <w:rFonts w:ascii="Times New Roman" w:eastAsia="Times New Roman" w:hAnsi="Times New Roman" w:cs="Times New Roman"/>
+          <w:color w:val="000000"/>
+        </w:rPr>
+      </w:pPr>
+      <w:r>
+        <w:t>Fig. 3. Lightweight architecture and artifact provenance; evaluation is shared, training is not.</w:t>
+      </w:r>
+    </w:p>
+    <w:p>
+      <w:pPr>
+        <w:pStyle w:val="Caption"/>
+        <w:spacing w:before="60" w:after="120"/>
         <w:jc w:val="center"/>
         <w:rPr>
           <w:rFonts w:ascii="Times New Roman" w:eastAsia="Times New Roman" w:hAnsi="Times New Roman" w:cs="Times New Roman"/>
@@ -1699,14 +1913,8 @@
               <w:spacing w:after="0"/>
               <w:jc w:val="center"/>
             </w:pPr>
-            <w:r/>
-            <w:r>
-              <w:rPr>
-                <w:rFonts w:ascii="Times New Roman" w:hAnsi="Times New Roman"/>
-                <w:b w:val="0"/>
-                <w:sz w:val="11"/>
-              </w:rPr>
-              <w:t>MobileNetV3-LSTM [18]</w:t>
+            <w:r>
+              <w:t>MobileNetV3-LSTM [15]</w:t>
             </w:r>
           </w:p>
         </w:tc>
@@ -1833,14 +2041,8 @@
               <w:spacing w:after="0"/>
               <w:jc w:val="center"/>
             </w:pPr>
-            <w:r/>
-            <w:r>
-              <w:rPr>
-                <w:rFonts w:ascii="Times New Roman" w:hAnsi="Times New Roman"/>
-                <w:b w:val="0"/>
-                <w:sz w:val="11"/>
-              </w:rPr>
-              <w:t>ShuffleNetV2-LSTM [19]</w:t>
+            <w:r>
+              <w:t>ShuffleNetV2-LSTM [16]</w:t>
             </w:r>
           </w:p>
         </w:tc>
@@ -1967,14 +2169,8 @@
               <w:spacing w:after="0"/>
               <w:jc w:val="center"/>
             </w:pPr>
-            <w:r/>
-            <w:r>
-              <w:rPr>
-                <w:rFonts w:ascii="Times New Roman" w:hAnsi="Times New Roman"/>
-                <w:b w:val="0"/>
-                <w:sz w:val="11"/>
-              </w:rPr>
-              <w:t>MnasNet-A1-LSTM [22]</w:t>
+            <w:r>
+              <w:t>MnasNet-A1-LSTM [19]</w:t>
             </w:r>
           </w:p>
         </w:tc>
@@ -2101,14 +2297,8 @@
               <w:spacing w:after="0"/>
               <w:jc w:val="center"/>
             </w:pPr>
-            <w:r/>
-            <w:r>
-              <w:rPr>
-                <w:rFonts w:ascii="Times New Roman" w:hAnsi="Times New Roman"/>
-                <w:b w:val="0"/>
-                <w:sz w:val="11"/>
-              </w:rPr>
-              <w:t>EffNet-B0 warm-up [23]</w:t>
+            <w:r>
+              <w:t>EffNet-B0 warm-up [20]</w:t>
             </w:r>
           </w:p>
         </w:tc>
@@ -2238,14 +2428,8 @@
               <w:spacing w:after="0"/>
               <w:jc w:val="center"/>
             </w:pPr>
-            <w:r/>
-            <w:r>
-              <w:rPr>
-                <w:rFonts w:ascii="Times New Roman" w:hAnsi="Times New Roman"/>
-                <w:b w:val="0"/>
-                <w:sz w:val="11"/>
-              </w:rPr>
-              <w:t>RawNet2 [8]</w:t>
+            <w:r>
+              <w:t>RawNet2 [6]</w:t>
             </w:r>
           </w:p>
         </w:tc>
@@ -2393,14 +2577,8 @@
               <w:spacing w:after="0"/>
               <w:jc w:val="center"/>
             </w:pPr>
-            <w:r/>
-            <w:r>
-              <w:rPr>
-                <w:rFonts w:ascii="Times New Roman" w:hAnsi="Times New Roman"/>
-                <w:b w:val="0"/>
-                <w:sz w:val="11"/>
-              </w:rPr>
-              <w:t>AASIST [10]</w:t>
+            <w:r>
+              <w:t>AASIST [8]</w:t>
             </w:r>
           </w:p>
         </w:tc>
@@ -2544,22 +2722,28 @@
     <w:p>
       <w:pPr/>
       <w:r>
+        <w:rPr>
+          <w:sz w:val="20"/>
+        </w:rPr>
         <w:t>All local runs used batch size 16, seed 42, validation-loss checkpointing, early stopping, and ReduceLROnPlateau; Table 2 gives artifact-specific initialization, learning rates, regularization, stopping outcomes, and calibration. RawNet2 and AASIST were not locally trained; their external checkpoints were loaded in PyTorch and exported to ONNX.</w:t>
       </w:r>
     </w:p>
     <w:p>
       <w:pPr>
-        <w:spacing w:before="240"/>
+        <w:spacing w:before="60"/>
         <w:ind w:firstLine="221"/>
       </w:pPr>
       <w:r>
+        <w:rPr>
+          <w:sz w:val="20"/>
+        </w:rPr>
         <w:t>LAVA fixes REAL=0 and FAKE=1; every adapter returns p = P(FAKE) and applies the detector threshold listed in Table 2.</w:t>
       </w:r>
     </w:p>
     <w:p>
       <w:pPr>
         <w:pStyle w:val="p1a"/>
-        <w:spacing w:before="240"/>
+        <w:spacing w:before="60"/>
         <w:jc w:val="center"/>
         <w:rPr>
           <w:rFonts w:ascii="Bookman Old Style" w:hAnsi="Bookman Old Style"/>
@@ -2787,16 +2971,19 @@
     </w:p>
     <w:p>
       <w:pPr>
-        <w:spacing w:before="240"/>
-      </w:pPr>
-      <w:r>
+        <w:spacing w:before="60"/>
+      </w:pPr>
+      <w:r>
+        <w:rPr>
+          <w:sz w:val="20"/>
+        </w:rPr>
         <w:t>The four lightweight thresholds in Table 2 are validation-only. The external reference artifacts use the uncalibrated default threshold of 0.5. Labels do not influence threshold selection or weighting, and scores are not interpreted as calibrated real-world probabilities.</w:t>
       </w:r>
     </w:p>
     <w:p>
       <w:pPr>
         <w:pStyle w:val="heading2"/>
-        <w:spacing w:before="240" w:after="0"/>
+        <w:spacing w:before="120" w:after="0"/>
       </w:pPr>
       <w:r>
         <w:t>Clean and Diagnostic Stress Evaluation</w:t>
@@ -2804,24 +2991,26 @@
     </w:p>
     <w:p>
       <w:pPr>
-        <w:spacing w:before="240"/>
+        <w:spacing w:before="60"/>
         <w:ind w:firstLine="0"/>
       </w:pPr>
       <w:r>
         <w:rPr>
           <w:color w:val="000000"/>
+          <w:sz w:val="20"/>
         </w:rPr>
         <w:t>Clean evaluation uses all 2,737 test recordings (1,575 REAL, 1,162 FAKE). Accuracy, precision, recall, F1, macro-F1, ROC-AUC from raw scores, and linearly interpolated EER are reported. With FAKE positive,</w:t>
       </w:r>
     </w:p>
     <w:p>
       <w:pPr>
-        <w:spacing w:before="240"/>
+        <w:spacing w:before="60"/>
         <w:ind w:firstLine="220"/>
       </w:pPr>
       <w:r>
         <w:rPr>
           <w:color w:val="000000"/>
+          <w:sz w:val="20"/>
         </w:rPr>
         <w:lastRenderedPageBreak/>
         <w:t>Diagnostic stress evaluation uses a fixed 100-recording subset (58 REAL, 42 FAKE; seed 42), and every artifact uses the same recordings. Four seeded AWGN levels (20, 10, 5, 0 dB) use sample-identity-derived seeds. FFmpeg round trips cover MP3 128/64 kb/s, Opus 64 kb/s, and AAC 96 kb/s. Simulated replay applies taps at 0/17/43/89 ms with gains 1/.45/.25/.12, normalization by 1.82, and a causal fourth-order 100-3,800-Hz band-pass; it is not physical replay. For nine conditions,</w:t>
@@ -2829,7 +3018,7 @@
     </w:p>
     <w:p>
       <w:pPr>
-        <w:spacing w:before="240"/>
+        <w:spacing w:before="60"/>
         <w:ind w:firstLine="0"/>
       </w:pPr>
       <m:oMathPara>
@@ -3066,12 +3255,13 @@
     </w:p>
     <w:p>
       <w:pPr>
-        <w:spacing w:before="240"/>
+        <w:spacing w:before="60"/>
         <w:ind w:firstLine="0"/>
       </w:pPr>
       <w:r>
         <w:rPr>
           <w:color w:val="000000"/>
+          <w:sz w:val="20"/>
         </w:rPr>
         <w:t>Negative degradation denotes improvement relative to a low diagnostic-subset baseline and is not evidence of general robustness. Full-test stress evaluation was not run; physical replay and unseen-corpus evaluations are not available.</w:t>
       </w:r>
@@ -3079,7 +3269,7 @@
     <w:p>
       <w:pPr>
         <w:pStyle w:val="heading2"/>
-        <w:spacing w:before="240" w:after="0"/>
+        <w:spacing w:before="120" w:after="0"/>
       </w:pPr>
       <w:r>
         <w:rPr>
@@ -3090,24 +3280,26 @@
     </w:p>
     <w:p>
       <w:pPr>
-        <w:spacing w:before="240"/>
+        <w:spacing w:before="60"/>
         <w:ind w:firstLine="0"/>
       </w:pPr>
       <w:r>
         <w:rPr>
           <w:color w:val="000000"/>
+          <w:sz w:val="20"/>
         </w:rPr>
         <w:t>Each artifact runs float32, batch one, one backend thread, and no accelerator in an isolated process. Ten warm-ups precede 50 timed runs. Measures include model-only and end-to-end latency, P95, load time, throughput, and whole-process RSS. The host is an AMD Ryzen 9 8940HX with 15.28 GiB usable RAM on 64-bit Windows 11 Pro build 26200; TensorFlow 2.15 and ONNX Runtime 1.17.3 execute the local and external artifacts, respectively. For N clips,</w:t>
       </w:r>
     </w:p>
     <w:p>
       <w:pPr>
-        <w:spacing w:before="240"/>
+        <w:spacing w:before="60"/>
         <w:ind w:firstLine="0"/>
       </w:pPr>
       <w:r>
         <w:rPr>
           <w:color w:val="000000"/>
+          <w:sz w:val="20"/>
         </w:rPr>
         <w:t>An RTF below one indicates faster-than-duration offline processing on this host; it does not establish causal streaming or edge-device deployment.</w:t>
       </w:r>
@@ -3115,24 +3307,28 @@
     <w:p>
       <w:pPr/>
       <w:r>
+        <w:rPr>
+          <w:sz w:val="20"/>
+        </w:rPr>
         <w:t>Uncertainty uses a stratified test-set percentile bootstrap (1,000 iterations; seed 42) for F1, ROC-AUC, and EER (Table 3). Paired correctness uses exact McNemar tests with Holm correction; this fixed-test evidence does not replace repeated training over independent seeds.</w:t>
       </w:r>
     </w:p>
     <w:p>
       <w:pPr>
-        <w:spacing w:before="240"/>
+        <w:spacing w:before="60"/>
         <w:ind w:firstLine="220"/>
       </w:pPr>
       <w:r>
         <w:rPr>
           <w:color w:val="000000"/>
+          <w:sz w:val="20"/>
         </w:rPr>
         <w:t>The exploratory Pareto analysis minimizes diagnostic-subset EER and end-to-end RTF while maximizing mean F1 across the nine executed stress conditions. After negating mean stressed F1, A dominates B when every objective is no worse and at least one is better:</w:t>
       </w:r>
     </w:p>
     <w:p>
       <w:pPr>
-        <w:spacing w:before="240"/>
+        <w:spacing w:before="60"/>
         <w:ind w:firstLine="220"/>
       </w:pPr>
       <m:oMathPara>
@@ -3222,7 +3418,7 @@
     </w:p>
     <w:p>
       <w:pPr>
-        <w:spacing w:before="240"/>
+        <w:spacing w:before="60"/>
         <w:ind w:firstLine="220"/>
       </w:pPr>
       <m:oMathPara>
@@ -3358,7 +3554,7 @@
       <w:pPr>
         <w:pStyle w:val="Caption"/>
         <w:keepNext/>
-        <w:spacing w:before="240" w:after="120"/>
+        <w:spacing w:before="60" w:after="120"/>
         <w:jc w:val="center"/>
         <w:rPr>
           <w:rFonts w:ascii="Times New Roman" w:eastAsia="Times New Roman" w:hAnsi="Times New Roman" w:cs="Times New Roman"/>
@@ -4930,7 +5126,7 @@
     <w:p>
       <w:pPr>
         <w:pStyle w:val="Caption"/>
-        <w:spacing w:before="240"/>
+        <w:spacing w:before="60"/>
         <w:ind w:firstLine="0"/>
         <w:rPr>
           <w:rFonts w:ascii="Times New Roman" w:eastAsia="Times New Roman" w:hAnsi="Times New Roman" w:cs="Times New Roman"/>
@@ -4947,6 +5143,174 @@
     </w:p>
     <w:p>
       <w:pPr>
+        <w:pStyle w:val="BodyText"/>
+        <w:keepNext/>
+        <w:spacing w:before="5"/>
+      </w:pPr>
+      <w:r>
+        <w:rPr>
+          <w:noProof/>
+        </w:rPr>
+        <w:drawing>
+          <wp:inline distT="0" distB="0" distL="0" distR="0" wp14:anchorId="6C8E2AEF" wp14:editId="2512011F">
+            <wp:extent cx="2124075" cy="1482853"/>
+            <wp:effectExtent l="0" t="0" r="0" b="3175"/>
+            <wp:docPr id="20" name="Image 20"/>
+            <wp:cNvGraphicFramePr>
+              <a:graphicFrameLocks xmlns:a="http://schemas.openxmlformats.org/drawingml/2006/main"/>
+            </wp:cNvGraphicFramePr>
+            <a:graphic xmlns:a="http://schemas.openxmlformats.org/drawingml/2006/main">
+              <a:graphicData uri="http://schemas.openxmlformats.org/drawingml/2006/picture">
+                <pic:pic xmlns:pic="http://schemas.openxmlformats.org/drawingml/2006/picture">
+                  <pic:nvPicPr>
+                    <pic:cNvPr id="20" name="Image 20"/>
+                    <pic:cNvPicPr/>
+                  </pic:nvPicPr>
+                  <pic:blipFill>
+                    <a:blip r:embed="rId12" cstate="print">
+                      <a:extLst>
+                        <a:ext uri="{28A0092B-C50C-407E-A947-70E740481C1C}">
+                          <a14:useLocalDpi xmlns:a14="http://schemas.microsoft.com/office/drawing/2010/main" val="0"/>
+                        </a:ext>
+                      </a:extLst>
+                    </a:blip>
+                    <a:stretch>
+                      <a:fillRect/>
+                    </a:stretch>
+                  </pic:blipFill>
+                  <pic:spPr>
+                    <a:xfrm>
+                      <a:off x="0" y="0"/>
+                      <a:ext cx="2124075" cy="1482853"/>
+                    </a:xfrm>
+                    <a:prstGeom prst="rect">
+                      <a:avLst/>
+                    </a:prstGeom>
+                  </pic:spPr>
+                </pic:pic>
+              </a:graphicData>
+            </a:graphic>
+          </wp:inline>
+        </w:drawing>
+      </w:r>
+    </w:p>
+    <w:p>
+      <w:pPr>
+        <w:pStyle w:val="Caption"/>
+        <w:numPr>
+          <w:ilvl w:val="0"/>
+          <w:numId w:val="7"/>
+        </w:numPr>
+        <w:jc w:val="center"/>
+        <w:rPr>
+          <w:rFonts w:ascii="Times New Roman" w:eastAsia="Times New Roman" w:hAnsi="Times New Roman" w:cs="Times New Roman"/>
+        </w:rPr>
+      </w:pPr>
+      <w:r>
+        <w:rPr>
+          <w:rFonts w:ascii="Times New Roman" w:eastAsia="Times New Roman" w:hAnsi="Times New Roman" w:cs="Times New Roman"/>
+        </w:rPr>
+        <w:t>ROC</w:t>
+      </w:r>
+    </w:p>
+    <w:p>
+      <w:pPr>
+        <w:pStyle w:val="BodyText"/>
+        <w:keepNext/>
+        <w:spacing w:before="5"/>
+      </w:pPr>
+      <w:r>
+        <w:rPr>
+          <w:noProof/>
+        </w:rPr>
+        <w:drawing>
+          <wp:inline distT="0" distB="0" distL="0" distR="0" wp14:anchorId="45056397" wp14:editId="7ACA7450">
+            <wp:extent cx="2124075" cy="1482853"/>
+            <wp:effectExtent l="0" t="0" r="0" b="3175"/>
+            <wp:docPr id="21" name="Image 21"/>
+            <wp:cNvGraphicFramePr>
+              <a:graphicFrameLocks xmlns:a="http://schemas.openxmlformats.org/drawingml/2006/main"/>
+            </wp:cNvGraphicFramePr>
+            <a:graphic xmlns:a="http://schemas.openxmlformats.org/drawingml/2006/main">
+              <a:graphicData uri="http://schemas.openxmlformats.org/drawingml/2006/picture">
+                <pic:pic xmlns:pic="http://schemas.openxmlformats.org/drawingml/2006/picture">
+                  <pic:nvPicPr>
+                    <pic:cNvPr id="21" name="Image 21"/>
+                    <pic:cNvPicPr/>
+                  </pic:nvPicPr>
+                  <pic:blipFill>
+                    <a:blip r:embed="rId13" cstate="print">
+                      <a:extLst>
+                        <a:ext uri="{28A0092B-C50C-407E-A947-70E740481C1C}">
+                          <a14:useLocalDpi xmlns:a14="http://schemas.microsoft.com/office/drawing/2010/main" val="0"/>
+                        </a:ext>
+                      </a:extLst>
+                    </a:blip>
+                    <a:stretch>
+                      <a:fillRect/>
+                    </a:stretch>
+                  </pic:blipFill>
+                  <pic:spPr>
+                    <a:xfrm>
+                      <a:off x="0" y="0"/>
+                      <a:ext cx="2124075" cy="1482853"/>
+                    </a:xfrm>
+                    <a:prstGeom prst="rect">
+                      <a:avLst/>
+                    </a:prstGeom>
+                  </pic:spPr>
+                </pic:pic>
+              </a:graphicData>
+            </a:graphic>
+          </wp:inline>
+        </w:drawing>
+      </w:r>
+    </w:p>
+    <w:p>
+      <w:pPr>
+        <w:pStyle w:val="Caption"/>
+        <w:keepNext/>
+        <w:numPr>
+          <w:ilvl w:val="0"/>
+          <w:numId w:val="7"/>
+        </w:numPr>
+        <w:jc w:val="center"/>
+        <w:rPr>
+          <w:rFonts w:ascii="Times New Roman" w:eastAsia="Times New Roman" w:hAnsi="Times New Roman" w:cs="Times New Roman"/>
+        </w:rPr>
+        <w:sectPr>
+          <w:type w:val="continuous"/>
+          <w:pgSz w:w="11906" w:h="16838"/>
+          <w:pgMar w:top="2948" w:right="2494" w:bottom="2948" w:left="2494" w:header="2381" w:footer="2324" w:gutter="0"/>
+          <w:cols w:num="2" w:space="227"/>
+          <w:titlePg/>
+          <w:docGrid w:linePitch="240"/>
+        </w:sectPr>
+      </w:pPr>
+      <w:r>
+        <w:rPr>
+          <w:rFonts w:ascii="Times New Roman" w:eastAsia="Times New Roman" w:hAnsi="Times New Roman" w:cs="Times New Roman"/>
+        </w:rPr>
+        <w:t xml:space="preserve"> DET/EER</w:t>
+      </w:r>
+    </w:p>
+    <w:p>
+      <w:pPr>
+        <w:pStyle w:val="Caption"/>
+        <w:spacing w:before="60"/>
+        <w:ind w:firstLine="0"/>
+        <w:jc w:val="center"/>
+        <w:rPr>
+          <w:rFonts w:ascii="Times New Roman" w:eastAsia="Times New Roman" w:hAnsi="Times New Roman" w:cs="Times New Roman"/>
+          <w:color w:val="000000"/>
+        </w:rPr>
+      </w:pPr>
+      <w:r>
+        <w:t>Fig. 4. Full-test ROC and DET comparisons for six detector artifacts.</w:t>
+      </w:r>
+    </w:p>
+    <w:p>
+      <w:pPr>
         <w:pStyle w:val="heading1"/>
         <w:spacing w:after="0" w:line="240" w:lineRule="atLeast"/>
       </w:pPr>
@@ -4957,7 +5321,7 @@
     <w:p>
       <w:pPr>
         <w:pStyle w:val="heading2"/>
-        <w:spacing w:before="240" w:after="0"/>
+        <w:spacing w:before="120" w:after="0"/>
       </w:pPr>
       <w:r>
         <w:rPr>
@@ -4969,26 +5333,32 @@
     <w:p>
       <w:pPr>
         <w:pStyle w:val="p1a"/>
-        <w:spacing w:before="240"/>
-      </w:pPr>
-      <w:r>
+        <w:spacing w:before="60"/>
+      </w:pPr>
+      <w:r>
+        <w:rPr>
+          <w:sz w:val="20"/>
+        </w:rPr>
         <w:t>All artifacts passed load, score, hash, and adapter checks. ShuffleNetV2 had the highest ROC-AUC (0.9929), PR-AUC (0.9898), specificity (0.9848), and lowest EER (0.0146), followed by MobileNetV3, MnasNet-A1, and the available EfficientNet-B0 warm-up checkpoint (Table 3). Table 3 reports the corresponding bootstrap intervals.</w:t>
       </w:r>
     </w:p>
     <w:p>
       <w:pPr>
         <w:pStyle w:val="p1a"/>
-        <w:spacing w:before="240"/>
+        <w:spacing w:before="60"/>
         <w:ind w:firstLine="220"/>
       </w:pPr>
       <w:r>
+        <w:rPr>
+          <w:sz w:val="20"/>
+        </w:rPr>
         <w:t>This is not a controlled architecture study. Training data, initialization, duration, representation, loaders, and calibration differ across artifacts; the results neither rank the RawNet2 or AASIST architectures nor estimate retrained performance. On fixed test predictions, ShuffleNetV2 differed from MobileNetV3 after Holm correction (adjusted p = 0.0096), and both differed strongly from the two external checkpoints; this is paired test-set evidence, not multi-seed training significance.</w:t>
       </w:r>
     </w:p>
     <w:p>
       <w:pPr>
         <w:pStyle w:val="heading2"/>
-        <w:spacing w:before="240" w:after="0"/>
+        <w:spacing w:before="120" w:after="0"/>
       </w:pPr>
       <w:r>
         <w:rPr>
@@ -5000,16 +5370,19 @@
     <w:p>
       <w:pPr>
         <w:pStyle w:val="p1a"/>
-        <w:spacing w:before="240"/>
-      </w:pPr>
-      <w:r>
-        <w:t>On the fixed 100-recording diagnostic subset, AWGN caused the largest observed losses for the four high-performing lightweight artifacts. Mean noise ΔF1 ranged from 0.3555 for ShuffleNetV2 to 0.8053 for the available EfficientNet-B0 warm-up checkpoint and rose sharply at 5 and 0 dB. Table 4 and Figure 2 report the condition-level patterns.</w:t>
+        <w:spacing w:before="60"/>
+      </w:pPr>
+      <w:r>
+        <w:rPr>
+          <w:sz w:val="20"/>
+        </w:rPr>
+        <w:t>On the fixed 100-recording diagnostic subset, AWGN caused the largest observed losses for the four high-performing lightweight artifacts. Mean noise ΔF1 ranged from 0.3555 for ShuffleNetV2 to 0.8053 for the available EfficientNet-B0 warm-up checkpoint and rose sharply at 5 and 0 dB. Table 4 and Figure 5 report the condition-level patterns.</w:t>
       </w:r>
     </w:p>
     <w:p>
       <w:pPr>
         <w:pStyle w:val="Caption"/>
-        <w:spacing w:before="240" w:after="120"/>
+        <w:spacing w:before="60" w:after="120"/>
         <w:jc w:val="center"/>
         <w:rPr>
           <w:rFonts w:ascii="Times New Roman" w:eastAsia="Times New Roman" w:hAnsi="Times New Roman" w:cs="Times New Roman"/>
@@ -6177,7 +6550,7 @@
     <w:p>
       <w:pPr>
         <w:pStyle w:val="Caption"/>
-        <w:spacing w:before="240"/>
+        <w:spacing w:before="60"/>
         <w:ind w:firstLine="0"/>
         <w:rPr>
           <w:rFonts w:ascii="Times New Roman" w:eastAsia="Times New Roman" w:hAnsi="Times New Roman" w:cs="Times New Roman"/>
@@ -6195,7 +6568,7 @@
     <w:p>
       <w:pPr>
         <w:pStyle w:val="Caption"/>
-        <w:spacing w:before="240"/>
+        <w:spacing w:before="60"/>
         <w:ind w:firstLine="0"/>
         <w:jc w:val="center"/>
         <w:rPr>
@@ -6259,7 +6632,78 @@
     <w:p>
       <w:pPr>
         <w:pStyle w:val="Caption"/>
-        <w:spacing w:before="240"/>
+        <w:spacing w:before="60"/>
+        <w:ind w:firstLine="0"/>
+        <w:jc w:val="center"/>
+        <w:rPr>
+          <w:rFonts w:ascii="Times New Roman" w:eastAsia="Times New Roman" w:hAnsi="Times New Roman" w:cs="Times New Roman"/>
+        </w:rPr>
+        <w:sectPr>
+          <w:type w:val="continuous"/>
+          <w:pgSz w:w="11906" w:h="16838"/>
+          <w:pgMar w:top="2948" w:right="2494" w:bottom="2948" w:left="2494" w:header="2381" w:footer="2324" w:gutter="0"/>
+          <w:cols w:num="2" w:space="227"/>
+          <w:titlePg/>
+          <w:docGrid w:linePitch="240"/>
+        </w:sectPr>
+      </w:pPr>
+      <w:r>
+        <w:rPr>
+          <w:noProof/>
+        </w:rPr>
+        <w:drawing>
+          <wp:inline distT="0" distB="0" distL="0" distR="0" wp14:anchorId="1A3D9CB0" wp14:editId="77B8E8D0">
+            <wp:extent cx="2075935" cy="1454150"/>
+            <wp:effectExtent l="0" t="0" r="635" b="0"/>
+            <wp:docPr id="22" name="Image 22"/>
+            <wp:cNvGraphicFramePr>
+              <a:graphicFrameLocks xmlns:a="http://schemas.openxmlformats.org/drawingml/2006/main"/>
+            </wp:cNvGraphicFramePr>
+            <a:graphic xmlns:a="http://schemas.openxmlformats.org/drawingml/2006/main">
+              <a:graphicData uri="http://schemas.openxmlformats.org/drawingml/2006/picture">
+                <pic:pic xmlns:pic="http://schemas.openxmlformats.org/drawingml/2006/picture">
+                  <pic:nvPicPr>
+                    <pic:cNvPr id="22" name="Image 22"/>
+                    <pic:cNvPicPr/>
+                  </pic:nvPicPr>
+                  <pic:blipFill>
+                    <a:blip r:embed="rId15" cstate="print">
+                      <a:extLst>
+                        <a:ext uri="{28A0092B-C50C-407E-A947-70E740481C1C}">
+                          <a14:useLocalDpi xmlns:a14="http://schemas.microsoft.com/office/drawing/2010/main" val="0"/>
+                        </a:ext>
+                      </a:extLst>
+                    </a:blip>
+                    <a:stretch>
+                      <a:fillRect/>
+                    </a:stretch>
+                  </pic:blipFill>
+                  <pic:spPr>
+                    <a:xfrm>
+                      <a:off x="0" y="0"/>
+                      <a:ext cx="2122667" cy="1486885"/>
+                    </a:xfrm>
+                    <a:prstGeom prst="rect">
+                      <a:avLst/>
+                    </a:prstGeom>
+                  </pic:spPr>
+                </pic:pic>
+              </a:graphicData>
+            </a:graphic>
+          </wp:inline>
+        </w:drawing>
+      </w:r>
+      <w:r>
+        <w:rPr>
+          <w:rFonts w:ascii="Times New Roman" w:eastAsia="Times New Roman" w:hAnsi="Times New Roman" w:cs="Times New Roman"/>
+        </w:rPr>
+        <w:t xml:space="preserve"> (b) AWGN F1 trajectory</w:t>
+      </w:r>
+    </w:p>
+    <w:p>
+      <w:pPr>
+        <w:pStyle w:val="Caption"/>
+        <w:spacing w:before="60"/>
         <w:ind w:firstLine="221"/>
         <w:jc w:val="center"/>
         <w:rPr>
@@ -6268,12 +6712,12 @@
         </w:rPr>
       </w:pPr>
       <w:r>
-        <w:t>Fig. 2. Fixed-subset degradation across the nine diagnostic conditions; replay is simulated.</w:t>
+        <w:t>Fig. 5. Fixed-subset degradation and AWGN F1; replay is simulated.</w:t>
       </w:r>
     </w:p>
     <w:p>
       <w:pPr>
-        <w:spacing w:before="240"/>
+        <w:spacing w:before="60"/>
         <w:ind w:firstLine="221"/>
         <w:rPr>
           <w:color w:val="000000"/>
@@ -6282,23 +6726,27 @@
       <w:r>
         <w:rPr>
           <w:color w:val="000000"/>
+          <w:sz w:val="20"/>
         </w:rPr>
         <w:t>On the fixed subset, codec effects were small for the lightweight artifacts (mean ΔF1: 0.0000-0.0233). Under simulated replay, ShuffleNetV2 retained F1 = 0.9500 (ΔF1 = 0.0256), versus ΔF1 values of 0.0620, 0.0641, and 0.1489 for MobileNetV3, the EfficientNet-B0 warm-up checkpoint, and MnasNet-A1. Negative external-artifact deltas reflect score redistribution around weak baselines, not general robustness.</w:t>
       </w:r>
     </w:p>
     <w:p>
       <w:pPr>
-        <w:spacing w:before="240"/>
+        <w:spacing w:before="60"/>
         <w:ind w:firstLine="221"/>
       </w:pPr>
       <w:r>
+        <w:rPr>
+          <w:sz w:val="20"/>
+        </w:rPr>
         <w:t>Because paired clean/stressed scores were not retained, prediction flips cannot be identified; the reported condition-level trends are aggregate failure patterns, not per-recording error analysis.</w:t>
       </w:r>
     </w:p>
     <w:p>
       <w:pPr>
         <w:pStyle w:val="heading2"/>
-        <w:spacing w:before="240" w:after="0"/>
+        <w:spacing w:before="120" w:after="0"/>
       </w:pPr>
       <w:r>
         <w:rPr>
@@ -6310,16 +6758,19 @@
     <w:p>
       <w:pPr>
         <w:pStyle w:val="p1a"/>
-        <w:spacing w:before="240"/>
-      </w:pPr>
-      <w:r>
+        <w:spacing w:before="60"/>
+      </w:pPr>
+      <w:r>
+        <w:rPr>
+          <w:sz w:val="20"/>
+        </w:rPr>
         <w:t>On the single-thread desktop CPU (Table 5), MobileNetV3 had the lowest end-to-end latency and RTF; ShuffleNetV2 ranked second among local artifacts. AASIST combined the smallest file with the largest latency, whereas RawNet2 combined the most parameters with moderate latency. Size and parameter count did not predict runtime; RSS is whole-process memory.</w:t>
       </w:r>
     </w:p>
     <w:p>
       <w:pPr>
         <w:pStyle w:val="Caption"/>
-        <w:spacing w:before="240" w:after="120"/>
+        <w:spacing w:before="60" w:after="120"/>
         <w:jc w:val="center"/>
         <w:rPr>
           <w:rFonts w:ascii="Times New Roman" w:eastAsia="Times New Roman" w:hAnsi="Times New Roman" w:cs="Times New Roman"/>
@@ -7798,7 +8249,7 @@
     <w:p>
       <w:pPr>
         <w:pStyle w:val="heading2"/>
-        <w:spacing w:before="240" w:after="0"/>
+        <w:spacing w:before="120" w:after="0"/>
       </w:pPr>
       <w:r>
         <w:rPr>
@@ -7810,10 +8261,14 @@
     <w:p>
       <w:pPr>
         <w:pStyle w:val="p1a"/>
-        <w:spacing w:before="240"/>
-      </w:pPr>
-      <w:r>
-        <w:t>Figure 3 identifies MobileNetV3 and ShuffleNetV2 as non-dominated under the evaluated objectives. MobileNetV3 has the lowest RTF (0.0146); ShuffleNetV2 has the highest mean stressed F1 (0.8133) at RTF 0.0208 and dominates the other four artifacts under these objectives. The frontier is exploratory, not a generally optimal ranking, because it uses 100 stress recordings and one desktop host.</w:t>
+        <w:spacing w:before="60"/>
+      </w:pPr>
+      <w:r>
+        <w:rPr>
+          <w:color w:val="000000"/>
+          <w:sz w:val="20"/>
+        </w:rPr>
+        <w:t>Figure 6 identifies MobileNetV3 and ShuffleNetV2 as non-dominated under the evaluated objectives. MobileNetV3 has the lowest RTF (0.0146); ShuffleNetV2 has the highest mean stressed F1 (0.8133) at RTF 0.0208 and dominates the other four artifacts under these objectives. The frontier is exploratory, not a generally optimal ranking, because it uses 100 stress recordings and one desktop host.</w:t>
       </w:r>
     </w:p>
     <w:p>
@@ -7876,7 +8331,7 @@
         </w:rPr>
       </w:pPr>
       <w:r>
-        <w:t>Fig. 3. Exploratory Pareto space under the evaluated objectives; stars mark non-dominated artifacts.</w:t>
+        <w:t>Fig. 6. Exploratory Pareto space under the evaluated objectives; stars mark non-dominated artifacts.</w:t>
       </w:r>
     </w:p>
     <w:p>
@@ -7892,6 +8347,9 @@
         <w:pStyle w:val="p1a"/>
       </w:pPr>
       <w:r>
+        <w:rPr>
+          <w:sz w:val="20"/>
+        </w:rPr>
         <w:t>LAVA can support transparent artifact selection for defensive voice-authentication and media-verification screening, while retaining human review for consequential decisions. Its offline diagnostic evidence is not a guarantee of field security, demographic fairness, or edge-device readiness.</w:t>
       </w:r>
     </w:p>
@@ -7914,6 +8372,7 @@
       <w:r>
         <w:rPr>
           <w:color w:val="000000"/>
+          <w:sz w:val="20"/>
         </w:rPr>
         <w:t>Evidence is limited by heterogeneous training and calibration, a fixed 100-recording diagnostic subset, simulated rather than physical replay, and one desktop CPU. The dataset cannot establish speaker, source, generator, parent-recording, or cross-dataset independence. No unseen-corpus, edge-device, streaming, or multi-seed evaluation was conducted; RSS is whole-process memory, EfficientNet-B0 is an available warm-up checkpoint, and paired scores for sample-level prediction-flip analysis are unavailable.</w:t>
       </w:r>
@@ -7941,6 +8400,7 @@
       <w:r>
         <w:rPr>
           <w:color w:val="000000"/>
+          <w:sz w:val="20"/>
         </w:rPr>
         <w:t>Recommendations remain artifact-, objective-, and platform-specific. Under the evaluated objectives, ShuffleNetV2 is the stronger predictive-performance candidate: it achieved the highest clean AUC, lowest clean EER, highest mean stressed F1, and remained non-dominated at RTF 0.0208. MobileNetV3 is the lower-latency candidate on the measured host. These findings do not identify a universally optimal model or rank architectures independently of their available artifacts.</w:t>
       </w:r>
@@ -7950,6 +8410,9 @@
         <w:spacing w:before="120"/>
       </w:pPr>
       <w:r>
+        <w:rPr>
+          <w:sz w:val="20"/>
+        </w:rPr>
         <w:t>LAVA compares six heterogeneous voice anti-spoofing artifacts under traceable contracts. MobileNetV3 and ShuffleNetV2 are non-dominated under the evaluated objectives, while low-SNR noise is the main weakness on the fixed diagnostic subset. Future work should add paired full-stress scores, multi-seed training, unseen corpora, physical replay, causal streaming, and representative edge hardware.</w:t>
       </w:r>
     </w:p>
@@ -7971,9 +8434,12 @@
     <w:p>
       <w:pPr>
         <w:pStyle w:val="p1a"/>
-        <w:spacing w:before="240"/>
-      </w:pPr>
-      <w:r>
+        <w:spacing w:before="60"/>
+      </w:pPr>
+      <w:r>
+        <w:rPr>
+          <w:sz w:val="20"/>
+        </w:rPr>
         <w:t xml:space="preserve">This research was supported by the University of Economics Ho Chi Minh City (UEH), Vietnam. </w:t>
       </w:r>
     </w:p>
@@ -7998,335 +8464,359 @@
         <w:t>References</w:t>
       </w:r>
     </w:p>
+    <w:tbl>
+      <w:tblPr>
+        <w:tblW w:type="auto" w:w="0"/>
+        <w:tblLayout w:type="fixed"/>
+        <w:tblLook w:firstColumn="1" w:firstRow="1" w:lastColumn="0" w:lastRow="0" w:noHBand="0" w:noVBand="1" w:val="04A0"/>
+        <w:tblBorders>
+          <w:top w:val="nil"/>
+          <w:left w:val="nil"/>
+          <w:bottom w:val="nil"/>
+          <w:right w:val="nil"/>
+          <w:insideH w:val="nil"/>
+          <w:insideV w:val="nil"/>
+        </w:tblBorders>
+      </w:tblPr>
+      <w:tblGrid>
+        <w:gridCol w:w="3459"/>
+        <w:gridCol w:w="3459"/>
+      </w:tblGrid>
+      <w:tr>
+        <w:tc>
+          <w:tcPr>
+            <w:tcW w:type="dxa" w:w="3427"/>
+            <w:vAlign w:val="top"/>
+          </w:tcPr>
+          <w:p>
+            <w:pPr>
+              <w:pStyle w:val="EndNoteBibliography"/>
+              <w:spacing w:before="0" w:after="0" w:line="128" w:lineRule="exact"/>
+            </w:pPr>
+            <w:r>
+              <w:rPr>
+                <w:rFonts w:ascii="Times New Roman" w:hAnsi="Times New Roman"/>
+                <w:sz w:val="12"/>
+              </w:rPr>
+              <w:t>[1] J. Yi et al., ‘Audio Deepfake Detection: A Survey,’ arXiv:2308.14970, 2023. doi:10.48550/arXiv.2308.14970.</w:t>
+            </w:r>
+          </w:p>
+          <w:p>
+            <w:pPr>
+              <w:pStyle w:val="EndNoteBibliography"/>
+              <w:spacing w:before="0" w:after="0" w:line="128" w:lineRule="exact"/>
+            </w:pPr>
+            <w:r>
+              <w:rPr>
+                <w:rFonts w:ascii="Times New Roman" w:hAnsi="Times New Roman"/>
+                <w:sz w:val="12"/>
+              </w:rPr>
+              <w:t>[2] M. Li, Y. Ahmadiadli, and X.-P. Zhang, ‘A Survey on Speech Deepfake Detection,’ ACM Computing Surveys, vol. 57, no. 7, pp. 1-38, 2025. doi:10.1145/3711898.</w:t>
+            </w:r>
+          </w:p>
+          <w:p>
+            <w:pPr>
+              <w:pStyle w:val="EndNoteBibliography"/>
+              <w:spacing w:before="0" w:after="0" w:line="128" w:lineRule="exact"/>
+            </w:pPr>
+            <w:r>
+              <w:rPr>
+                <w:rFonts w:ascii="Times New Roman" w:hAnsi="Times New Roman"/>
+                <w:sz w:val="12"/>
+              </w:rPr>
+              <w:t>[3] M. Todisco et al., ‘ASVspoof 2019: Future Horizons in Spoofed and Fake Audio Detection,’ Proc. Interspeech, pp. 1008-1012, 2019. doi:10.21437/Interspeech.2019-2249.</w:t>
+            </w:r>
+          </w:p>
+          <w:p>
+            <w:pPr>
+              <w:pStyle w:val="EndNoteBibliography"/>
+              <w:spacing w:before="0" w:after="0" w:line="128" w:lineRule="exact"/>
+            </w:pPr>
+            <w:r>
+              <w:rPr>
+                <w:rFonts w:ascii="Times New Roman" w:hAnsi="Times New Roman"/>
+                <w:sz w:val="12"/>
+              </w:rPr>
+              <w:t>[4] J. Frank and L. Schönherr, ‘WaveFake: A Data Set to Facilitate Audio Deepfake Detection,’ NeurIPS Datasets and Benchmarks, 2021, arXiv:2111.02813. doi:10.48550/arXiv.2111.02813.</w:t>
+            </w:r>
+          </w:p>
+          <w:p>
+            <w:pPr>
+              <w:pStyle w:val="EndNoteBibliography"/>
+              <w:spacing w:before="0" w:after="0" w:line="128" w:lineRule="exact"/>
+            </w:pPr>
+            <w:r>
+              <w:rPr>
+                <w:rFonts w:ascii="Times New Roman" w:hAnsi="Times New Roman"/>
+                <w:sz w:val="12"/>
+              </w:rPr>
+              <w:t>[5] J. Yamagishi et al., ‘ASVspoof 2021: Accelerating Progress in Spoofed and Deepfake Speech Detection,’ Proc. ASVspoof 2021 Workshop, pp. 47-54, 2021. doi:10.21437/ASVSPOOF.2021-8.</w:t>
+            </w:r>
+          </w:p>
+          <w:p>
+            <w:pPr>
+              <w:pStyle w:val="EndNoteBibliography"/>
+              <w:spacing w:before="0" w:after="0" w:line="128" w:lineRule="exact"/>
+            </w:pPr>
+            <w:r>
+              <w:rPr>
+                <w:rFonts w:ascii="Times New Roman" w:hAnsi="Times New Roman"/>
+                <w:sz w:val="12"/>
+              </w:rPr>
+              <w:t>[6] H. Tak et al., ‘End-to-End Anti-Spoofing with RawNet2,’ Proc. ICASSP, pp. 6369-6373, 2021. doi:10.1109/ICASSP39728.2021.9414234.</w:t>
+            </w:r>
+          </w:p>
+          <w:p>
+            <w:pPr>
+              <w:pStyle w:val="EndNoteBibliography"/>
+              <w:spacing w:before="0" w:after="0" w:line="128" w:lineRule="exact"/>
+            </w:pPr>
+            <w:r>
+              <w:rPr>
+                <w:rFonts w:ascii="Times New Roman" w:hAnsi="Times New Roman"/>
+                <w:sz w:val="12"/>
+              </w:rPr>
+              <w:t>[7] M. Ravanelli and Y. Bengio, ‘Speaker Recognition from Raw Waveform with SincNet,’ Proc. IEEE SLT Workshop, pp. 1021-1028, 2018. doi:10.1109/SLT.2018.8639585.</w:t>
+            </w:r>
+          </w:p>
+          <w:p>
+            <w:pPr>
+              <w:pStyle w:val="EndNoteBibliography"/>
+              <w:spacing w:before="0" w:after="0" w:line="128" w:lineRule="exact"/>
+            </w:pPr>
+            <w:r>
+              <w:rPr>
+                <w:rFonts w:ascii="Times New Roman" w:hAnsi="Times New Roman"/>
+                <w:sz w:val="12"/>
+              </w:rPr>
+              <w:t>[8] J.-w. Jung et al., ‘AASIST: Audio Anti-Spoofing Using Integrated Spectro-Temporal Graph Attention Networks,’ Proc. ICASSP, pp. 6367-6371, 2022. doi:10.1109/ICASSP43922.2022.9747766.</w:t>
+            </w:r>
+          </w:p>
+          <w:p>
+            <w:pPr>
+              <w:pStyle w:val="EndNoteBibliography"/>
+              <w:spacing w:before="0" w:after="0" w:line="128" w:lineRule="exact"/>
+            </w:pPr>
+            <w:r>
+              <w:rPr>
+                <w:rFonts w:ascii="Times New Roman" w:hAnsi="Times New Roman"/>
+                <w:sz w:val="12"/>
+              </w:rPr>
+              <w:t>[9] H. Tak et al., ‘Automatic Speaker Verification Spoofing and Deepfake Detection Using wav2vec 2.0 and Data Augmentation,’ Proc. Odyssey, pp. 112-119, 2022. doi:10.21437/Odyssey.2022-16.</w:t>
+            </w:r>
+          </w:p>
+          <w:p>
+            <w:pPr>
+              <w:pStyle w:val="EndNoteBibliography"/>
+              <w:spacing w:before="0" w:after="0" w:line="128" w:lineRule="exact"/>
+            </w:pPr>
+            <w:r>
+              <w:rPr>
+                <w:rFonts w:ascii="Times New Roman" w:hAnsi="Times New Roman"/>
+                <w:sz w:val="12"/>
+              </w:rPr>
+              <w:t>[10] O. Pascu et al., ‘Towards Generalisable and Calibrated Audio Deepfake Detection with Self-Supervised Representations,’ Proc. Interspeech, pp. 4828-4832, 2024. doi:10.21437/Interspeech.2024-1302.</w:t>
+            </w:r>
+          </w:p>
+          <w:p>
+            <w:pPr>
+              <w:pStyle w:val="EndNoteBibliography"/>
+              <w:spacing w:before="0" w:after="0" w:line="128" w:lineRule="exact"/>
+            </w:pPr>
+            <w:r>
+              <w:rPr>
+                <w:rFonts w:ascii="Times New Roman" w:hAnsi="Times New Roman"/>
+                <w:sz w:val="12"/>
+              </w:rPr>
+              <w:t>[11] N. M. Müller, P. Czempin, F. Dieckmann, A. Froghyar, and K. Böttinger, ‘Does Audio Deepfake Detection Generalize?’ Proc. Interspeech, pp. 2783-2787, 2022. doi:10.21437/Interspeech.2022-108.</w:t>
+            </w:r>
+          </w:p>
+          <w:p>
+            <w:pPr>
+              <w:pStyle w:val="EndNoteBibliography"/>
+              <w:spacing w:before="0" w:after="0" w:line="128" w:lineRule="exact"/>
+            </w:pPr>
+            <w:r>
+              <w:rPr>
+                <w:rFonts w:ascii="Times New Roman" w:hAnsi="Times New Roman"/>
+                <w:sz w:val="12"/>
+              </w:rPr>
+              <w:t>[12] P. Kawa, M. Plata, and P. Syga, ‘Attack Agnostic Dataset: Towards Generalization and Stabilization of Audio Deepfake Detection,’ Proc. Interspeech, pp. 4023-4027, 2022. doi:10.21437/Interspeech.2022-10078.</w:t>
+            </w:r>
+          </w:p>
+        </w:tc>
+        <w:tc>
+          <w:tcPr>
+            <w:tcW w:type="dxa" w:w="3427"/>
+            <w:vAlign w:val="top"/>
+          </w:tcPr>
+          <w:p>
+            <w:pPr>
+              <w:pStyle w:val="EndNoteBibliography"/>
+              <w:spacing w:before="0" w:after="0" w:line="128" w:lineRule="exact"/>
+            </w:pPr>
+            <w:r>
+              <w:rPr>
+                <w:rFonts w:ascii="Times New Roman" w:hAnsi="Times New Roman"/>
+                <w:sz w:val="12"/>
+              </w:rPr>
+              <w:t>[13] N. M. Müller et al., ‘Harder or Different? Understanding Generalization of Audio Deepfake Detection,’ Proc. Interspeech, pp. 2705-2709, 2024. doi:10.21437/Interspeech.2024-247.</w:t>
+            </w:r>
+          </w:p>
+          <w:p>
+            <w:pPr>
+              <w:pStyle w:val="EndNoteBibliography"/>
+              <w:spacing w:before="0" w:after="0" w:line="128" w:lineRule="exact"/>
+            </w:pPr>
+            <w:r>
+              <w:rPr>
+                <w:rFonts w:ascii="Times New Roman" w:hAnsi="Times New Roman"/>
+                <w:sz w:val="12"/>
+              </w:rPr>
+              <w:t>[14] Y. Li et al., ‘Cross-Domain Audio Deepfake Detection: Dataset and Analysis,’ Proc. EMNLP, pp. 4977-4983, 2024. doi:10.18653/v1/2024.emnlp-main.286.</w:t>
+            </w:r>
+          </w:p>
+          <w:p>
+            <w:pPr>
+              <w:pStyle w:val="EndNoteBibliography"/>
+              <w:spacing w:before="0" w:after="0" w:line="128" w:lineRule="exact"/>
+            </w:pPr>
+            <w:r>
+              <w:rPr>
+                <w:rFonts w:ascii="Times New Roman" w:hAnsi="Times New Roman"/>
+                <w:sz w:val="12"/>
+              </w:rPr>
+              <w:t>[15] A. Howard et al., ‘Searching for MobileNetV3,’ Proc. ICCV, pp. 1314-1324, 2019. doi:10.1109/ICCV.2019.00140.</w:t>
+            </w:r>
+          </w:p>
+          <w:p>
+            <w:pPr>
+              <w:pStyle w:val="EndNoteBibliography"/>
+              <w:spacing w:before="0" w:after="0" w:line="128" w:lineRule="exact"/>
+            </w:pPr>
+            <w:r>
+              <w:rPr>
+                <w:rFonts w:ascii="Times New Roman" w:hAnsi="Times New Roman"/>
+                <w:sz w:val="12"/>
+              </w:rPr>
+              <w:t>[16] N. Ma et al., ‘ShuffleNet V2: Practical Guidelines for Efficient CNN Architecture Design,’ Proc. ECCV, pp. 116-131, 2018. doi:10.1007/978-3-030-01264-9_8.</w:t>
+            </w:r>
+          </w:p>
+          <w:p>
+            <w:pPr>
+              <w:pStyle w:val="EndNoteBibliography"/>
+              <w:spacing w:before="0" w:after="0" w:line="128" w:lineRule="exact"/>
+            </w:pPr>
+            <w:r>
+              <w:rPr>
+                <w:rFonts w:ascii="Times New Roman" w:hAnsi="Times New Roman"/>
+                <w:sz w:val="12"/>
+              </w:rPr>
+              <w:t>[17] M. Sandler et al., ‘MobileNetV2: Inverted Residuals and Linear Bottlenecks,’ Proc. CVPR, pp. 4510-4520, 2018. doi:10.1109/CVPR.2018.00474.</w:t>
+            </w:r>
+          </w:p>
+          <w:p>
+            <w:pPr>
+              <w:pStyle w:val="EndNoteBibliography"/>
+              <w:spacing w:before="0" w:after="0" w:line="128" w:lineRule="exact"/>
+            </w:pPr>
+            <w:r>
+              <w:rPr>
+                <w:rFonts w:ascii="Times New Roman" w:hAnsi="Times New Roman"/>
+                <w:sz w:val="12"/>
+              </w:rPr>
+              <w:t>[18] X. Zhang et al., ‘ShuffleNet: An Extremely Efficient Convolutional Neural Network for Mobile Devices,’ Proc. CVPR, pp. 6848-6856, 2018. doi:10.1109/CVPR.2018.00716.</w:t>
+            </w:r>
+          </w:p>
+          <w:p>
+            <w:pPr>
+              <w:pStyle w:val="EndNoteBibliography"/>
+              <w:spacing w:before="0" w:after="0" w:line="128" w:lineRule="exact"/>
+            </w:pPr>
+            <w:r>
+              <w:rPr>
+                <w:rFonts w:ascii="Times New Roman" w:hAnsi="Times New Roman"/>
+                <w:sz w:val="12"/>
+              </w:rPr>
+              <w:t>[19] M. Tan et al., ‘MnasNet: Platform-Aware Neural Architecture Search for Mobile,’ Proc. CVPR, pp. 2820-2828, 2019. doi:10.1109/CVPR.2019.00293.</w:t>
+            </w:r>
+          </w:p>
+          <w:p>
+            <w:pPr>
+              <w:pStyle w:val="EndNoteBibliography"/>
+              <w:spacing w:before="0" w:after="0" w:line="128" w:lineRule="exact"/>
+            </w:pPr>
+            <w:r>
+              <w:rPr>
+                <w:rFonts w:ascii="Times New Roman" w:hAnsi="Times New Roman"/>
+                <w:sz w:val="12"/>
+              </w:rPr>
+              <w:t>[20] M. Tan and Q. V. Le, ‘EfficientNet: Rethinking Model Scaling for Convolutional Neural Networks,’ Proc. ICML, PMLR, vol. 97, pp. 6105-6114, 2019. https://proceedings.mlr.press/v97/tan19a.html.</w:t>
+            </w:r>
+          </w:p>
+          <w:p>
+            <w:pPr>
+              <w:pStyle w:val="EndNoteBibliography"/>
+              <w:spacing w:before="0" w:after="0" w:line="128" w:lineRule="exact"/>
+            </w:pPr>
+            <w:r>
+              <w:rPr>
+                <w:rFonts w:ascii="Times New Roman" w:hAnsi="Times New Roman"/>
+                <w:sz w:val="12"/>
+              </w:rPr>
+              <w:t>[21] B. McFee et al., ‘librosa: Audio and Music Signal Analysis in Python,’ Proc. 14th Python in Science Conference, pp. 18-25, 2015. doi:10.25080/Majora-7b98e3ed-003.</w:t>
+            </w:r>
+          </w:p>
+          <w:p>
+            <w:pPr>
+              <w:pStyle w:val="EndNoteBibliography"/>
+              <w:spacing w:before="0" w:after="0" w:line="128" w:lineRule="exact"/>
+            </w:pPr>
+            <w:r>
+              <w:rPr>
+                <w:rFonts w:ascii="Times New Roman" w:hAnsi="Times New Roman"/>
+                <w:sz w:val="12"/>
+              </w:rPr>
+              <w:t>[22] A. Das et al., ‘Generalizable Audio Spoofing Detection Using Non-Semantic Representations,’ Proc. Interspeech, pp. 4553-4557, 2025. doi:10.21437/Interspeech.2025-1555.</w:t>
+            </w:r>
+          </w:p>
+          <w:p>
+            <w:pPr>
+              <w:pStyle w:val="EndNoteBibliography"/>
+              <w:spacing w:before="0" w:after="0" w:line="128" w:lineRule="exact"/>
+            </w:pPr>
+            <w:r>
+              <w:rPr>
+                <w:rFonts w:ascii="Times New Roman" w:hAnsi="Times New Roman"/>
+                <w:sz w:val="12"/>
+              </w:rPr>
+              <w:t>[23] N. Müller et al., ‘Replay Attacks Against Audio Deepfake Detection,’ Proc. Interspeech, pp. 2245-2249, 2025. doi:10.21437/Interspeech.2025-20.</w:t>
+            </w:r>
+          </w:p>
+          <w:p>
+            <w:pPr>
+              <w:pStyle w:val="EndNoteBibliography"/>
+              <w:spacing w:before="0" w:after="0" w:line="128" w:lineRule="exact"/>
+            </w:pPr>
+            <w:r>
+              <w:rPr>
+                <w:rFonts w:ascii="Times New Roman" w:hAnsi="Times New Roman"/>
+                <w:sz w:val="12"/>
+              </w:rPr>
+              <w:t>[24] I.-P. Ciobanu et al., ‘XMAD-Bench: Cross-Domain Multilingual Audio Deepfake Benchmark,’ Findings of EACL, pp. 3109-3120, 2026. doi:10.18653/v1/2026.findings-eacl.162.</w:t>
+            </w:r>
+          </w:p>
+        </w:tc>
+      </w:tr>
+    </w:tbl>
     <w:p>
       <w:pPr>
-        <w:pStyle w:val="EndNoteBibliography"/>
-        <w:spacing w:before="0" w:after="0" w:line="150" w:lineRule="exact"/>
+        <w:pStyle w:val="p1a"/>
       </w:pPr>
       <w:r>
         <w:rPr>
-          <w:sz w:val="14"/>
+          <w:sz w:val="20"/>
         </w:rPr>
-        <w:t>[1] J. Yi et al., ‘Audio Deepfake Detection: A Survey,’ arXiv:2308.14970, 2023. https://doi.org/10.48550/arXiv.2308.14970.</w:t>
-      </w:r>
-    </w:p>
-    <w:p>
-      <w:pPr>
-        <w:pStyle w:val="EndNoteBibliography"/>
-        <w:spacing w:before="0" w:after="0" w:line="150" w:lineRule="exact"/>
-      </w:pPr>
-      <w:r>
-        <w:rPr>
-          <w:sz w:val="14"/>
-        </w:rPr>
-        <w:t>[2] M. Li, Y. Ahmadiadli, and X.-P. Zhang, ‘A Survey on Speech Deepfake Detection,’ ACM Computing Surveys, vol. 57, no. 7, pp. 1-38, 2025. https://doi.org/10.1145/3711898.</w:t>
-      </w:r>
-    </w:p>
-    <w:p>
-      <w:pPr>
-        <w:pStyle w:val="EndNoteBibliography"/>
-        <w:spacing w:before="0" w:after="0" w:line="150" w:lineRule="exact"/>
-      </w:pPr>
-      <w:r>
-        <w:rPr>
-          <w:sz w:val="14"/>
-        </w:rPr>
-        <w:t>[3] M. Todisco et al., ‘ASVspoof 2019: Future Horizons in Spoofed and Fake Audio Detection,’ Proc. Interspeech, pp. 1008-1012, 2019. https://doi.org/10.21437/Interspeech.2019-2249.</w:t>
-      </w:r>
-    </w:p>
-    <w:p>
-      <w:pPr>
-        <w:pStyle w:val="EndNoteBibliography"/>
-        <w:spacing w:before="0" w:after="0" w:line="150" w:lineRule="exact"/>
-      </w:pPr>
-      <w:r>
-        <w:rPr>
-          <w:sz w:val="14"/>
-        </w:rPr>
-        <w:t>[4] J. Frank and L. Schönherr, ‘WaveFake: A Data Set to Facilitate Audio Deepfake Detection,’ NeurIPS Datasets and Benchmarks, 2021, arXiv:2111.02813. https://doi.org/10.48550/arXiv.2111.02813.</w:t>
-      </w:r>
-    </w:p>
-    <w:p>
-      <w:pPr>
-        <w:pStyle w:val="EndNoteBibliography"/>
-        <w:spacing w:before="0" w:after="0" w:line="150" w:lineRule="exact"/>
-      </w:pPr>
-      <w:r>
-        <w:rPr>
-          <w:sz w:val="14"/>
-        </w:rPr>
-        <w:t>[5] T. Kinnunen et al., ‘t-DCF: A Detection Cost Function for the Tandem Assessment of Spoofing Countermeasures and Automatic Speaker Verification,’ Proc. Odyssey, pp. 312-319, 2018. https://doi.org/10.21437/Odyssey.2018-44.</w:t>
-      </w:r>
-    </w:p>
-    <w:p>
-      <w:pPr>
-        <w:pStyle w:val="EndNoteBibliography"/>
-        <w:spacing w:before="0" w:after="0" w:line="150" w:lineRule="exact"/>
-      </w:pPr>
-      <w:r>
-        <w:rPr>
-          <w:sz w:val="14"/>
-        </w:rPr>
-        <w:t>[6] J. Yamagishi et al., ‘ASVspoof 2021: Accelerating Progress in Spoofed and Deepfake Speech Detection,’ Proc. ASVspoof 2021 Workshop, pp. 47-54, 2021. https://doi.org/10.21437/ASVSPOOF.2021-8.</w:t>
-      </w:r>
-    </w:p>
-    <w:p>
-      <w:pPr>
-        <w:pStyle w:val="EndNoteBibliography"/>
-        <w:spacing w:before="0" w:after="0" w:line="150" w:lineRule="exact"/>
-      </w:pPr>
-      <w:r>
-        <w:rPr>
-          <w:sz w:val="14"/>
-        </w:rPr>
-        <w:t>[7] P. Veličković et al., ‘Graph Attention Networks,’ Proc. ICLR, 2018. https://openreview.net/forum?id=rJXMpikCZ.</w:t>
-      </w:r>
-    </w:p>
-    <w:p>
-      <w:pPr>
-        <w:pStyle w:val="EndNoteBibliography"/>
-        <w:spacing w:before="0" w:after="0" w:line="150" w:lineRule="exact"/>
-      </w:pPr>
-      <w:r>
-        <w:rPr>
-          <w:sz w:val="14"/>
-        </w:rPr>
-        <w:t>[8] H. Tak et al., ‘End-to-End Anti-Spoofing with RawNet2,’ Proc. ICASSP, pp. 6369-6373, 2021. https://doi.org/10.1109/ICASSP39728.2021.9414234.</w:t>
-      </w:r>
-    </w:p>
-    <w:p>
-      <w:pPr>
-        <w:pStyle w:val="EndNoteBibliography"/>
-        <w:spacing w:before="0" w:after="0" w:line="150" w:lineRule="exact"/>
-      </w:pPr>
-      <w:r>
-        <w:rPr>
-          <w:sz w:val="14"/>
-        </w:rPr>
-        <w:t>[9] M. Ravanelli and Y. Bengio, ‘Speaker Recognition from Raw Waveform with SincNet,’ Proc. IEEE SLT Workshop, pp. 1021-1028, 2018. https://doi.org/10.1109/SLT.2018.8639585.</w:t>
-      </w:r>
-    </w:p>
-    <w:p>
-      <w:pPr>
-        <w:pStyle w:val="EndNoteBibliography"/>
-        <w:spacing w:before="0" w:after="0" w:line="150" w:lineRule="exact"/>
-      </w:pPr>
-      <w:r>
-        <w:rPr>
-          <w:sz w:val="14"/>
-        </w:rPr>
-        <w:t>[10] J.-w. Jung et al., ‘AASIST: Audio Anti-Spoofing Using Integrated Spectro-Temporal Graph Attention Networks,’ Proc. ICASSP, pp. 6367-6371, 2022. https://doi.org/10.1109/ICASSP43922.2022.9747766.</w:t>
-      </w:r>
-    </w:p>
-    <w:p>
-      <w:pPr>
-        <w:pStyle w:val="EndNoteBibliography"/>
-        <w:spacing w:before="0" w:after="0" w:line="150" w:lineRule="exact"/>
-      </w:pPr>
-      <w:r>
-        <w:rPr>
-          <w:sz w:val="14"/>
-        </w:rPr>
-        <w:t>[11] H. Tak et al., ‘Automatic Speaker Verification Spoofing and Deepfake Detection Using wav2vec 2.0 and Data Augmentation,’ Proc. Odyssey, pp. 112-119, 2022. https://doi.org/10.21437/Odyssey.2022-16.</w:t>
-      </w:r>
-    </w:p>
-    <w:p>
-      <w:pPr>
-        <w:pStyle w:val="EndNoteBibliography"/>
-        <w:spacing w:before="0" w:after="0" w:line="150" w:lineRule="exact"/>
-      </w:pPr>
-      <w:r>
-        <w:rPr>
-          <w:sz w:val="14"/>
-        </w:rPr>
-        <w:t>[12] Z. Wu et al., ‘Light Convolutional Neural Network with Feature Genuinization for Detection of Synthetic Speech Attacks,’ Proc. Interspeech, pp. 1101-1105, 2020. https://doi.org/10.21437/Interspeech.2020-1810.</w:t>
-      </w:r>
-    </w:p>
-    <w:p>
-      <w:pPr>
-        <w:pStyle w:val="EndNoteBibliography"/>
-        <w:spacing w:before="0" w:after="0" w:line="150" w:lineRule="exact"/>
-      </w:pPr>
-      <w:r>
-        <w:rPr>
-          <w:sz w:val="14"/>
-        </w:rPr>
-        <w:t>[13] O. Pascu et al., ‘Towards Generalisable and Calibrated Audio Deepfake Detection with Self-Supervised Representations,’ Proc. Interspeech, pp. 4828-4832, 2024. https://doi.org/10.21437/Interspeech.2024-1302.</w:t>
-      </w:r>
-    </w:p>
-    <w:p>
-      <w:pPr>
-        <w:pStyle w:val="EndNoteBibliography"/>
-        <w:spacing w:before="0" w:after="0" w:line="150" w:lineRule="exact"/>
-      </w:pPr>
-      <w:r>
-        <w:rPr>
-          <w:sz w:val="14"/>
-        </w:rPr>
-        <w:t>[14] N. M. Müller, P. Czempin, F. Dieckmann, A. Froghyar, and K. Böttinger, ‘Does Audio Deepfake Detection Generalize?’ Proc. Interspeech, pp. 2783-2787, 2022. https://doi.org/10.21437/Interspeech.2022-108.</w:t>
-      </w:r>
-    </w:p>
-    <w:p>
-      <w:pPr>
-        <w:pStyle w:val="EndNoteBibliography"/>
-        <w:spacing w:before="0" w:after="0" w:line="150" w:lineRule="exact"/>
-      </w:pPr>
-      <w:r>
-        <w:rPr>
-          <w:sz w:val="14"/>
-        </w:rPr>
-        <w:t>[15] P. Kawa, M. Plata, and P. Syga, ‘Attack Agnostic Dataset: Towards Generalization and Stabilization of Audio Deepfake Detection,’ Proc. Interspeech, pp. 4023-4027, 2022. https://doi.org/10.21437/Interspeech.2022-10078.</w:t>
-      </w:r>
-    </w:p>
-    <w:p>
-      <w:pPr>
-        <w:pStyle w:val="EndNoteBibliography"/>
-        <w:spacing w:before="0" w:after="0" w:line="150" w:lineRule="exact"/>
-      </w:pPr>
-      <w:r>
-        <w:rPr>
-          <w:sz w:val="14"/>
-        </w:rPr>
-        <w:t>[16] N. M. Müller et al., ‘Harder or Different? Understanding Generalization of Audio Deepfake Detection,’ Proc. Interspeech, pp. 2705-2709, 2024. https://doi.org/10.21437/Interspeech.2024-247.</w:t>
-      </w:r>
-    </w:p>
-    <w:p>
-      <w:pPr>
-        <w:pStyle w:val="EndNoteBibliography"/>
-        <w:spacing w:before="0" w:after="0" w:line="150" w:lineRule="exact"/>
-      </w:pPr>
-      <w:r>
-        <w:rPr>
-          <w:sz w:val="14"/>
-        </w:rPr>
-        <w:t>[17] Y. Li et al., ‘Cross-Domain Audio Deepfake Detection: Dataset and Analysis,’ Proc. EMNLP, pp. 4977-4983, 2024. https://doi.org/10.18653/v1/2024.emnlp-main.286.</w:t>
-      </w:r>
-    </w:p>
-    <w:p>
-      <w:pPr>
-        <w:pStyle w:val="EndNoteBibliography"/>
-        <w:spacing w:before="0" w:after="0" w:line="150" w:lineRule="exact"/>
-      </w:pPr>
-      <w:r>
-        <w:rPr>
-          <w:sz w:val="14"/>
-        </w:rPr>
-        <w:t>[18] A. Howard et al., ‘Searching for MobileNetV3,’ Proc. ICCV, pp. 1314-1324, 2019. https://doi.org/10.1109/ICCV.2019.00140.</w:t>
-      </w:r>
-    </w:p>
-    <w:p>
-      <w:pPr>
-        <w:pStyle w:val="EndNoteBibliography"/>
-        <w:spacing w:before="0" w:after="0" w:line="150" w:lineRule="exact"/>
-      </w:pPr>
-      <w:r>
-        <w:rPr>
-          <w:sz w:val="14"/>
-        </w:rPr>
-        <w:t>[19] N. Ma et al., ‘ShuffleNet V2: Practical Guidelines for Efficient CNN Architecture Design,’ Proc. ECCV, pp. 116-131, 2018. https://doi.org/10.1007/978-3-030-01264-9_8.</w:t>
-      </w:r>
-    </w:p>
-    <w:p>
-      <w:pPr>
-        <w:pStyle w:val="EndNoteBibliography"/>
-        <w:spacing w:before="0" w:after="0" w:line="150" w:lineRule="exact"/>
-      </w:pPr>
-      <w:r>
-        <w:rPr>
-          <w:sz w:val="14"/>
-        </w:rPr>
-        <w:t>[20] M. Sandler et al., ‘MobileNetV2: Inverted Residuals and Linear Bottlenecks,’ Proc. CVPR, pp. 4510-4520, 2018. https://doi.org/10.1109/CVPR.2018.00474.</w:t>
-      </w:r>
-    </w:p>
-    <w:p>
-      <w:pPr>
-        <w:pStyle w:val="EndNoteBibliography"/>
-        <w:spacing w:before="0" w:after="0" w:line="150" w:lineRule="exact"/>
-      </w:pPr>
-      <w:r>
-        <w:rPr>
-          <w:sz w:val="14"/>
-        </w:rPr>
-        <w:t>[21] X. Zhang et al., ‘ShuffleNet: An Extremely Efficient Convolutional Neural Network for Mobile Devices,’ Proc. CVPR, pp. 6848-6856, 2018. https://doi.org/10.1109/CVPR.2018.00716.</w:t>
-      </w:r>
-    </w:p>
-    <w:p>
-      <w:pPr>
-        <w:pStyle w:val="EndNoteBibliography"/>
-        <w:spacing w:before="0" w:after="0" w:line="150" w:lineRule="exact"/>
-      </w:pPr>
-      <w:r>
-        <w:rPr>
-          <w:sz w:val="14"/>
-        </w:rPr>
-        <w:t>[22] M. Tan et al., ‘MnasNet: Platform-Aware Neural Architecture Search for Mobile,’ Proc. CVPR, pp. 2820-2828, 2019. https://doi.org/10.1109/CVPR.2019.00293.</w:t>
-      </w:r>
-    </w:p>
-    <w:p>
-      <w:pPr>
-        <w:pStyle w:val="EndNoteBibliography"/>
-        <w:spacing w:before="0" w:after="0" w:line="150" w:lineRule="exact"/>
-      </w:pPr>
-      <w:r>
-        <w:rPr>
-          <w:sz w:val="14"/>
-        </w:rPr>
-        <w:t>[23] M. Tan and Q. V. Le, ‘EfficientNet: Rethinking Model Scaling for Convolutional Neural Networks,’ Proc. ICML, PMLR, vol. 97, pp. 6105-6114, 2019. https://proceedings.mlr.press/v97/tan19a.html.</w:t>
-      </w:r>
-    </w:p>
-    <w:p>
-      <w:pPr>
-        <w:pStyle w:val="EndNoteBibliography"/>
-        <w:spacing w:before="0" w:after="0" w:line="150" w:lineRule="exact"/>
-      </w:pPr>
-      <w:r>
-        <w:rPr>
-          <w:sz w:val="14"/>
-        </w:rPr>
-        <w:t>[24] B. McFee et al., ‘librosa: Audio and Music Signal Analysis in Python,’ Proc. 14th Python in Science Conference, pp. 18-25, 2015. https://doi.org/10.25080/Majora-7b98e3ed-003.</w:t>
-      </w:r>
-    </w:p>
-    <w:p>
-      <w:pPr>
-        <w:pStyle w:val="EndNoteBibliography"/>
-        <w:spacing w:before="0" w:after="0" w:line="150" w:lineRule="exact"/>
-      </w:pPr>
-      <w:r>
-        <w:rPr>
-          <w:sz w:val="14"/>
-        </w:rPr>
-        <w:t>[25] A. Das et al., ‘Generalizable Audio Spoofing Detection Using Non-Semantic Representations,’ Proc. Interspeech, pp. 4553-4557, 2025. https://doi.org/10.21437/Interspeech.2025-1555.</w:t>
-      </w:r>
-    </w:p>
-    <w:p>
-      <w:pPr>
-        <w:pStyle w:val="EndNoteBibliography"/>
-        <w:spacing w:before="0" w:after="0" w:line="150" w:lineRule="exact"/>
-      </w:pPr>
-      <w:r>
-        <w:rPr>
-          <w:sz w:val="14"/>
-        </w:rPr>
-        <w:t>[26] N. Müller et al., ‘Replay Attacks Against Audio Deepfake Detection,’ Proc. Interspeech, pp. 2245-2249, 2025. https://doi.org/10.21437/Interspeech.2025-20.</w:t>
-      </w:r>
-    </w:p>
-    <w:p>
-      <w:pPr>
-        <w:pStyle w:val="EndNoteBibliography"/>
-        <w:spacing w:before="0" w:after="0" w:line="150" w:lineRule="exact"/>
-      </w:pPr>
-      <w:r>
-        <w:rPr>
-          <w:sz w:val="14"/>
-        </w:rPr>
-        <w:t>[27] I.-P. Ciobanu et al., ‘XMAD-Bench: Cross-Domain Multilingual Audio Deepfake Benchmark,’ Findings of EACL, pp. 3109-3120, 2026. https://doi.org/10.18653/v1/2026.findings-eacl.162.</w:t>
-      </w:r>
-    </w:p>
-    <w:p>
-      <w:pPr>
-        <w:pStyle w:val="p1a"/>
-      </w:pPr>
-      <w:r>
         <w:fldChar w:fldCharType="end"/>
       </w:r>
     </w:p>
@@ -9773,6 +10263,7 @@
     </w:pPr>
     <w:rPr>
       <w:rFonts w:eastAsia="Times New Roman"/>
+      <w:sz w:val="20"/>
     </w:rPr>
   </w:style>
   <w:style w:type="paragraph" w:styleId="Heading10">
@@ -9871,6 +10362,9 @@
     <w:pPr>
       <w:ind w:firstLine="0"/>
     </w:pPr>
+    <w:rPr>
+      <w:sz w:val="20"/>
+    </w:rPr>
   </w:style>
   <w:style w:type="paragraph" w:styleId="BodyText">
     <w:name w:val="Body Text"/>
@@ -9931,7 +10425,7 @@
       <w:spacing w:beforeAutospacing="1" w:after="0" w:afterAutospacing="1"/>
     </w:pPr>
     <w:rPr>
-      <w:sz w:val="24"/>
+      <w:sz w:val="20"/>
       <w:szCs w:val="24"/>
       <w:lang w:eastAsia="zh-CN"/>
     </w:rPr>
@@ -10154,6 +10648,9 @@
       <w:contextualSpacing w:val="0"/>
       <w:jc w:val="left"/>
     </w:pPr>
+    <w:rPr>
+      <w:sz w:val="18"/>
+    </w:rPr>
   </w:style>
   <w:style w:type="paragraph" w:customStyle="1" w:styleId="numitem">
     <w:name w:val="numitem"/>
@@ -10268,7 +10765,7 @@
     </w:pPr>
     <w:rPr>
       <w:b/>
-      <w:sz w:val="28"/>
+      <w:sz w:val="24"/>
     </w:rPr>
   </w:style>
   <w:style w:type="paragraph" w:customStyle="1" w:styleId="papersubtitle">

</xml_diff>

<commit_message>
feat: paper sau review (cũng tạm ổn)
</commit_message>
<xml_diff>
--- a/papers/PaperID 804 final.docx
+++ b/papers/PaperID 804 final.docx
@@ -539,6 +539,9 @@
         </w:rPr>
       </w:pPr>
       <w:r>
+        <w:rPr>
+          <w:sz w:val="18"/>
+        </w:rPr>
         <w:t>Fig. 1. Six detectors under the unified LAVA evaluation contract.</w:t>
       </w:r>
     </w:p>
@@ -604,6 +607,9 @@
         </w:rPr>
       </w:pPr>
       <w:r>
+        <w:rPr>
+          <w:sz w:val="18"/>
+        </w:rPr>
         <w:t>Fig. 2. SHA-256 conflict quarantine, canonicalization, and checksum-group-disjoint splitting.</w:t>
       </w:r>
     </w:p>
@@ -1001,6 +1007,9 @@
         </w:rPr>
       </w:pPr>
       <w:r>
+        <w:rPr>
+          <w:sz w:val="18"/>
+        </w:rPr>
         <w:t>Table 1. Canonical manifest and split inventory</w:t>
       </w:r>
     </w:p>
@@ -1047,6 +1056,7 @@
               <w:rPr>
                 <w:b/>
                 <w:bCs/>
+                <w:sz w:val="18"/>
               </w:rPr>
               <w:t>Inventory</w:t>
             </w:r>
@@ -1074,6 +1084,7 @@
               <w:rPr>
                 <w:b/>
                 <w:bCs/>
+                <w:sz w:val="18"/>
               </w:rPr>
               <w:t>Count</w:t>
             </w:r>
@@ -1101,6 +1112,7 @@
               <w:rPr>
                 <w:b/>
                 <w:bCs/>
+                <w:sz w:val="18"/>
               </w:rPr>
               <w:t>Split</w:t>
             </w:r>
@@ -1128,6 +1140,7 @@
               <w:rPr>
                 <w:b/>
                 <w:bCs/>
+                <w:sz w:val="18"/>
               </w:rPr>
               <w:t>Count</w:t>
             </w:r>
@@ -1152,6 +1165,9 @@
               </w:rPr>
             </w:pPr>
             <w:r>
+              <w:rPr>
+                <w:sz w:val="18"/>
+              </w:rPr>
               <w:t>Scanned / retained</w:t>
             </w:r>
           </w:p>
@@ -1169,6 +1185,9 @@
               </w:rPr>
             </w:pPr>
             <w:r>
+              <w:rPr>
+                <w:sz w:val="18"/>
+              </w:rPr>
               <w:t>18,722 / 18,232</w:t>
             </w:r>
           </w:p>
@@ -1186,6 +1205,9 @@
               </w:rPr>
             </w:pPr>
             <w:r>
+              <w:rPr>
+                <w:sz w:val="18"/>
+              </w:rPr>
               <w:t>Train</w:t>
             </w:r>
           </w:p>
@@ -1203,6 +1225,9 @@
               </w:rPr>
             </w:pPr>
             <w:r>
+              <w:rPr>
+                <w:sz w:val="18"/>
+              </w:rPr>
               <w:t>12,762</w:t>
             </w:r>
           </w:p>
@@ -1226,6 +1251,9 @@
               </w:rPr>
             </w:pPr>
             <w:r>
+              <w:rPr>
+                <w:sz w:val="18"/>
+              </w:rPr>
               <w:t>Retained REAL / FAKE</w:t>
             </w:r>
           </w:p>
@@ -1243,6 +1271,9 @@
               </w:rPr>
             </w:pPr>
             <w:r>
+              <w:rPr>
+                <w:sz w:val="18"/>
+              </w:rPr>
               <w:t>10,493 / 7,739</w:t>
             </w:r>
           </w:p>
@@ -1260,6 +1291,9 @@
               </w:rPr>
             </w:pPr>
             <w:r>
+              <w:rPr>
+                <w:sz w:val="18"/>
+              </w:rPr>
               <w:t>Validation</w:t>
             </w:r>
           </w:p>
@@ -1277,6 +1311,9 @@
               </w:rPr>
             </w:pPr>
             <w:r>
+              <w:rPr>
+                <w:sz w:val="18"/>
+              </w:rPr>
               <w:t>2,733</w:t>
             </w:r>
           </w:p>
@@ -1303,6 +1340,9 @@
               </w:rPr>
             </w:pPr>
             <w:r>
+              <w:rPr>
+                <w:sz w:val="18"/>
+              </w:rPr>
               <w:t>Duplicate groups / redundant</w:t>
             </w:r>
           </w:p>
@@ -1323,6 +1363,9 @@
               </w:rPr>
             </w:pPr>
             <w:r>
+              <w:rPr>
+                <w:sz w:val="18"/>
+              </w:rPr>
               <w:t>435 / 476</w:t>
             </w:r>
           </w:p>
@@ -1343,6 +1386,9 @@
               </w:rPr>
             </w:pPr>
             <w:r>
+              <w:rPr>
+                <w:sz w:val="18"/>
+              </w:rPr>
               <w:t>Test</w:t>
             </w:r>
           </w:p>
@@ -1363,6 +1409,9 @@
               </w:rPr>
             </w:pPr>
             <w:r>
+              <w:rPr>
+                <w:sz w:val="18"/>
+              </w:rPr>
               <w:t>2,737</w:t>
             </w:r>
           </w:p>
@@ -1392,6 +1441,9 @@
               </w:rPr>
             </w:pPr>
             <w:r>
+              <w:rPr>
+                <w:sz w:val="18"/>
+              </w:rPr>
               <w:t>Cross-label groups / files</w:t>
             </w:r>
           </w:p>
@@ -1415,6 +1467,9 @@
               </w:rPr>
             </w:pPr>
             <w:r>
+              <w:rPr>
+                <w:sz w:val="18"/>
+              </w:rPr>
               <w:t>14 / 30</w:t>
             </w:r>
           </w:p>
@@ -1435,6 +1490,9 @@
               <w:ind w:firstLine="0"/>
             </w:pPr>
             <w:r>
+              <w:rPr>
+                <w:sz w:val="18"/>
+              </w:rPr>
               <w:t>Split property</w:t>
             </w:r>
           </w:p>
@@ -1455,6 +1513,9 @@
               <w:ind w:firstLine="0"/>
             </w:pPr>
             <w:r>
+              <w:rPr>
+                <w:sz w:val="18"/>
+              </w:rPr>
               <w:t>checksum-group-disjoint</w:t>
             </w:r>
           </w:p>
@@ -1530,7 +1591,7 @@
         <w:rPr>
           <w:sz w:val="20"/>
         </w:rPr>
-        <w:t>MobileNet and EfficientNet use ImageNet initialization; EfficientNet-B0 is the available warm-up checkpoint, not a completed fine-tuning result. MnasNet and ShuffleNet were trained from scratch, while RawNet2 and AASIST are external references (Table 1).</w:t>
+        <w:t>MobileNet and EfficientNet use ImageNet initialization; EfficientNet-B0 is the available warm-up checkpoint, not a completed fine-tuning result. MnasNet and ShuffleNet were trained from scratch, while RawNet2 and AASIST are external references (Table 2).</w:t>
       </w:r>
     </w:p>
     <w:p>
@@ -1702,6 +1763,9 @@
         </w:rPr>
       </w:pPr>
       <w:r>
+        <w:rPr>
+          <w:sz w:val="18"/>
+        </w:rPr>
         <w:t>Fig. 3. Lightweight architecture and artifact provenance; evaluation is shared, training is not.</w:t>
       </w:r>
     </w:p>
@@ -1716,6 +1780,9 @@
         </w:rPr>
       </w:pPr>
       <w:r>
+        <w:rPr>
+          <w:sz w:val="18"/>
+        </w:rPr>
         <w:t>Table 2. Detector specification, provenance, and deployed threshold</w:t>
       </w:r>
     </w:p>
@@ -1758,12 +1825,16 @@
               <w:spacing w:after="0"/>
               <w:jc w:val="center"/>
             </w:pPr>
-            <w:r/>
+            <w:r>
+              <w:rPr>
+                <w:sz w:val="18"/>
+              </w:rPr>
+            </w:r>
             <w:r>
               <w:rPr>
                 <w:rFonts w:ascii="Times New Roman" w:hAnsi="Times New Roman"/>
                 <w:b/>
-                <w:sz w:val="11"/>
+                <w:sz w:val="18"/>
               </w:rPr>
               <w:t>Detector</w:t>
             </w:r>
@@ -1783,12 +1854,16 @@
               <w:spacing w:after="0"/>
               <w:jc w:val="center"/>
             </w:pPr>
-            <w:r/>
+            <w:r>
+              <w:rPr>
+                <w:sz w:val="18"/>
+              </w:rPr>
+            </w:r>
             <w:r>
               <w:rPr>
                 <w:rFonts w:ascii="Times New Roman" w:hAnsi="Times New Roman"/>
                 <w:b/>
-                <w:sz w:val="11"/>
+                <w:sz w:val="18"/>
               </w:rPr>
               <w:t>Framework/input</w:t>
             </w:r>
@@ -1808,12 +1883,16 @@
               <w:spacing w:after="0"/>
               <w:jc w:val="center"/>
             </w:pPr>
-            <w:r/>
+            <w:r>
+              <w:rPr>
+                <w:sz w:val="18"/>
+              </w:rPr>
+            </w:r>
             <w:r>
               <w:rPr>
                 <w:rFonts w:ascii="Times New Roman" w:hAnsi="Times New Roman"/>
                 <w:b/>
-                <w:sz w:val="11"/>
+                <w:sz w:val="18"/>
               </w:rPr>
               <w:t>Architecture/params</w:t>
             </w:r>
@@ -1833,12 +1912,16 @@
               <w:spacing w:after="0"/>
               <w:jc w:val="center"/>
             </w:pPr>
-            <w:r/>
+            <w:r>
+              <w:rPr>
+                <w:sz w:val="18"/>
+              </w:rPr>
+            </w:r>
             <w:r>
               <w:rPr>
                 <w:rFonts w:ascii="Times New Roman" w:hAnsi="Times New Roman"/>
                 <w:b/>
-                <w:sz w:val="11"/>
+                <w:sz w:val="18"/>
               </w:rPr>
               <w:t>Initialization/provenance</w:t>
             </w:r>
@@ -1858,12 +1941,16 @@
               <w:spacing w:after="0"/>
               <w:jc w:val="center"/>
             </w:pPr>
-            <w:r/>
+            <w:r>
+              <w:rPr>
+                <w:sz w:val="18"/>
+              </w:rPr>
+            </w:r>
             <w:r>
               <w:rPr>
                 <w:rFonts w:ascii="Times New Roman" w:hAnsi="Times New Roman"/>
                 <w:b/>
-                <w:sz w:val="11"/>
+                <w:sz w:val="18"/>
               </w:rPr>
               <w:t>Training/artifact policy</w:t>
             </w:r>
@@ -1884,12 +1971,16 @@
               <w:spacing w:after="0"/>
               <w:jc w:val="center"/>
             </w:pPr>
-            <w:r/>
+            <w:r>
+              <w:rPr>
+                <w:sz w:val="18"/>
+              </w:rPr>
+            </w:r>
             <w:r>
               <w:rPr>
                 <w:rFonts w:ascii="Times New Roman" w:hAnsi="Times New Roman"/>
                 <w:b/>
-                <w:sz w:val="11"/>
+                <w:sz w:val="18"/>
               </w:rPr>
               <w:t>Threshold</w:t>
             </w:r>
@@ -1914,6 +2005,9 @@
               <w:jc w:val="center"/>
             </w:pPr>
             <w:r>
+              <w:rPr>
+                <w:sz w:val="18"/>
+              </w:rPr>
               <w:t>MobileNetV3-LSTM [15]</w:t>
             </w:r>
           </w:p>
@@ -1928,12 +2022,16 @@
               <w:spacing w:after="0"/>
               <w:jc w:val="center"/>
             </w:pPr>
-            <w:r/>
+            <w:r>
+              <w:rPr>
+                <w:sz w:val="18"/>
+              </w:rPr>
+            </w:r>
             <w:r>
               <w:rPr>
                 <w:rFonts w:ascii="Times New Roman" w:hAnsi="Times New Roman"/>
                 <w:b w:val="0"/>
-                <w:sz w:val="11"/>
+                <w:sz w:val="18"/>
               </w:rPr>
               <w:t>TF/Keras; 6×Mel RGB, 3.0 s</w:t>
             </w:r>
@@ -1949,12 +2047,16 @@
               <w:spacing w:after="0"/>
               <w:jc w:val="center"/>
             </w:pPr>
-            <w:r/>
+            <w:r>
+              <w:rPr>
+                <w:sz w:val="18"/>
+              </w:rPr>
+            </w:r>
             <w:r>
               <w:rPr>
                 <w:rFonts w:ascii="Times New Roman" w:hAnsi="Times New Roman"/>
                 <w:b w:val="0"/>
-                <w:sz w:val="11"/>
+                <w:sz w:val="18"/>
               </w:rPr>
               <w:t>MobileNetV3Small → LSTM(128); 1.308M</w:t>
             </w:r>
@@ -1970,12 +2072,16 @@
               <w:spacing w:after="0"/>
               <w:jc w:val="center"/>
             </w:pPr>
-            <w:r/>
+            <w:r>
+              <w:rPr>
+                <w:sz w:val="18"/>
+              </w:rPr>
+            </w:r>
             <w:r>
               <w:rPr>
                 <w:rFonts w:ascii="Times New Roman" w:hAnsi="Times New Roman"/>
                 <w:b w:val="0"/>
-                <w:sz w:val="11"/>
+                <w:sz w:val="18"/>
               </w:rPr>
               <w:t>ImageNet; local</w:t>
             </w:r>
@@ -1991,12 +2097,16 @@
               <w:spacing w:after="0"/>
               <w:jc w:val="center"/>
             </w:pPr>
-            <w:r/>
+            <w:r>
+              <w:rPr>
+                <w:sz w:val="18"/>
+              </w:rPr>
+            </w:r>
             <w:r>
               <w:rPr>
                 <w:rFonts w:ascii="Times New Roman" w:hAnsi="Times New Roman"/>
                 <w:b w:val="0"/>
-                <w:sz w:val="11"/>
+                <w:sz w:val="18"/>
               </w:rPr>
               <w:t>50×10−4 warm-up; 50×10−5 last-20-layer fine-tune; BN frozen</w:t>
             </w:r>
@@ -2012,12 +2122,16 @@
               <w:spacing w:after="0"/>
               <w:jc w:val="center"/>
             </w:pPr>
-            <w:r/>
+            <w:r>
+              <w:rPr>
+                <w:sz w:val="18"/>
+              </w:rPr>
+            </w:r>
             <w:r>
               <w:rPr>
                 <w:rFonts w:ascii="Times New Roman" w:hAnsi="Times New Roman"/>
                 <w:b w:val="0"/>
-                <w:sz w:val="11"/>
+                <w:sz w:val="18"/>
               </w:rPr>
               <w:t>.82; val-F1</w:t>
             </w:r>
@@ -2042,6 +2156,9 @@
               <w:jc w:val="center"/>
             </w:pPr>
             <w:r>
+              <w:rPr>
+                <w:sz w:val="18"/>
+              </w:rPr>
               <w:t>ShuffleNetV2-LSTM [16]</w:t>
             </w:r>
           </w:p>
@@ -2056,12 +2173,16 @@
               <w:spacing w:after="0"/>
               <w:jc w:val="center"/>
             </w:pPr>
-            <w:r/>
+            <w:r>
+              <w:rPr>
+                <w:sz w:val="18"/>
+              </w:rPr>
+            </w:r>
             <w:r>
               <w:rPr>
                 <w:rFonts w:ascii="Times New Roman" w:hAnsi="Times New Roman"/>
                 <w:b w:val="0"/>
-                <w:sz w:val="11"/>
+                <w:sz w:val="18"/>
               </w:rPr>
               <w:t>TF/Keras; 6×Mel RGB, 3.0 s</w:t>
             </w:r>
@@ -2077,12 +2198,16 @@
               <w:spacing w:after="0"/>
               <w:jc w:val="center"/>
             </w:pPr>
-            <w:r/>
+            <w:r>
+              <w:rPr>
+                <w:sz w:val="18"/>
+              </w:rPr>
+            </w:r>
             <w:r>
               <w:rPr>
                 <w:rFonts w:ascii="Times New Roman" w:hAnsi="Times New Roman"/>
                 <w:b w:val="0"/>
-                <w:sz w:val="11"/>
+                <w:sz w:val="18"/>
               </w:rPr>
               <w:t>ShuffleNetV2-1.0x → LSTM(128); 1.868M</w:t>
             </w:r>
@@ -2098,12 +2223,16 @@
               <w:spacing w:after="0"/>
               <w:jc w:val="center"/>
             </w:pPr>
-            <w:r/>
+            <w:r>
+              <w:rPr>
+                <w:sz w:val="18"/>
+              </w:rPr>
+            </w:r>
             <w:r>
               <w:rPr>
                 <w:rFonts w:ascii="Times New Roman" w:hAnsi="Times New Roman"/>
                 <w:b w:val="0"/>
-                <w:sz w:val="11"/>
+                <w:sz w:val="18"/>
               </w:rPr>
               <w:t>scratch; local</w:t>
             </w:r>
@@ -2119,12 +2248,16 @@
               <w:spacing w:after="0"/>
               <w:jc w:val="center"/>
             </w:pPr>
-            <w:r/>
+            <w:r>
+              <w:rPr>
+                <w:sz w:val="18"/>
+              </w:rPr>
+            </w:r>
             <w:r>
               <w:rPr>
                 <w:rFonts w:ascii="Times New Roman" w:hAnsi="Times New Roman"/>
                 <w:b w:val="0"/>
-                <w:sz w:val="11"/>
+                <w:sz w:val="18"/>
               </w:rPr>
               <w:t>Adam 3×10−4; end-to-end; 28 epochs, best 16</w:t>
             </w:r>
@@ -2140,12 +2273,16 @@
               <w:spacing w:after="0"/>
               <w:jc w:val="center"/>
             </w:pPr>
-            <w:r/>
+            <w:r>
+              <w:rPr>
+                <w:sz w:val="18"/>
+              </w:rPr>
+            </w:r>
             <w:r>
               <w:rPr>
                 <w:rFonts w:ascii="Times New Roman" w:hAnsi="Times New Roman"/>
                 <w:b w:val="0"/>
-                <w:sz w:val="11"/>
+                <w:sz w:val="18"/>
               </w:rPr>
               <w:t>.12; val-F1</w:t>
             </w:r>
@@ -2170,6 +2307,9 @@
               <w:jc w:val="center"/>
             </w:pPr>
             <w:r>
+              <w:rPr>
+                <w:sz w:val="18"/>
+              </w:rPr>
               <w:t>MnasNet-A1-LSTM [19]</w:t>
             </w:r>
           </w:p>
@@ -2184,12 +2324,16 @@
               <w:spacing w:after="0"/>
               <w:jc w:val="center"/>
             </w:pPr>
-            <w:r/>
+            <w:r>
+              <w:rPr>
+                <w:sz w:val="18"/>
+              </w:rPr>
+            </w:r>
             <w:r>
               <w:rPr>
                 <w:rFonts w:ascii="Times New Roman" w:hAnsi="Times New Roman"/>
                 <w:b w:val="0"/>
-                <w:sz w:val="11"/>
+                <w:sz w:val="18"/>
               </w:rPr>
               <w:t>TF/Keras; 6×Mel RGB, 3.0 s</w:t>
             </w:r>
@@ -2205,12 +2349,16 @@
               <w:spacing w:after="0"/>
               <w:jc w:val="center"/>
             </w:pPr>
-            <w:r/>
+            <w:r>
+              <w:rPr>
+                <w:sz w:val="18"/>
+              </w:rPr>
+            </w:r>
             <w:r>
               <w:rPr>
                 <w:rFonts w:ascii="Times New Roman" w:hAnsi="Times New Roman"/>
                 <w:b w:val="0"/>
-                <w:sz w:val="11"/>
+                <w:sz w:val="18"/>
               </w:rPr>
               <w:t>MnasNet-A1 → LSTM(128); 3.369M</w:t>
             </w:r>
@@ -2226,12 +2374,16 @@
               <w:spacing w:after="0"/>
               <w:jc w:val="center"/>
             </w:pPr>
-            <w:r/>
+            <w:r>
+              <w:rPr>
+                <w:sz w:val="18"/>
+              </w:rPr>
+            </w:r>
             <w:r>
               <w:rPr>
                 <w:rFonts w:ascii="Times New Roman" w:hAnsi="Times New Roman"/>
                 <w:b w:val="0"/>
-                <w:sz w:val="11"/>
+                <w:sz w:val="18"/>
               </w:rPr>
               <w:t>scratch; local</w:t>
             </w:r>
@@ -2247,12 +2399,16 @@
               <w:spacing w:after="0"/>
               <w:jc w:val="center"/>
             </w:pPr>
-            <w:r/>
+            <w:r>
+              <w:rPr>
+                <w:sz w:val="18"/>
+              </w:rPr>
+            </w:r>
             <w:r>
               <w:rPr>
                 <w:rFonts w:ascii="Times New Roman" w:hAnsi="Times New Roman"/>
                 <w:b w:val="0"/>
-                <w:sz w:val="11"/>
+                <w:sz w:val="18"/>
               </w:rPr>
               <w:t>Adam 10−4; clip 1; WD 10−5; LS .1; 39 epochs, best 27</w:t>
             </w:r>
@@ -2268,12 +2424,16 @@
               <w:spacing w:after="0"/>
               <w:jc w:val="center"/>
             </w:pPr>
-            <w:r/>
+            <w:r>
+              <w:rPr>
+                <w:sz w:val="18"/>
+              </w:rPr>
+            </w:r>
             <w:r>
               <w:rPr>
                 <w:rFonts w:ascii="Times New Roman" w:hAnsi="Times New Roman"/>
                 <w:b w:val="0"/>
-                <w:sz w:val="11"/>
+                <w:sz w:val="18"/>
               </w:rPr>
               <w:t>.90; val-F1</w:t>
             </w:r>
@@ -2298,6 +2458,9 @@
               <w:jc w:val="center"/>
             </w:pPr>
             <w:r>
+              <w:rPr>
+                <w:sz w:val="18"/>
+              </w:rPr>
               <w:t>EffNet-B0 warm-up [20]</w:t>
             </w:r>
           </w:p>
@@ -2312,12 +2475,16 @@
               <w:spacing w:after="0"/>
               <w:jc w:val="center"/>
             </w:pPr>
-            <w:r/>
+            <w:r>
+              <w:rPr>
+                <w:sz w:val="18"/>
+              </w:rPr>
+            </w:r>
             <w:r>
               <w:rPr>
                 <w:rFonts w:ascii="Times New Roman" w:hAnsi="Times New Roman"/>
                 <w:b w:val="0"/>
-                <w:sz w:val="11"/>
+                <w:sz w:val="18"/>
               </w:rPr>
               <w:t>TF/Keras; 6×Mel RGB, 3.0 s</w:t>
             </w:r>
@@ -2333,12 +2500,16 @@
               <w:spacing w:after="0"/>
               <w:jc w:val="center"/>
             </w:pPr>
-            <w:r/>
+            <w:r>
+              <w:rPr>
+                <w:sz w:val="18"/>
+              </w:rPr>
+            </w:r>
             <w:r>
               <w:rPr>
                 <w:rFonts w:ascii="Times New Roman" w:hAnsi="Times New Roman"/>
                 <w:b w:val="0"/>
-                <w:sz w:val="11"/>
+                <w:sz w:val="18"/>
               </w:rPr>
               <w:t>EfficientNet-B0 → LSTM(128); 4.779M</w:t>
             </w:r>
@@ -2354,12 +2525,16 @@
               <w:spacing w:after="0"/>
               <w:jc w:val="center"/>
             </w:pPr>
-            <w:r/>
+            <w:r>
+              <w:rPr>
+                <w:sz w:val="18"/>
+              </w:rPr>
+            </w:r>
             <w:r>
               <w:rPr>
                 <w:rFonts w:ascii="Times New Roman" w:hAnsi="Times New Roman"/>
                 <w:b w:val="0"/>
-                <w:sz w:val="11"/>
+                <w:sz w:val="18"/>
               </w:rPr>
               <w:t>ImageNet; local</w:t>
             </w:r>
@@ -2375,12 +2550,16 @@
               <w:spacing w:after="0"/>
               <w:jc w:val="center"/>
             </w:pPr>
-            <w:r/>
+            <w:r>
+              <w:rPr>
+                <w:sz w:val="18"/>
+              </w:rPr>
+            </w:r>
             <w:r>
               <w:rPr>
                 <w:rFonts w:ascii="Times New Roman" w:hAnsi="Times New Roman"/>
                 <w:b w:val="0"/>
-                <w:sz w:val="11"/>
+                <w:sz w:val="18"/>
               </w:rPr>
               <w:t>available warm-up checkpoint: epoch 47 at 10−4; fine-tune incomplete</w:t>
             </w:r>
@@ -2396,12 +2575,16 @@
               <w:spacing w:after="0"/>
               <w:jc w:val="center"/>
             </w:pPr>
-            <w:r/>
+            <w:r>
+              <w:rPr>
+                <w:sz w:val="18"/>
+              </w:rPr>
+            </w:r>
             <w:r>
               <w:rPr>
                 <w:rFonts w:ascii="Times New Roman" w:hAnsi="Times New Roman"/>
                 <w:b w:val="0"/>
-                <w:sz w:val="11"/>
+                <w:sz w:val="18"/>
               </w:rPr>
               <w:t>.90; val-F1</w:t>
             </w:r>
@@ -2429,6 +2612,9 @@
               <w:jc w:val="center"/>
             </w:pPr>
             <w:r>
+              <w:rPr>
+                <w:sz w:val="18"/>
+              </w:rPr>
               <w:t>RawNet2 [6]</w:t>
             </w:r>
           </w:p>
@@ -2446,12 +2632,16 @@
               <w:spacing w:after="0"/>
               <w:jc w:val="center"/>
             </w:pPr>
-            <w:r/>
+            <w:r>
+              <w:rPr>
+                <w:sz w:val="18"/>
+              </w:rPr>
+            </w:r>
             <w:r>
               <w:rPr>
                 <w:rFonts w:ascii="Times New Roman" w:hAnsi="Times New Roman"/>
                 <w:b w:val="0"/>
-                <w:sz w:val="11"/>
+                <w:sz w:val="18"/>
               </w:rPr>
               <w:t>PyTorch→ONNX; waveform, 4.04 s</w:t>
             </w:r>
@@ -2470,12 +2660,16 @@
               <w:spacing w:after="0"/>
               <w:jc w:val="center"/>
             </w:pPr>
-            <w:r/>
+            <w:r>
+              <w:rPr>
+                <w:sz w:val="18"/>
+              </w:rPr>
+            </w:r>
             <w:r>
               <w:rPr>
                 <w:rFonts w:ascii="Times New Roman" w:hAnsi="Times New Roman"/>
                 <w:b w:val="0"/>
-                <w:sz w:val="11"/>
+                <w:sz w:val="18"/>
               </w:rPr>
               <w:t>Sinc + residual blocks + attention + GRU; 17.621M</w:t>
             </w:r>
@@ -2494,12 +2688,16 @@
               <w:spacing w:after="0"/>
               <w:jc w:val="center"/>
             </w:pPr>
-            <w:r/>
+            <w:r>
+              <w:rPr>
+                <w:sz w:val="18"/>
+              </w:rPr>
+            </w:r>
             <w:r>
               <w:rPr>
                 <w:rFonts w:ascii="Times New Roman" w:hAnsi="Times New Roman"/>
                 <w:b w:val="0"/>
-                <w:sz w:val="11"/>
+                <w:sz w:val="18"/>
               </w:rPr>
               <w:t>external reference</w:t>
             </w:r>
@@ -2518,12 +2716,16 @@
               <w:spacing w:after="0"/>
               <w:jc w:val="center"/>
             </w:pPr>
-            <w:r/>
+            <w:r>
+              <w:rPr>
+                <w:sz w:val="18"/>
+              </w:rPr>
+            </w:r>
             <w:r>
               <w:rPr>
                 <w:rFonts w:ascii="Times New Roman" w:hAnsi="Times New Roman"/>
                 <w:b w:val="0"/>
-                <w:sz w:val="11"/>
+                <w:sz w:val="18"/>
               </w:rPr>
               <w:t>no local training; exported checkpoint</w:t>
             </w:r>
@@ -2542,12 +2744,16 @@
               <w:spacing w:after="0"/>
               <w:jc w:val="center"/>
             </w:pPr>
-            <w:r/>
+            <w:r>
+              <w:rPr>
+                <w:sz w:val="18"/>
+              </w:rPr>
+            </w:r>
             <w:r>
               <w:rPr>
                 <w:rFonts w:ascii="Times New Roman" w:hAnsi="Times New Roman"/>
                 <w:b w:val="0"/>
-                <w:sz w:val="11"/>
+                <w:sz w:val="18"/>
               </w:rPr>
               <w:t>.50; default</w:t>
             </w:r>
@@ -2578,6 +2784,9 @@
               <w:jc w:val="center"/>
             </w:pPr>
             <w:r>
+              <w:rPr>
+                <w:sz w:val="18"/>
+              </w:rPr>
               <w:t>AASIST [8]</w:t>
             </w:r>
           </w:p>
@@ -2598,12 +2807,16 @@
               <w:spacing w:after="0"/>
               <w:jc w:val="center"/>
             </w:pPr>
-            <w:r/>
+            <w:r>
+              <w:rPr>
+                <w:sz w:val="18"/>
+              </w:rPr>
+            </w:r>
             <w:r>
               <w:rPr>
                 <w:rFonts w:ascii="Times New Roman" w:hAnsi="Times New Roman"/>
                 <w:b w:val="0"/>
-                <w:sz w:val="11"/>
+                <w:sz w:val="18"/>
               </w:rPr>
               <w:t>PyTorch→ONNX; waveform, 4.04 s</w:t>
             </w:r>
@@ -2625,12 +2838,16 @@
               <w:spacing w:after="0"/>
               <w:jc w:val="center"/>
             </w:pPr>
-            <w:r/>
+            <w:r>
+              <w:rPr>
+                <w:sz w:val="18"/>
+              </w:rPr>
+            </w:r>
             <w:r>
               <w:rPr>
                 <w:rFonts w:ascii="Times New Roman" w:hAnsi="Times New Roman"/>
                 <w:b w:val="0"/>
-                <w:sz w:val="11"/>
+                <w:sz w:val="18"/>
               </w:rPr>
               <w:t>spectro-temporal graph attention; 0.298M</w:t>
             </w:r>
@@ -2652,12 +2869,16 @@
               <w:spacing w:after="0"/>
               <w:jc w:val="center"/>
             </w:pPr>
-            <w:r/>
+            <w:r>
+              <w:rPr>
+                <w:sz w:val="18"/>
+              </w:rPr>
+            </w:r>
             <w:r>
               <w:rPr>
                 <w:rFonts w:ascii="Times New Roman" w:hAnsi="Times New Roman"/>
                 <w:b w:val="0"/>
-                <w:sz w:val="11"/>
+                <w:sz w:val="18"/>
               </w:rPr>
               <w:t>external reference</w:t>
             </w:r>
@@ -2679,12 +2900,16 @@
               <w:spacing w:after="0"/>
               <w:jc w:val="center"/>
             </w:pPr>
-            <w:r/>
+            <w:r>
+              <w:rPr>
+                <w:sz w:val="18"/>
+              </w:rPr>
+            </w:r>
             <w:r>
               <w:rPr>
                 <w:rFonts w:ascii="Times New Roman" w:hAnsi="Times New Roman"/>
                 <w:b w:val="0"/>
-                <w:sz w:val="11"/>
+                <w:sz w:val="18"/>
               </w:rPr>
               <w:t>no local training; exported checkpoint</w:t>
             </w:r>
@@ -2706,12 +2931,16 @@
               <w:spacing w:after="0"/>
               <w:jc w:val="center"/>
             </w:pPr>
-            <w:r/>
+            <w:r>
+              <w:rPr>
+                <w:sz w:val="18"/>
+              </w:rPr>
+            </w:r>
             <w:r>
               <w:rPr>
                 <w:rFonts w:ascii="Times New Roman" w:hAnsi="Times New Roman"/>
                 <w:b w:val="0"/>
-                <w:sz w:val="11"/>
+                <w:sz w:val="18"/>
               </w:rPr>
               <w:t>.50; default</w:t>
             </w:r>
@@ -3562,6 +3791,9 @@
         </w:rPr>
       </w:pPr>
       <w:r>
+        <w:rPr>
+          <w:sz w:val="18"/>
+        </w:rPr>
         <w:t>Table 3. Clean performance on all 2,737 canonical test recordings. Specificity, precision, recall, F1, and macro-F1 use each artifact's threshold; ROC-AUC, PR-AUC, and EER use raw P(FAKE) scores.</w:t>
       </w:r>
     </w:p>
@@ -3605,12 +3837,16 @@
               <w:spacing w:after="0"/>
               <w:jc w:val="center"/>
             </w:pPr>
-            <w:r/>
+            <w:r>
+              <w:rPr>
+                <w:sz w:val="18"/>
+              </w:rPr>
+            </w:r>
             <w:r>
               <w:rPr>
                 <w:rFonts w:ascii="Times New Roman" w:hAnsi="Times New Roman"/>
                 <w:b/>
-                <w:sz w:val="12"/>
+                <w:sz w:val="18"/>
               </w:rPr>
               <w:t>Artifact</w:t>
             </w:r>
@@ -3630,12 +3866,16 @@
               <w:spacing w:after="0"/>
               <w:jc w:val="center"/>
             </w:pPr>
-            <w:r/>
+            <w:r>
+              <w:rPr>
+                <w:sz w:val="18"/>
+              </w:rPr>
+            </w:r>
             <w:r>
               <w:rPr>
                 <w:rFonts w:ascii="Times New Roman" w:hAnsi="Times New Roman"/>
                 <w:b/>
-                <w:sz w:val="12"/>
+                <w:sz w:val="18"/>
               </w:rPr>
               <w:t>Precision</w:t>
             </w:r>
@@ -3655,12 +3895,16 @@
               <w:spacing w:after="0"/>
               <w:jc w:val="center"/>
             </w:pPr>
-            <w:r/>
+            <w:r>
+              <w:rPr>
+                <w:sz w:val="18"/>
+              </w:rPr>
+            </w:r>
             <w:r>
               <w:rPr>
                 <w:rFonts w:ascii="Times New Roman" w:hAnsi="Times New Roman"/>
                 <w:b/>
-                <w:sz w:val="12"/>
+                <w:sz w:val="18"/>
               </w:rPr>
               <w:t>Recall</w:t>
             </w:r>
@@ -3680,12 +3924,16 @@
               <w:spacing w:after="0"/>
               <w:jc w:val="center"/>
             </w:pPr>
-            <w:r/>
+            <w:r>
+              <w:rPr>
+                <w:sz w:val="18"/>
+              </w:rPr>
+            </w:r>
             <w:r>
               <w:rPr>
                 <w:rFonts w:ascii="Times New Roman" w:hAnsi="Times New Roman"/>
                 <w:b/>
-                <w:sz w:val="12"/>
+                <w:sz w:val="18"/>
               </w:rPr>
               <w:t>Specificity</w:t>
             </w:r>
@@ -3705,12 +3953,16 @@
               <w:spacing w:after="0"/>
               <w:jc w:val="center"/>
             </w:pPr>
-            <w:r/>
+            <w:r>
+              <w:rPr>
+                <w:sz w:val="18"/>
+              </w:rPr>
+            </w:r>
             <w:r>
               <w:rPr>
                 <w:rFonts w:ascii="Times New Roman" w:hAnsi="Times New Roman"/>
                 <w:b/>
-                <w:sz w:val="12"/>
+                <w:sz w:val="18"/>
               </w:rPr>
               <w:t>F1 [95% CI]</w:t>
             </w:r>
@@ -3730,12 +3982,16 @@
               <w:spacing w:after="0"/>
               <w:jc w:val="center"/>
             </w:pPr>
-            <w:r/>
+            <w:r>
+              <w:rPr>
+                <w:sz w:val="18"/>
+              </w:rPr>
+            </w:r>
             <w:r>
               <w:rPr>
                 <w:rFonts w:ascii="Times New Roman" w:hAnsi="Times New Roman"/>
                 <w:b/>
-                <w:sz w:val="12"/>
+                <w:sz w:val="18"/>
               </w:rPr>
               <w:t>Macro-F1</w:t>
             </w:r>
@@ -3755,12 +4011,16 @@
               <w:spacing w:after="0"/>
               <w:jc w:val="center"/>
             </w:pPr>
-            <w:r/>
+            <w:r>
+              <w:rPr>
+                <w:sz w:val="18"/>
+              </w:rPr>
+            </w:r>
             <w:r>
               <w:rPr>
                 <w:rFonts w:ascii="Times New Roman" w:hAnsi="Times New Roman"/>
                 <w:b/>
-                <w:sz w:val="12"/>
+                <w:sz w:val="18"/>
               </w:rPr>
               <w:t>ROC-AUC [95% CI]</w:t>
             </w:r>
@@ -3780,12 +4040,16 @@
               <w:spacing w:after="0"/>
               <w:jc w:val="center"/>
             </w:pPr>
-            <w:r/>
+            <w:r>
+              <w:rPr>
+                <w:sz w:val="18"/>
+              </w:rPr>
+            </w:r>
             <w:r>
               <w:rPr>
                 <w:rFonts w:ascii="Times New Roman" w:hAnsi="Times New Roman"/>
                 <w:b/>
-                <w:sz w:val="12"/>
+                <w:sz w:val="18"/>
               </w:rPr>
               <w:t>PR-AUC</w:t>
             </w:r>
@@ -3805,12 +4069,16 @@
               <w:spacing w:after="0"/>
               <w:jc w:val="center"/>
             </w:pPr>
-            <w:r/>
+            <w:r>
+              <w:rPr>
+                <w:sz w:val="18"/>
+              </w:rPr>
+            </w:r>
             <w:r>
               <w:rPr>
                 <w:rFonts w:ascii="Times New Roman" w:hAnsi="Times New Roman"/>
                 <w:b/>
-                <w:sz w:val="12"/>
+                <w:sz w:val="18"/>
               </w:rPr>
               <w:t>EER [95% CI]</w:t>
             </w:r>
@@ -3832,12 +4100,16 @@
               <w:spacing w:after="0"/>
               <w:jc w:val="center"/>
             </w:pPr>
-            <w:r/>
+            <w:r>
+              <w:rPr>
+                <w:sz w:val="18"/>
+              </w:rPr>
+            </w:r>
             <w:r>
               <w:rPr>
                 <w:rFonts w:ascii="Times New Roman" w:hAnsi="Times New Roman"/>
                 <w:b w:val="0"/>
-                <w:sz w:val="11"/>
+                <w:sz w:val="18"/>
               </w:rPr>
               <w:t>MobileNetV3</w:t>
             </w:r>
@@ -3853,12 +4125,16 @@
               <w:spacing w:after="0"/>
               <w:jc w:val="center"/>
             </w:pPr>
-            <w:r/>
+            <w:r>
+              <w:rPr>
+                <w:sz w:val="18"/>
+              </w:rPr>
+            </w:r>
             <w:r>
               <w:rPr>
                 <w:rFonts w:ascii="Times New Roman" w:hAnsi="Times New Roman"/>
                 <w:b w:val="0"/>
-                <w:sz w:val="11"/>
+                <w:sz w:val="18"/>
               </w:rPr>
               <w:t>.9741</w:t>
             </w:r>
@@ -3874,12 +4150,16 @@
               <w:spacing w:after="0"/>
               <w:jc w:val="center"/>
             </w:pPr>
-            <w:r/>
+            <w:r>
+              <w:rPr>
+                <w:sz w:val="18"/>
+              </w:rPr>
+            </w:r>
             <w:r>
               <w:rPr>
                 <w:rFonts w:ascii="Times New Roman" w:hAnsi="Times New Roman"/>
                 <w:b w:val="0"/>
-                <w:sz w:val="11"/>
+                <w:sz w:val="18"/>
               </w:rPr>
               <w:t>.9707</w:t>
             </w:r>
@@ -3895,12 +4175,16 @@
               <w:spacing w:after="0"/>
               <w:jc w:val="center"/>
             </w:pPr>
-            <w:r/>
+            <w:r>
+              <w:rPr>
+                <w:sz w:val="18"/>
+              </w:rPr>
+            </w:r>
             <w:r>
               <w:rPr>
                 <w:rFonts w:ascii="Times New Roman" w:hAnsi="Times New Roman"/>
                 <w:b w:val="0"/>
-                <w:sz w:val="11"/>
+                <w:sz w:val="18"/>
               </w:rPr>
               <w:t>.9810</w:t>
             </w:r>
@@ -3916,12 +4200,16 @@
               <w:spacing w:after="0"/>
               <w:jc w:val="center"/>
             </w:pPr>
-            <w:r/>
+            <w:r>
+              <w:rPr>
+                <w:sz w:val="18"/>
+              </w:rPr>
+            </w:r>
             <w:r>
               <w:rPr>
                 <w:rFonts w:ascii="Times New Roman" w:hAnsi="Times New Roman"/>
                 <w:b w:val="0"/>
-                <w:sz w:val="11"/>
+                <w:sz w:val="18"/>
               </w:rPr>
               <w:t>.9724 [0.9654,0.9788]</w:t>
             </w:r>
@@ -3937,12 +4225,16 @@
               <w:spacing w:after="0"/>
               <w:jc w:val="center"/>
             </w:pPr>
-            <w:r/>
+            <w:r>
+              <w:rPr>
+                <w:sz w:val="18"/>
+              </w:rPr>
+            </w:r>
             <w:r>
               <w:rPr>
                 <w:rFonts w:ascii="Times New Roman" w:hAnsi="Times New Roman"/>
                 <w:b w:val="0"/>
-                <w:sz w:val="11"/>
+                <w:sz w:val="18"/>
               </w:rPr>
               <w:t>.9761</w:t>
             </w:r>
@@ -3958,12 +4250,16 @@
               <w:spacing w:after="0"/>
               <w:jc w:val="center"/>
             </w:pPr>
-            <w:r/>
+            <w:r>
+              <w:rPr>
+                <w:sz w:val="18"/>
+              </w:rPr>
+            </w:r>
             <w:r>
               <w:rPr>
                 <w:rFonts w:ascii="Times New Roman" w:hAnsi="Times New Roman"/>
                 <w:b w:val="0"/>
-                <w:sz w:val="11"/>
+                <w:sz w:val="18"/>
               </w:rPr>
               <w:t>.9911 [0.9871,0.9947]</w:t>
             </w:r>
@@ -3979,12 +4275,16 @@
               <w:spacing w:after="0"/>
               <w:jc w:val="center"/>
             </w:pPr>
-            <w:r/>
+            <w:r>
+              <w:rPr>
+                <w:sz w:val="18"/>
+              </w:rPr>
+            </w:r>
             <w:r>
               <w:rPr>
                 <w:rFonts w:ascii="Times New Roman" w:hAnsi="Times New Roman"/>
                 <w:b w:val="0"/>
-                <w:sz w:val="11"/>
+                <w:sz w:val="18"/>
               </w:rPr>
               <w:t>.9864</w:t>
             </w:r>
@@ -4000,12 +4300,16 @@
               <w:spacing w:after="0"/>
               <w:jc w:val="center"/>
             </w:pPr>
-            <w:r/>
+            <w:r>
+              <w:rPr>
+                <w:sz w:val="18"/>
+              </w:rPr>
+            </w:r>
             <w:r>
               <w:rPr>
                 <w:rFonts w:ascii="Times New Roman" w:hAnsi="Times New Roman"/>
                 <w:b w:val="0"/>
-                <w:sz w:val="11"/>
+                <w:sz w:val="18"/>
               </w:rPr>
               <w:t>.0250 [0.0178,0.0311]</w:t>
             </w:r>
@@ -4027,12 +4331,16 @@
               <w:spacing w:after="0"/>
               <w:jc w:val="center"/>
             </w:pPr>
-            <w:r/>
+            <w:r>
+              <w:rPr>
+                <w:sz w:val="18"/>
+              </w:rPr>
+            </w:r>
             <w:r>
               <w:rPr>
                 <w:rFonts w:ascii="Times New Roman" w:hAnsi="Times New Roman"/>
                 <w:b w:val="0"/>
-                <w:sz w:val="11"/>
+                <w:sz w:val="18"/>
               </w:rPr>
               <w:t>ShuffleNetV2</w:t>
             </w:r>
@@ -4048,12 +4356,16 @@
               <w:spacing w:after="0"/>
               <w:jc w:val="center"/>
             </w:pPr>
-            <w:r/>
+            <w:r>
+              <w:rPr>
+                <w:sz w:val="18"/>
+              </w:rPr>
+            </w:r>
             <w:r>
               <w:rPr>
                 <w:rFonts w:ascii="Times New Roman" w:hAnsi="Times New Roman"/>
                 <w:b w:val="0"/>
-                <w:sz w:val="11"/>
+                <w:sz w:val="18"/>
               </w:rPr>
               <w:t>.9795</w:t>
             </w:r>
@@ -4069,12 +4381,16 @@
               <w:spacing w:after="0"/>
               <w:jc w:val="center"/>
             </w:pPr>
-            <w:r/>
+            <w:r>
+              <w:rPr>
+                <w:sz w:val="18"/>
+              </w:rPr>
+            </w:r>
             <w:r>
               <w:rPr>
                 <w:rFonts w:ascii="Times New Roman" w:hAnsi="Times New Roman"/>
                 <w:b w:val="0"/>
-                <w:sz w:val="11"/>
+                <w:sz w:val="18"/>
               </w:rPr>
               <w:t>.9854</w:t>
             </w:r>
@@ -4090,12 +4406,16 @@
               <w:spacing w:after="0"/>
               <w:jc w:val="center"/>
             </w:pPr>
-            <w:r/>
+            <w:r>
+              <w:rPr>
+                <w:sz w:val="18"/>
+              </w:rPr>
+            </w:r>
             <w:r>
               <w:rPr>
                 <w:rFonts w:ascii="Times New Roman" w:hAnsi="Times New Roman"/>
                 <w:b w:val="0"/>
-                <w:sz w:val="11"/>
+                <w:sz w:val="18"/>
               </w:rPr>
               <w:t>.9848</w:t>
             </w:r>
@@ -4111,12 +4431,16 @@
               <w:spacing w:after="0"/>
               <w:jc w:val="center"/>
             </w:pPr>
-            <w:r/>
+            <w:r>
+              <w:rPr>
+                <w:sz w:val="18"/>
+              </w:rPr>
+            </w:r>
             <w:r>
               <w:rPr>
                 <w:rFonts w:ascii="Times New Roman" w:hAnsi="Times New Roman"/>
                 <w:b w:val="0"/>
-                <w:sz w:val="11"/>
+                <w:sz w:val="18"/>
               </w:rPr>
               <w:t>.9824 [0.9768,0.9875]</w:t>
             </w:r>
@@ -4132,12 +4456,16 @@
               <w:spacing w:after="0"/>
               <w:jc w:val="center"/>
             </w:pPr>
-            <w:r/>
+            <w:r>
+              <w:rPr>
+                <w:sz w:val="18"/>
+              </w:rPr>
+            </w:r>
             <w:r>
               <w:rPr>
                 <w:rFonts w:ascii="Times New Roman" w:hAnsi="Times New Roman"/>
                 <w:b w:val="0"/>
-                <w:sz w:val="11"/>
+                <w:sz w:val="18"/>
               </w:rPr>
               <w:t>.9847</w:t>
             </w:r>
@@ -4153,12 +4481,16 @@
               <w:spacing w:after="0"/>
               <w:jc w:val="center"/>
             </w:pPr>
-            <w:r/>
+            <w:r>
+              <w:rPr>
+                <w:sz w:val="18"/>
+              </w:rPr>
+            </w:r>
             <w:r>
               <w:rPr>
                 <w:rFonts w:ascii="Times New Roman" w:hAnsi="Times New Roman"/>
                 <w:b w:val="0"/>
-                <w:sz w:val="11"/>
+                <w:sz w:val="18"/>
               </w:rPr>
               <w:t>.9929 [0.9894,0.9960]</w:t>
             </w:r>
@@ -4174,12 +4506,16 @@
               <w:spacing w:after="0"/>
               <w:jc w:val="center"/>
             </w:pPr>
-            <w:r/>
+            <w:r>
+              <w:rPr>
+                <w:sz w:val="18"/>
+              </w:rPr>
+            </w:r>
             <w:r>
               <w:rPr>
                 <w:rFonts w:ascii="Times New Roman" w:hAnsi="Times New Roman"/>
                 <w:b w:val="0"/>
-                <w:sz w:val="11"/>
+                <w:sz w:val="18"/>
               </w:rPr>
               <w:t>.9898</w:t>
             </w:r>
@@ -4195,12 +4531,16 @@
               <w:spacing w:after="0"/>
               <w:jc w:val="center"/>
             </w:pPr>
-            <w:r/>
+            <w:r>
+              <w:rPr>
+                <w:sz w:val="18"/>
+              </w:rPr>
+            </w:r>
             <w:r>
               <w:rPr>
                 <w:rFonts w:ascii="Times New Roman" w:hAnsi="Times New Roman"/>
                 <w:b w:val="0"/>
-                <w:sz w:val="11"/>
+                <w:sz w:val="18"/>
               </w:rPr>
               <w:t>.0146 [0.0103,0.0207]</w:t>
             </w:r>
@@ -4225,12 +4565,16 @@
               <w:spacing w:after="0"/>
               <w:jc w:val="center"/>
             </w:pPr>
-            <w:r/>
+            <w:r>
+              <w:rPr>
+                <w:sz w:val="18"/>
+              </w:rPr>
+            </w:r>
             <w:r>
               <w:rPr>
                 <w:rFonts w:ascii="Times New Roman" w:hAnsi="Times New Roman"/>
                 <w:b w:val="0"/>
-                <w:sz w:val="11"/>
+                <w:sz w:val="18"/>
               </w:rPr>
               <w:t>MnasNet-A1</w:t>
             </w:r>
@@ -4249,12 +4593,16 @@
               <w:spacing w:after="0"/>
               <w:jc w:val="center"/>
             </w:pPr>
-            <w:r/>
+            <w:r>
+              <w:rPr>
+                <w:sz w:val="18"/>
+              </w:rPr>
+            </w:r>
             <w:r>
               <w:rPr>
                 <w:rFonts w:ascii="Times New Roman" w:hAnsi="Times New Roman"/>
                 <w:b w:val="0"/>
-                <w:sz w:val="11"/>
+                <w:sz w:val="18"/>
               </w:rPr>
               <w:t>.9599</w:t>
             </w:r>
@@ -4273,12 +4621,16 @@
               <w:spacing w:after="0"/>
               <w:jc w:val="center"/>
             </w:pPr>
-            <w:r/>
+            <w:r>
+              <w:rPr>
+                <w:sz w:val="18"/>
+              </w:rPr>
+            </w:r>
             <w:r>
               <w:rPr>
                 <w:rFonts w:ascii="Times New Roman" w:hAnsi="Times New Roman"/>
                 <w:b w:val="0"/>
-                <w:sz w:val="11"/>
+                <w:sz w:val="18"/>
               </w:rPr>
               <w:t>.9690</w:t>
             </w:r>
@@ -4297,12 +4649,16 @@
               <w:spacing w:after="0"/>
               <w:jc w:val="center"/>
             </w:pPr>
-            <w:r/>
+            <w:r>
+              <w:rPr>
+                <w:sz w:val="18"/>
+              </w:rPr>
+            </w:r>
             <w:r>
               <w:rPr>
                 <w:rFonts w:ascii="Times New Roman" w:hAnsi="Times New Roman"/>
                 <w:b w:val="0"/>
-                <w:sz w:val="11"/>
+                <w:sz w:val="18"/>
               </w:rPr>
               <w:t>.9702</w:t>
             </w:r>
@@ -4321,12 +4677,16 @@
               <w:spacing w:after="0"/>
               <w:jc w:val="center"/>
             </w:pPr>
-            <w:r/>
+            <w:r>
+              <w:rPr>
+                <w:sz w:val="18"/>
+              </w:rPr>
+            </w:r>
             <w:r>
               <w:rPr>
                 <w:rFonts w:ascii="Times New Roman" w:hAnsi="Times New Roman"/>
                 <w:b w:val="0"/>
-                <w:sz w:val="11"/>
+                <w:sz w:val="18"/>
               </w:rPr>
               <w:t>.9645 [0.9573,0.9717]</w:t>
             </w:r>
@@ -4345,12 +4705,16 @@
               <w:spacing w:after="0"/>
               <w:jc w:val="center"/>
             </w:pPr>
-            <w:r/>
+            <w:r>
+              <w:rPr>
+                <w:sz w:val="18"/>
+              </w:rPr>
+            </w:r>
             <w:r>
               <w:rPr>
                 <w:rFonts w:ascii="Times New Roman" w:hAnsi="Times New Roman"/>
                 <w:b w:val="0"/>
-                <w:sz w:val="11"/>
+                <w:sz w:val="18"/>
               </w:rPr>
               <w:t>.9690</w:t>
             </w:r>
@@ -4369,12 +4733,16 @@
               <w:spacing w:after="0"/>
               <w:jc w:val="center"/>
             </w:pPr>
-            <w:r/>
+            <w:r>
+              <w:rPr>
+                <w:sz w:val="18"/>
+              </w:rPr>
+            </w:r>
             <w:r>
               <w:rPr>
                 <w:rFonts w:ascii="Times New Roman" w:hAnsi="Times New Roman"/>
                 <w:b w:val="0"/>
-                <w:sz w:val="11"/>
+                <w:sz w:val="18"/>
               </w:rPr>
               <w:t>.9886 [0.9842,0.9923]</w:t>
             </w:r>
@@ -4393,12 +4761,16 @@
               <w:spacing w:after="0"/>
               <w:jc w:val="center"/>
             </w:pPr>
-            <w:r/>
+            <w:r>
+              <w:rPr>
+                <w:sz w:val="18"/>
+              </w:rPr>
+            </w:r>
             <w:r>
               <w:rPr>
                 <w:rFonts w:ascii="Times New Roman" w:hAnsi="Times New Roman"/>
                 <w:b w:val="0"/>
-                <w:sz w:val="11"/>
+                <w:sz w:val="18"/>
               </w:rPr>
               <w:t>.9823</w:t>
             </w:r>
@@ -4417,12 +4789,16 @@
               <w:spacing w:after="0"/>
               <w:jc w:val="center"/>
             </w:pPr>
-            <w:r/>
+            <w:r>
+              <w:rPr>
+                <w:sz w:val="18"/>
+              </w:rPr>
+            </w:r>
             <w:r>
               <w:rPr>
                 <w:rFonts w:ascii="Times New Roman" w:hAnsi="Times New Roman"/>
                 <w:b w:val="0"/>
-                <w:sz w:val="11"/>
+                <w:sz w:val="18"/>
               </w:rPr>
               <w:t>.0310 [0.0250,0.0379]</w:t>
             </w:r>
@@ -4447,12 +4823,16 @@
               <w:spacing w:after="0"/>
               <w:jc w:val="center"/>
             </w:pPr>
-            <w:r/>
+            <w:r>
+              <w:rPr>
+                <w:sz w:val="18"/>
+              </w:rPr>
+            </w:r>
             <w:r>
               <w:rPr>
                 <w:rFonts w:ascii="Times New Roman" w:hAnsi="Times New Roman"/>
                 <w:b w:val="0"/>
-                <w:sz w:val="11"/>
+                <w:sz w:val="18"/>
               </w:rPr>
               <w:t>EffNet-B0 warm-up</w:t>
             </w:r>
@@ -4471,12 +4851,16 @@
               <w:spacing w:after="0"/>
               <w:jc w:val="center"/>
             </w:pPr>
-            <w:r/>
+            <w:r>
+              <w:rPr>
+                <w:sz w:val="18"/>
+              </w:rPr>
+            </w:r>
             <w:r>
               <w:rPr>
                 <w:rFonts w:ascii="Times New Roman" w:hAnsi="Times New Roman"/>
                 <w:b w:val="0"/>
-                <w:sz w:val="11"/>
+                <w:sz w:val="18"/>
               </w:rPr>
               <w:t>.9724</w:t>
             </w:r>
@@ -4495,12 +4879,16 @@
               <w:spacing w:after="0"/>
               <w:jc w:val="center"/>
             </w:pPr>
-            <w:r/>
+            <w:r>
+              <w:rPr>
+                <w:sz w:val="18"/>
+              </w:rPr>
+            </w:r>
             <w:r>
               <w:rPr>
                 <w:rFonts w:ascii="Times New Roman" w:hAnsi="Times New Roman"/>
                 <w:b w:val="0"/>
-                <w:sz w:val="11"/>
+                <w:sz w:val="18"/>
               </w:rPr>
               <w:t>.9406</w:t>
             </w:r>
@@ -4519,12 +4907,16 @@
               <w:spacing w:after="0"/>
               <w:jc w:val="center"/>
             </w:pPr>
-            <w:r/>
+            <w:r>
+              <w:rPr>
+                <w:sz w:val="18"/>
+              </w:rPr>
+            </w:r>
             <w:r>
               <w:rPr>
                 <w:rFonts w:ascii="Times New Roman" w:hAnsi="Times New Roman"/>
                 <w:b w:val="0"/>
-                <w:sz w:val="11"/>
+                <w:sz w:val="18"/>
               </w:rPr>
               <w:t>.9803</w:t>
             </w:r>
@@ -4543,12 +4935,16 @@
               <w:spacing w:after="0"/>
               <w:jc w:val="center"/>
             </w:pPr>
-            <w:r/>
+            <w:r>
+              <w:rPr>
+                <w:sz w:val="18"/>
+              </w:rPr>
+            </w:r>
             <w:r>
               <w:rPr>
                 <w:rFonts w:ascii="Times New Roman" w:hAnsi="Times New Roman"/>
                 <w:b w:val="0"/>
-                <w:sz w:val="11"/>
+                <w:sz w:val="18"/>
               </w:rPr>
               <w:t>.9563 [0.9477,0.9651]</w:t>
             </w:r>
@@ -4567,12 +4963,16 @@
               <w:spacing w:after="0"/>
               <w:jc w:val="center"/>
             </w:pPr>
-            <w:r/>
+            <w:r>
+              <w:rPr>
+                <w:sz w:val="18"/>
+              </w:rPr>
+            </w:r>
             <w:r>
               <w:rPr>
                 <w:rFonts w:ascii="Times New Roman" w:hAnsi="Times New Roman"/>
                 <w:b w:val="0"/>
-                <w:sz w:val="11"/>
+                <w:sz w:val="18"/>
               </w:rPr>
               <w:t>.9624</w:t>
             </w:r>
@@ -4591,12 +4991,16 @@
               <w:spacing w:after="0"/>
               <w:jc w:val="center"/>
             </w:pPr>
-            <w:r/>
+            <w:r>
+              <w:rPr>
+                <w:sz w:val="18"/>
+              </w:rPr>
+            </w:r>
             <w:r>
               <w:rPr>
                 <w:rFonts w:ascii="Times New Roman" w:hAnsi="Times New Roman"/>
                 <w:b w:val="0"/>
-                <w:sz w:val="11"/>
+                <w:sz w:val="18"/>
               </w:rPr>
               <w:t>.9877 [0.9833,0.9917]</w:t>
             </w:r>
@@ -4615,12 +5019,16 @@
               <w:spacing w:after="0"/>
               <w:jc w:val="center"/>
             </w:pPr>
-            <w:r/>
+            <w:r>
+              <w:rPr>
+                <w:sz w:val="18"/>
+              </w:rPr>
+            </w:r>
             <w:r>
               <w:rPr>
                 <w:rFonts w:ascii="Times New Roman" w:hAnsi="Times New Roman"/>
                 <w:b w:val="0"/>
-                <w:sz w:val="11"/>
+                <w:sz w:val="18"/>
               </w:rPr>
               <w:t>.9802</w:t>
             </w:r>
@@ -4639,12 +5047,16 @@
               <w:spacing w:after="0"/>
               <w:jc w:val="center"/>
             </w:pPr>
-            <w:r/>
+            <w:r>
+              <w:rPr>
+                <w:sz w:val="18"/>
+              </w:rPr>
+            </w:r>
             <w:r>
               <w:rPr>
                 <w:rFonts w:ascii="Times New Roman" w:hAnsi="Times New Roman"/>
                 <w:b w:val="0"/>
-                <w:sz w:val="11"/>
+                <w:sz w:val="18"/>
               </w:rPr>
               <w:t>.0400 [0.0311,0.0482]</w:t>
             </w:r>
@@ -4669,12 +5081,16 @@
               <w:spacing w:after="0"/>
               <w:jc w:val="center"/>
             </w:pPr>
-            <w:r/>
+            <w:r>
+              <w:rPr>
+                <w:sz w:val="18"/>
+              </w:rPr>
+            </w:r>
             <w:r>
               <w:rPr>
                 <w:rFonts w:ascii="Times New Roman" w:hAnsi="Times New Roman"/>
                 <w:b w:val="0"/>
-                <w:sz w:val="11"/>
+                <w:sz w:val="18"/>
               </w:rPr>
               <w:t>RawNet2 ext.</w:t>
             </w:r>
@@ -4693,12 +5109,16 @@
               <w:spacing w:after="0"/>
               <w:jc w:val="center"/>
             </w:pPr>
-            <w:r/>
+            <w:r>
+              <w:rPr>
+                <w:sz w:val="18"/>
+              </w:rPr>
+            </w:r>
             <w:r>
               <w:rPr>
                 <w:rFonts w:ascii="Times New Roman" w:hAnsi="Times New Roman"/>
                 <w:b w:val="0"/>
-                <w:sz w:val="11"/>
+                <w:sz w:val="18"/>
               </w:rPr>
               <w:t>.4380</w:t>
             </w:r>
@@ -4717,12 +5137,16 @@
               <w:spacing w:after="0"/>
               <w:jc w:val="center"/>
             </w:pPr>
-            <w:r/>
+            <w:r>
+              <w:rPr>
+                <w:sz w:val="18"/>
+              </w:rPr>
+            </w:r>
             <w:r>
               <w:rPr>
                 <w:rFonts w:ascii="Times New Roman" w:hAnsi="Times New Roman"/>
                 <w:b w:val="0"/>
-                <w:sz w:val="11"/>
+                <w:sz w:val="18"/>
               </w:rPr>
               <w:t>.6807</w:t>
             </w:r>
@@ -4741,12 +5165,16 @@
               <w:spacing w:after="0"/>
               <w:jc w:val="center"/>
             </w:pPr>
-            <w:r/>
+            <w:r>
+              <w:rPr>
+                <w:sz w:val="18"/>
+              </w:rPr>
+            </w:r>
             <w:r>
               <w:rPr>
                 <w:rFonts w:ascii="Times New Roman" w:hAnsi="Times New Roman"/>
                 <w:b w:val="0"/>
-                <w:sz w:val="11"/>
+                <w:sz w:val="18"/>
               </w:rPr>
               <w:t>.3556</w:t>
             </w:r>
@@ -4765,12 +5193,16 @@
               <w:spacing w:after="0"/>
               <w:jc w:val="center"/>
             </w:pPr>
-            <w:r/>
+            <w:r>
+              <w:rPr>
+                <w:sz w:val="18"/>
+              </w:rPr>
+            </w:r>
             <w:r>
               <w:rPr>
                 <w:rFonts w:ascii="Times New Roman" w:hAnsi="Times New Roman"/>
                 <w:b w:val="0"/>
-                <w:sz w:val="11"/>
+                <w:sz w:val="18"/>
               </w:rPr>
               <w:t>.5330 [0.5150,0.5489]</w:t>
             </w:r>
@@ -4789,12 +5221,16 @@
               <w:spacing w:after="0"/>
               <w:jc w:val="center"/>
             </w:pPr>
-            <w:r/>
+            <w:r>
+              <w:rPr>
+                <w:sz w:val="18"/>
+              </w:rPr>
+            </w:r>
             <w:r>
               <w:rPr>
                 <w:rFonts w:ascii="Times New Roman" w:hAnsi="Times New Roman"/>
                 <w:b w:val="0"/>
-                <w:sz w:val="11"/>
+                <w:sz w:val="18"/>
               </w:rPr>
               <w:t>.4900</w:t>
             </w:r>
@@ -4813,12 +5249,16 @@
               <w:spacing w:after="0"/>
               <w:jc w:val="center"/>
             </w:pPr>
-            <w:r/>
+            <w:r>
+              <w:rPr>
+                <w:sz w:val="18"/>
+              </w:rPr>
+            </w:r>
             <w:r>
               <w:rPr>
                 <w:rFonts w:ascii="Times New Roman" w:hAnsi="Times New Roman"/>
                 <w:b w:val="0"/>
-                <w:sz w:val="11"/>
+                <w:sz w:val="18"/>
               </w:rPr>
               <w:t>.5178 [0.4944,0.5395]</w:t>
             </w:r>
@@ -4837,12 +5277,16 @@
               <w:spacing w:after="0"/>
               <w:jc w:val="center"/>
             </w:pPr>
-            <w:r/>
+            <w:r>
+              <w:rPr>
+                <w:sz w:val="18"/>
+              </w:rPr>
+            </w:r>
             <w:r>
               <w:rPr>
                 <w:rFonts w:ascii="Times New Roman" w:hAnsi="Times New Roman"/>
                 <w:b w:val="0"/>
-                <w:sz w:val="11"/>
+                <w:sz w:val="18"/>
               </w:rPr>
               <w:t>.4161</w:t>
             </w:r>
@@ -4861,12 +5305,16 @@
               <w:spacing w:after="0"/>
               <w:jc w:val="center"/>
             </w:pPr>
-            <w:r/>
+            <w:r>
+              <w:rPr>
+                <w:sz w:val="18"/>
+              </w:rPr>
+            </w:r>
             <w:r>
               <w:rPr>
                 <w:rFonts w:ascii="Times New Roman" w:hAnsi="Times New Roman"/>
                 <w:b w:val="0"/>
-                <w:sz w:val="11"/>
+                <w:sz w:val="18"/>
               </w:rPr>
               <w:t>.4813 [0.4616,0.5016]</w:t>
             </w:r>
@@ -4894,12 +5342,16 @@
               <w:spacing w:after="0"/>
               <w:jc w:val="center"/>
             </w:pPr>
-            <w:r/>
+            <w:r>
+              <w:rPr>
+                <w:sz w:val="18"/>
+              </w:rPr>
+            </w:r>
             <w:r>
               <w:rPr>
                 <w:rFonts w:ascii="Times New Roman" w:hAnsi="Times New Roman"/>
                 <w:b w:val="0"/>
-                <w:sz w:val="11"/>
+                <w:sz w:val="18"/>
               </w:rPr>
               <w:t>AASIST ext.</w:t>
             </w:r>
@@ -4921,12 +5373,16 @@
               <w:spacing w:after="0"/>
               <w:jc w:val="center"/>
             </w:pPr>
-            <w:r/>
+            <w:r>
+              <w:rPr>
+                <w:sz w:val="18"/>
+              </w:rPr>
+            </w:r>
             <w:r>
               <w:rPr>
                 <w:rFonts w:ascii="Times New Roman" w:hAnsi="Times New Roman"/>
                 <w:b w:val="0"/>
-                <w:sz w:val="11"/>
+                <w:sz w:val="18"/>
               </w:rPr>
               <w:t>.4758</w:t>
             </w:r>
@@ -4948,12 +5404,16 @@
               <w:spacing w:after="0"/>
               <w:jc w:val="center"/>
             </w:pPr>
-            <w:r/>
+            <w:r>
+              <w:rPr>
+                <w:sz w:val="18"/>
+              </w:rPr>
+            </w:r>
             <w:r>
               <w:rPr>
                 <w:rFonts w:ascii="Times New Roman" w:hAnsi="Times New Roman"/>
                 <w:b w:val="0"/>
-                <w:sz w:val="11"/>
+                <w:sz w:val="18"/>
               </w:rPr>
               <w:t>.5585</w:t>
             </w:r>
@@ -4975,12 +5435,16 @@
               <w:spacing w:after="0"/>
               <w:jc w:val="center"/>
             </w:pPr>
-            <w:r/>
+            <w:r>
+              <w:rPr>
+                <w:sz w:val="18"/>
+              </w:rPr>
+            </w:r>
             <w:r>
               <w:rPr>
                 <w:rFonts w:ascii="Times New Roman" w:hAnsi="Times New Roman"/>
                 <w:b w:val="0"/>
-                <w:sz w:val="11"/>
+                <w:sz w:val="18"/>
               </w:rPr>
               <w:t>.5460</w:t>
             </w:r>
@@ -5002,12 +5466,16 @@
               <w:spacing w:after="0"/>
               <w:jc w:val="center"/>
             </w:pPr>
-            <w:r/>
+            <w:r>
+              <w:rPr>
+                <w:sz w:val="18"/>
+              </w:rPr>
+            </w:r>
             <w:r>
               <w:rPr>
                 <w:rFonts w:ascii="Times New Roman" w:hAnsi="Times New Roman"/>
                 <w:b w:val="0"/>
-                <w:sz w:val="11"/>
+                <w:sz w:val="18"/>
               </w:rPr>
               <w:t>.5139 [0.4928,0.5349]</w:t>
             </w:r>
@@ -5029,12 +5497,16 @@
               <w:spacing w:after="0"/>
               <w:jc w:val="center"/>
             </w:pPr>
-            <w:r/>
+            <w:r>
+              <w:rPr>
+                <w:sz w:val="18"/>
+              </w:rPr>
+            </w:r>
             <w:r>
               <w:rPr>
                 <w:rFonts w:ascii="Times New Roman" w:hAnsi="Times New Roman"/>
                 <w:b w:val="0"/>
-                <w:sz w:val="11"/>
+                <w:sz w:val="18"/>
               </w:rPr>
               <w:t>.5487</w:t>
             </w:r>
@@ -5056,12 +5528,16 @@
               <w:spacing w:after="0"/>
               <w:jc w:val="center"/>
             </w:pPr>
-            <w:r/>
+            <w:r>
+              <w:rPr>
+                <w:sz w:val="18"/>
+              </w:rPr>
+            </w:r>
             <w:r>
               <w:rPr>
                 <w:rFonts w:ascii="Times New Roman" w:hAnsi="Times New Roman"/>
                 <w:b w:val="0"/>
-                <w:sz w:val="11"/>
+                <w:sz w:val="18"/>
               </w:rPr>
               <w:t>.5597 [0.5377,0.5815]</w:t>
             </w:r>
@@ -5083,12 +5559,16 @@
               <w:spacing w:after="0"/>
               <w:jc w:val="center"/>
             </w:pPr>
-            <w:r/>
+            <w:r>
+              <w:rPr>
+                <w:sz w:val="18"/>
+              </w:rPr>
+            </w:r>
             <w:r>
               <w:rPr>
                 <w:rFonts w:ascii="Times New Roman" w:hAnsi="Times New Roman"/>
                 <w:b w:val="0"/>
-                <w:sz w:val="11"/>
+                <w:sz w:val="18"/>
               </w:rPr>
               <w:t>.4269</w:t>
             </w:r>
@@ -5110,12 +5590,16 @@
               <w:spacing w:after="0"/>
               <w:jc w:val="center"/>
             </w:pPr>
-            <w:r/>
+            <w:r>
+              <w:rPr>
+                <w:sz w:val="18"/>
+              </w:rPr>
+            </w:r>
             <w:r>
               <w:rPr>
                 <w:rFonts w:ascii="Times New Roman" w:hAnsi="Times New Roman"/>
                 <w:b w:val="0"/>
-                <w:sz w:val="11"/>
+                <w:sz w:val="18"/>
               </w:rPr>
               <w:t>.4463 [0.4279,0.4660]</w:t>
             </w:r>
@@ -5209,6 +5693,7 @@
       <w:r>
         <w:rPr>
           <w:rFonts w:ascii="Times New Roman" w:eastAsia="Times New Roman" w:hAnsi="Times New Roman" w:cs="Times New Roman"/>
+          <w:sz w:val="18"/>
         </w:rPr>
         <w:t>ROC</w:t>
       </w:r>
@@ -5290,6 +5775,7 @@
       <w:r>
         <w:rPr>
           <w:rFonts w:ascii="Times New Roman" w:eastAsia="Times New Roman" w:hAnsi="Times New Roman" w:cs="Times New Roman"/>
+          <w:sz w:val="18"/>
         </w:rPr>
         <w:t xml:space="preserve"> DET/EER</w:t>
       </w:r>
@@ -5306,6 +5792,9 @@
         </w:rPr>
       </w:pPr>
       <w:r>
+        <w:rPr>
+          <w:sz w:val="18"/>
+        </w:rPr>
         <w:t>Fig. 4. Full-test ROC and DET comparisons for six detector artifacts.</w:t>
       </w:r>
     </w:p>
@@ -5339,7 +5828,7 @@
         <w:rPr>
           <w:sz w:val="20"/>
         </w:rPr>
-        <w:t>All artifacts passed load, score, hash, and adapter checks. ShuffleNetV2 had the highest ROC-AUC (0.9929), PR-AUC (0.9898), specificity (0.9848), and lowest EER (0.0146), followed by MobileNetV3, MnasNet-A1, and the available EfficientNet-B0 warm-up checkpoint (Table 3). Table 3 reports the corresponding bootstrap intervals.</w:t>
+        <w:t>All artifacts passed load, score, hash, and adapter checks. ShuffleNetV2 had the highest ROC-AUC (0.9929), PR-AUC (0.9898), specificity (0.9848), and lowest EER (0.0146), followed by MobileNetV3, MnasNet-A1, and the available EfficientNet-B0 warm-up checkpoint (Table 3). Table 3 reports the corresponding bootstrap intervals, and Figure 4 shows the full-test ROC and DET curves.</w:t>
       </w:r>
     </w:p>
     <w:p>
@@ -5390,6 +5879,9 @@
         </w:rPr>
       </w:pPr>
       <w:r>
+        <w:rPr>
+          <w:sz w:val="18"/>
+        </w:rPr>
         <w:t>Table 4. Fixed 100-recording diagnostic stress results. ΔF1 is clean minus stressed perfor-mance; replay is simulated.</w:t>
       </w:r>
     </w:p>
@@ -5690,6 +6182,9 @@
               <w:ind w:firstLine="0"/>
             </w:pPr>
             <w:r>
+              <w:rPr>
+                <w:sz w:val="18"/>
+              </w:rPr>
               <w:t>MobileNetV3</w:t>
             </w:r>
           </w:p>
@@ -5710,6 +6205,9 @@
               <w:ind w:firstLine="0"/>
             </w:pPr>
             <w:r>
+              <w:rPr>
+                <w:sz w:val="18"/>
+              </w:rPr>
               <w:t>.9756</w:t>
             </w:r>
           </w:p>
@@ -5730,6 +6228,9 @@
               <w:ind w:firstLine="0"/>
             </w:pPr>
             <w:r>
+              <w:rPr>
+                <w:sz w:val="18"/>
+              </w:rPr>
               <w:t>.0476</w:t>
             </w:r>
           </w:p>
@@ -5750,6 +6251,9 @@
               <w:ind w:firstLine="0"/>
             </w:pPr>
             <w:r>
+              <w:rPr>
+                <w:sz w:val="18"/>
+              </w:rPr>
               <w:t>.6722</w:t>
             </w:r>
           </w:p>
@@ -5770,6 +6274,9 @@
               <w:ind w:firstLine="0"/>
             </w:pPr>
             <w:r>
+              <w:rPr>
+                <w:sz w:val="18"/>
+              </w:rPr>
               <w:t>.0095</w:t>
             </w:r>
           </w:p>
@@ -5790,6 +6297,9 @@
               <w:ind w:firstLine="0"/>
             </w:pPr>
             <w:r>
+              <w:rPr>
+                <w:sz w:val="18"/>
+              </w:rPr>
               <w:t>.0620</w:t>
             </w:r>
           </w:p>
@@ -5810,6 +6320,9 @@
               <w:ind w:firstLine="0"/>
             </w:pPr>
             <w:r>
+              <w:rPr>
+                <w:sz w:val="18"/>
+              </w:rPr>
               <w:t>.6657</w:t>
             </w:r>
           </w:p>
@@ -5836,6 +6349,9 @@
               <w:ind w:firstLine="0"/>
             </w:pPr>
             <w:r>
+              <w:rPr>
+                <w:sz w:val="18"/>
+              </w:rPr>
               <w:t>ShuffleNetV2</w:t>
             </w:r>
           </w:p>
@@ -5856,6 +6372,9 @@
               <w:ind w:firstLine="0"/>
             </w:pPr>
             <w:r>
+              <w:rPr>
+                <w:sz w:val="18"/>
+              </w:rPr>
               <w:t>.9756</w:t>
             </w:r>
           </w:p>
@@ -5876,6 +6395,9 @@
               <w:ind w:firstLine="0"/>
             </w:pPr>
             <w:r>
+              <w:rPr>
+                <w:sz w:val="18"/>
+              </w:rPr>
               <w:t>.0476</w:t>
             </w:r>
           </w:p>
@@ -5896,6 +6418,9 @@
               <w:ind w:firstLine="0"/>
             </w:pPr>
             <w:r>
+              <w:rPr>
+                <w:sz w:val="18"/>
+              </w:rPr>
               <w:t>.3555</w:t>
             </w:r>
           </w:p>
@@ -5916,6 +6441,9 @@
               <w:ind w:firstLine="0"/>
             </w:pPr>
             <w:r>
+              <w:rPr>
+                <w:sz w:val="18"/>
+              </w:rPr>
               <w:t>.0032</w:t>
             </w:r>
           </w:p>
@@ -5936,6 +6464,9 @@
               <w:ind w:firstLine="0"/>
             </w:pPr>
             <w:r>
+              <w:rPr>
+                <w:sz w:val="18"/>
+              </w:rPr>
               <w:t>.0256</w:t>
             </w:r>
           </w:p>
@@ -5956,6 +6487,9 @@
               <w:ind w:firstLine="0"/>
             </w:pPr>
             <w:r>
+              <w:rPr>
+                <w:sz w:val="18"/>
+              </w:rPr>
               <w:t>.8133</w:t>
             </w:r>
           </w:p>
@@ -5982,6 +6516,9 @@
               <w:ind w:firstLine="0"/>
             </w:pPr>
             <w:r>
+              <w:rPr>
+                <w:sz w:val="18"/>
+              </w:rPr>
               <w:t>MnasNet-A1</w:t>
             </w:r>
           </w:p>
@@ -6002,6 +6539,9 @@
               <w:ind w:firstLine="0"/>
             </w:pPr>
             <w:r>
+              <w:rPr>
+                <w:sz w:val="18"/>
+              </w:rPr>
               <w:t>.9756</w:t>
             </w:r>
           </w:p>
@@ -6022,6 +6562,9 @@
               <w:ind w:firstLine="0"/>
             </w:pPr>
             <w:r>
+              <w:rPr>
+                <w:sz w:val="18"/>
+              </w:rPr>
               <w:t>.0476</w:t>
             </w:r>
           </w:p>
@@ -6042,6 +6585,9 @@
               <w:ind w:firstLine="0"/>
             </w:pPr>
             <w:r>
+              <w:rPr>
+                <w:sz w:val="18"/>
+              </w:rPr>
               <w:t>.6119</w:t>
             </w:r>
           </w:p>
@@ -6062,6 +6608,9 @@
               <w:ind w:firstLine="0"/>
             </w:pPr>
             <w:r>
+              <w:rPr>
+                <w:sz w:val="18"/>
+              </w:rPr>
               <w:t>.0233</w:t>
             </w:r>
           </w:p>
@@ -6082,6 +6631,9 @@
               <w:ind w:firstLine="0"/>
             </w:pPr>
             <w:r>
+              <w:rPr>
+                <w:sz w:val="18"/>
+              </w:rPr>
               <w:t>.1489</w:t>
             </w:r>
           </w:p>
@@ -6102,6 +6654,9 @@
               <w:ind w:firstLine="0"/>
             </w:pPr>
             <w:r>
+              <w:rPr>
+                <w:sz w:val="18"/>
+              </w:rPr>
               <w:t>.6767</w:t>
             </w:r>
           </w:p>
@@ -6128,6 +6683,9 @@
               <w:ind w:firstLine="0"/>
             </w:pPr>
             <w:r>
+              <w:rPr>
+                <w:sz w:val="18"/>
+              </w:rPr>
               <w:t>EffNet-B0 warm-up</w:t>
             </w:r>
           </w:p>
@@ -6148,6 +6706,9 @@
               <w:ind w:firstLine="0"/>
             </w:pPr>
             <w:r>
+              <w:rPr>
+                <w:sz w:val="18"/>
+              </w:rPr>
               <w:t>.9630</w:t>
             </w:r>
           </w:p>
@@ -6168,6 +6729,9 @@
               <w:ind w:firstLine="0"/>
             </w:pPr>
             <w:r>
+              <w:rPr>
+                <w:sz w:val="18"/>
+              </w:rPr>
               <w:t>.0476</w:t>
             </w:r>
           </w:p>
@@ -6188,6 +6752,9 @@
               <w:ind w:firstLine="0"/>
             </w:pPr>
             <w:r>
+              <w:rPr>
+                <w:sz w:val="18"/>
+              </w:rPr>
               <w:t>.8053</w:t>
             </w:r>
           </w:p>
@@ -6208,6 +6775,9 @@
               <w:ind w:firstLine="0"/>
             </w:pPr>
             <w:r>
+              <w:rPr>
+                <w:sz w:val="18"/>
+              </w:rPr>
               <w:t>.0000</w:t>
             </w:r>
           </w:p>
@@ -6228,6 +6798,9 @@
               <w:ind w:firstLine="0"/>
             </w:pPr>
             <w:r>
+              <w:rPr>
+                <w:sz w:val="18"/>
+              </w:rPr>
               <w:t>.0641</w:t>
             </w:r>
           </w:p>
@@ -6248,6 +6821,9 @@
               <w:ind w:firstLine="0"/>
             </w:pPr>
             <w:r>
+              <w:rPr>
+                <w:sz w:val="18"/>
+              </w:rPr>
               <w:t>.5980</w:t>
             </w:r>
           </w:p>
@@ -6274,6 +6850,9 @@
               <w:ind w:firstLine="0"/>
             </w:pPr>
             <w:r>
+              <w:rPr>
+                <w:sz w:val="18"/>
+              </w:rPr>
               <w:t>RawNet2 ext.</w:t>
             </w:r>
           </w:p>
@@ -6294,6 +6873,9 @@
               <w:ind w:firstLine="0"/>
             </w:pPr>
             <w:r>
+              <w:rPr>
+                <w:sz w:val="18"/>
+              </w:rPr>
               <w:t>.5660</w:t>
             </w:r>
           </w:p>
@@ -6314,6 +6896,9 @@
               <w:ind w:firstLine="0"/>
             </w:pPr>
             <w:r>
+              <w:rPr>
+                <w:sz w:val="18"/>
+              </w:rPr>
               <w:t>.4138</w:t>
             </w:r>
           </w:p>
@@ -6334,6 +6919,9 @@
               <w:ind w:firstLine="0"/>
             </w:pPr>
             <w:r>
+              <w:rPr>
+                <w:sz w:val="18"/>
+              </w:rPr>
               <w:t>.5077</w:t>
             </w:r>
           </w:p>
@@ -6354,6 +6942,9 @@
               <w:ind w:firstLine="0"/>
             </w:pPr>
             <w:r>
+              <w:rPr>
+                <w:sz w:val="18"/>
+              </w:rPr>
               <w:t>−.0007</w:t>
             </w:r>
           </w:p>
@@ -6374,6 +6965,9 @@
               <w:ind w:firstLine="0"/>
             </w:pPr>
             <w:r>
+              <w:rPr>
+                <w:sz w:val="18"/>
+              </w:rPr>
               <w:t>−.0109</w:t>
             </w:r>
           </w:p>
@@ -6394,6 +6988,9 @@
               <w:ind w:firstLine="0"/>
             </w:pPr>
             <w:r>
+              <w:rPr>
+                <w:sz w:val="18"/>
+              </w:rPr>
               <w:t>.3419</w:t>
             </w:r>
           </w:p>
@@ -6420,6 +7017,9 @@
               <w:ind w:firstLine="0"/>
             </w:pPr>
             <w:r>
+              <w:rPr>
+                <w:sz w:val="18"/>
+              </w:rPr>
               <w:t>AASIST ext.</w:t>
             </w:r>
           </w:p>
@@ -6440,6 +7040,9 @@
               <w:ind w:firstLine="0"/>
             </w:pPr>
             <w:r>
+              <w:rPr>
+                <w:sz w:val="18"/>
+              </w:rPr>
               <w:t>.5060</w:t>
             </w:r>
           </w:p>
@@ -6460,6 +7063,9 @@
               <w:ind w:firstLine="0"/>
             </w:pPr>
             <w:r>
+              <w:rPr>
+                <w:sz w:val="18"/>
+              </w:rPr>
               <w:t>.3810</w:t>
             </w:r>
           </w:p>
@@ -6480,6 +7086,9 @@
               <w:ind w:firstLine="0"/>
             </w:pPr>
             <w:r>
+              <w:rPr>
+                <w:sz w:val="18"/>
+              </w:rPr>
               <w:t>−.0660</w:t>
             </w:r>
           </w:p>
@@ -6500,6 +7109,9 @@
               <w:ind w:firstLine="0"/>
             </w:pPr>
             <w:r>
+              <w:rPr>
+                <w:sz w:val="18"/>
+              </w:rPr>
               <w:t>−.0074</w:t>
             </w:r>
           </w:p>
@@ -6520,6 +7132,9 @@
               <w:ind w:firstLine="0"/>
             </w:pPr>
             <w:r>
+              <w:rPr>
+                <w:sz w:val="18"/>
+              </w:rPr>
               <w:t>−.0682</w:t>
             </w:r>
           </w:p>
@@ -6540,6 +7155,9 @@
               <w:ind w:firstLine="0"/>
             </w:pPr>
             <w:r>
+              <w:rPr>
+                <w:sz w:val="18"/>
+              </w:rPr>
               <w:t>.5462</w:t>
             </w:r>
           </w:p>
@@ -6625,6 +7243,7 @@
       <w:r>
         <w:rPr>
           <w:rFonts w:ascii="Times New Roman" w:eastAsia="Times New Roman" w:hAnsi="Times New Roman" w:cs="Times New Roman"/>
+          <w:sz w:val="18"/>
         </w:rPr>
         <w:t>(a) Nine-condition degradation</w:t>
       </w:r>
@@ -6650,6 +7269,7 @@
       <w:r>
         <w:rPr>
           <w:noProof/>
+          <w:sz w:val="18"/>
         </w:rPr>
         <w:drawing>
           <wp:inline distT="0" distB="0" distL="0" distR="0" wp14:anchorId="1A3D9CB0" wp14:editId="77B8E8D0">
@@ -6696,6 +7316,7 @@
       <w:r>
         <w:rPr>
           <w:rFonts w:ascii="Times New Roman" w:eastAsia="Times New Roman" w:hAnsi="Times New Roman" w:cs="Times New Roman"/>
+          <w:sz w:val="18"/>
         </w:rPr>
         <w:t xml:space="preserve"> (b) AWGN F1 trajectory</w:t>
       </w:r>
@@ -6712,6 +7333,9 @@
         </w:rPr>
       </w:pPr>
       <w:r>
+        <w:rPr>
+          <w:sz w:val="18"/>
+        </w:rPr>
         <w:t>Fig. 5. Fixed-subset degradation and AWGN F1; replay is simulated.</w:t>
       </w:r>
     </w:p>
@@ -6778,6 +7402,9 @@
         </w:rPr>
       </w:pPr>
       <w:r>
+        <w:rPr>
+          <w:sz w:val="18"/>
+        </w:rPr>
         <w:t>Table 5. Float32 batch-one desktop-CPU efficiency on AMD Ryzen 9 8940HX (10 warm-ups, 50 timed runs). RSS is whole-process memory.</w:t>
       </w:r>
     </w:p>
@@ -7150,6 +7777,9 @@
               <w:ind w:firstLine="0"/>
             </w:pPr>
             <w:r>
+              <w:rPr>
+                <w:sz w:val="18"/>
+              </w:rPr>
               <w:t>MobileNetV3</w:t>
             </w:r>
           </w:p>
@@ -7170,6 +7800,9 @@
               <w:ind w:firstLine="0"/>
             </w:pPr>
             <w:r>
+              <w:rPr>
+                <w:sz w:val="18"/>
+              </w:rPr>
               <w:t>1.31M</w:t>
             </w:r>
           </w:p>
@@ -7190,6 +7823,9 @@
               <w:ind w:firstLine="0"/>
             </w:pPr>
             <w:r>
+              <w:rPr>
+                <w:sz w:val="18"/>
+              </w:rPr>
               <w:t>5.64</w:t>
             </w:r>
           </w:p>
@@ -7210,6 +7846,9 @@
               <w:ind w:firstLine="0"/>
             </w:pPr>
             <w:r>
+              <w:rPr>
+                <w:sz w:val="18"/>
+              </w:rPr>
               <w:t>554.6</w:t>
             </w:r>
           </w:p>
@@ -7230,6 +7869,9 @@
               <w:ind w:firstLine="0"/>
             </w:pPr>
             <w:r>
+              <w:rPr>
+                <w:sz w:val="18"/>
+              </w:rPr>
               <w:t>30.07</w:t>
             </w:r>
           </w:p>
@@ -7250,6 +7892,9 @@
               <w:ind w:firstLine="0"/>
             </w:pPr>
             <w:r>
+              <w:rPr>
+                <w:sz w:val="18"/>
+              </w:rPr>
               <w:t>43.81</w:t>
             </w:r>
           </w:p>
@@ -7270,6 +7915,9 @@
               <w:ind w:firstLine="0"/>
             </w:pPr>
             <w:r>
+              <w:rPr>
+                <w:sz w:val="18"/>
+              </w:rPr>
               <w:t>52.12</w:t>
             </w:r>
           </w:p>
@@ -7290,6 +7938,9 @@
               <w:ind w:firstLine="0"/>
             </w:pPr>
             <w:r>
+              <w:rPr>
+                <w:sz w:val="18"/>
+              </w:rPr>
               <w:t>22.83</w:t>
             </w:r>
           </w:p>
@@ -7310,6 +7961,9 @@
               <w:ind w:firstLine="0"/>
             </w:pPr>
             <w:r>
+              <w:rPr>
+                <w:sz w:val="18"/>
+              </w:rPr>
               <w:t>.0146</w:t>
             </w:r>
           </w:p>
@@ -7336,6 +7990,9 @@
               <w:ind w:firstLine="0"/>
             </w:pPr>
             <w:r>
+              <w:rPr>
+                <w:sz w:val="18"/>
+              </w:rPr>
               <w:t>ShuffleNetV2</w:t>
             </w:r>
           </w:p>
@@ -7356,6 +8013,9 @@
               <w:ind w:firstLine="0"/>
             </w:pPr>
             <w:r>
+              <w:rPr>
+                <w:sz w:val="18"/>
+              </w:rPr>
               <w:t>1.87M</w:t>
             </w:r>
           </w:p>
@@ -7376,6 +8036,9 @@
               <w:ind w:firstLine="0"/>
             </w:pPr>
             <w:r>
+              <w:rPr>
+                <w:sz w:val="18"/>
+              </w:rPr>
               <w:t>7.74</w:t>
             </w:r>
           </w:p>
@@ -7396,6 +8059,9 @@
               <w:ind w:firstLine="0"/>
             </w:pPr>
             <w:r>
+              <w:rPr>
+                <w:sz w:val="18"/>
+              </w:rPr>
               <w:t>501.8</w:t>
             </w:r>
           </w:p>
@@ -7416,6 +8082,9 @@
               <w:ind w:firstLine="0"/>
             </w:pPr>
             <w:r>
+              <w:rPr>
+                <w:sz w:val="18"/>
+              </w:rPr>
               <w:t>48.05</w:t>
             </w:r>
           </w:p>
@@ -7436,6 +8105,9 @@
               <w:ind w:firstLine="0"/>
             </w:pPr>
             <w:r>
+              <w:rPr>
+                <w:sz w:val="18"/>
+              </w:rPr>
               <w:t>62.52</w:t>
             </w:r>
           </w:p>
@@ -7456,6 +8128,9 @@
               <w:ind w:firstLine="0"/>
             </w:pPr>
             <w:r>
+              <w:rPr>
+                <w:sz w:val="18"/>
+              </w:rPr>
               <w:t>75.37</w:t>
             </w:r>
           </w:p>
@@ -7476,6 +8151,9 @@
               <w:ind w:firstLine="0"/>
             </w:pPr>
             <w:r>
+              <w:rPr>
+                <w:sz w:val="18"/>
+              </w:rPr>
               <w:t>15.99</w:t>
             </w:r>
           </w:p>
@@ -7496,6 +8174,9 @@
               <w:ind w:firstLine="0"/>
             </w:pPr>
             <w:r>
+              <w:rPr>
+                <w:sz w:val="18"/>
+              </w:rPr>
               <w:t>.0208</w:t>
             </w:r>
           </w:p>
@@ -7522,6 +8203,9 @@
               <w:ind w:firstLine="0"/>
             </w:pPr>
             <w:r>
+              <w:rPr>
+                <w:sz w:val="18"/>
+              </w:rPr>
               <w:t>MnasNet-A1</w:t>
             </w:r>
           </w:p>
@@ -7542,6 +8226,9 @@
               <w:ind w:firstLine="0"/>
             </w:pPr>
             <w:r>
+              <w:rPr>
+                <w:sz w:val="18"/>
+              </w:rPr>
               <w:t>3.37M</w:t>
             </w:r>
           </w:p>
@@ -7562,6 +8249,9 @@
               <w:ind w:firstLine="0"/>
             </w:pPr>
             <w:r>
+              <w:rPr>
+                <w:sz w:val="18"/>
+              </w:rPr>
               <w:t>13.43</w:t>
             </w:r>
           </w:p>
@@ -7582,6 +8272,9 @@
               <w:ind w:firstLine="0"/>
             </w:pPr>
             <w:r>
+              <w:rPr>
+                <w:sz w:val="18"/>
+              </w:rPr>
               <w:t>566.0</w:t>
             </w:r>
           </w:p>
@@ -7602,6 +8295,9 @@
               <w:ind w:firstLine="0"/>
             </w:pPr>
             <w:r>
+              <w:rPr>
+                <w:sz w:val="18"/>
+              </w:rPr>
               <w:t>95.25</w:t>
             </w:r>
           </w:p>
@@ -7622,6 +8318,9 @@
               <w:ind w:firstLine="0"/>
             </w:pPr>
             <w:r>
+              <w:rPr>
+                <w:sz w:val="18"/>
+              </w:rPr>
               <w:t>117.00</w:t>
             </w:r>
           </w:p>
@@ -7642,6 +8341,9 @@
               <w:ind w:firstLine="0"/>
             </w:pPr>
             <w:r>
+              <w:rPr>
+                <w:sz w:val="18"/>
+              </w:rPr>
               <w:t>138.96</w:t>
             </w:r>
           </w:p>
@@ -7662,6 +8364,9 @@
               <w:ind w:firstLine="0"/>
             </w:pPr>
             <w:r>
+              <w:rPr>
+                <w:sz w:val="18"/>
+              </w:rPr>
               <w:t>8.55</w:t>
             </w:r>
           </w:p>
@@ -7682,6 +8387,9 @@
               <w:ind w:firstLine="0"/>
             </w:pPr>
             <w:r>
+              <w:rPr>
+                <w:sz w:val="18"/>
+              </w:rPr>
               <w:t>.0390</w:t>
             </w:r>
           </w:p>
@@ -7708,6 +8416,9 @@
               <w:ind w:firstLine="0"/>
             </w:pPr>
             <w:r>
+              <w:rPr>
+                <w:sz w:val="18"/>
+              </w:rPr>
               <w:t>EffNet-B0 warm-up</w:t>
             </w:r>
           </w:p>
@@ -7728,6 +8439,9 @@
               <w:ind w:firstLine="0"/>
             </w:pPr>
             <w:r>
+              <w:rPr>
+                <w:sz w:val="18"/>
+              </w:rPr>
               <w:t>4.78M</w:t>
             </w:r>
           </w:p>
@@ -7748,6 +8462,9 @@
               <w:ind w:firstLine="0"/>
             </w:pPr>
             <w:r>
+              <w:rPr>
+                <w:sz w:val="18"/>
+              </w:rPr>
               <w:t>18.96</w:t>
             </w:r>
           </w:p>
@@ -7768,6 +8485,9 @@
               <w:ind w:firstLine="0"/>
             </w:pPr>
             <w:r>
+              <w:rPr>
+                <w:sz w:val="18"/>
+              </w:rPr>
               <w:t>651.2</w:t>
             </w:r>
           </w:p>
@@ -7788,6 +8508,9 @@
               <w:ind w:firstLine="0"/>
             </w:pPr>
             <w:r>
+              <w:rPr>
+                <w:sz w:val="18"/>
+              </w:rPr>
               <w:t>168.36</w:t>
             </w:r>
           </w:p>
@@ -7808,6 +8531,9 @@
               <w:ind w:firstLine="0"/>
             </w:pPr>
             <w:r>
+              <w:rPr>
+                <w:sz w:val="18"/>
+              </w:rPr>
               <w:t>175.85</w:t>
             </w:r>
           </w:p>
@@ -7828,6 +8554,9 @@
               <w:ind w:firstLine="0"/>
             </w:pPr>
             <w:r>
+              <w:rPr>
+                <w:sz w:val="18"/>
+              </w:rPr>
               <w:t>196.11</w:t>
             </w:r>
           </w:p>
@@ -7848,6 +8577,9 @@
               <w:ind w:firstLine="0"/>
             </w:pPr>
             <w:r>
+              <w:rPr>
+                <w:sz w:val="18"/>
+              </w:rPr>
               <w:t>5.69</w:t>
             </w:r>
           </w:p>
@@ -7868,6 +8600,9 @@
               <w:ind w:firstLine="0"/>
             </w:pPr>
             <w:r>
+              <w:rPr>
+                <w:sz w:val="18"/>
+              </w:rPr>
               <w:t>.0586</w:t>
             </w:r>
           </w:p>
@@ -7894,6 +8629,9 @@
               <w:ind w:firstLine="0"/>
             </w:pPr>
             <w:r>
+              <w:rPr>
+                <w:sz w:val="18"/>
+              </w:rPr>
               <w:t>RawNet2 ext.</w:t>
             </w:r>
           </w:p>
@@ -7914,6 +8652,9 @@
               <w:ind w:firstLine="0"/>
             </w:pPr>
             <w:r>
+              <w:rPr>
+                <w:sz w:val="18"/>
+              </w:rPr>
               <w:t>17.62M</w:t>
             </w:r>
           </w:p>
@@ -7934,6 +8675,9 @@
               <w:ind w:firstLine="0"/>
             </w:pPr>
             <w:r>
+              <w:rPr>
+                <w:sz w:val="18"/>
+              </w:rPr>
               <w:t>67.65</w:t>
             </w:r>
           </w:p>
@@ -7954,6 +8698,9 @@
               <w:ind w:firstLine="0"/>
             </w:pPr>
             <w:r>
+              <w:rPr>
+                <w:sz w:val="18"/>
+              </w:rPr>
               <w:t>249.5</w:t>
             </w:r>
           </w:p>
@@ -7974,6 +8721,9 @@
               <w:ind w:firstLine="0"/>
             </w:pPr>
             <w:r>
+              <w:rPr>
+                <w:sz w:val="18"/>
+              </w:rPr>
               <w:t>95.10</w:t>
             </w:r>
           </w:p>
@@ -7994,6 +8744,9 @@
               <w:ind w:firstLine="0"/>
             </w:pPr>
             <w:r>
+              <w:rPr>
+                <w:sz w:val="18"/>
+              </w:rPr>
               <w:t>96.54</w:t>
             </w:r>
           </w:p>
@@ -8014,6 +8767,9 @@
               <w:ind w:firstLine="0"/>
             </w:pPr>
             <w:r>
+              <w:rPr>
+                <w:sz w:val="18"/>
+              </w:rPr>
               <w:t>102.62</w:t>
             </w:r>
           </w:p>
@@ -8034,6 +8790,9 @@
               <w:ind w:firstLine="0"/>
             </w:pPr>
             <w:r>
+              <w:rPr>
+                <w:sz w:val="18"/>
+              </w:rPr>
               <w:t>10.36</w:t>
             </w:r>
           </w:p>
@@ -8054,6 +8813,9 @@
               <w:ind w:firstLine="0"/>
             </w:pPr>
             <w:r>
+              <w:rPr>
+                <w:sz w:val="18"/>
+              </w:rPr>
               <w:t>.0239</w:t>
             </w:r>
           </w:p>
@@ -8080,6 +8842,9 @@
               <w:ind w:firstLine="0"/>
             </w:pPr>
             <w:r>
+              <w:rPr>
+                <w:sz w:val="18"/>
+              </w:rPr>
               <w:t>AASIST ext.</w:t>
             </w:r>
           </w:p>
@@ -8100,6 +8865,9 @@
               <w:ind w:firstLine="0"/>
             </w:pPr>
             <w:r>
+              <w:rPr>
+                <w:sz w:val="18"/>
+              </w:rPr>
               <w:t>0.30M</w:t>
             </w:r>
           </w:p>
@@ -8120,6 +8888,9 @@
               <w:ind w:firstLine="0"/>
             </w:pPr>
             <w:r>
+              <w:rPr>
+                <w:sz w:val="18"/>
+              </w:rPr>
               <w:t>1.61</w:t>
             </w:r>
           </w:p>
@@ -8140,6 +8911,9 @@
               <w:ind w:firstLine="0"/>
             </w:pPr>
             <w:r>
+              <w:rPr>
+                <w:sz w:val="18"/>
+              </w:rPr>
               <w:t>442.5</w:t>
             </w:r>
           </w:p>
@@ -8160,6 +8934,9 @@
               <w:ind w:firstLine="0"/>
             </w:pPr>
             <w:r>
+              <w:rPr>
+                <w:sz w:val="18"/>
+              </w:rPr>
               <w:t>359.61</w:t>
             </w:r>
           </w:p>
@@ -8180,6 +8957,9 @@
               <w:ind w:firstLine="0"/>
             </w:pPr>
             <w:r>
+              <w:rPr>
+                <w:sz w:val="18"/>
+              </w:rPr>
               <w:t>362.91</w:t>
             </w:r>
           </w:p>
@@ -8200,6 +8980,9 @@
               <w:ind w:firstLine="0"/>
             </w:pPr>
             <w:r>
+              <w:rPr>
+                <w:sz w:val="18"/>
+              </w:rPr>
               <w:t>398.45</w:t>
             </w:r>
           </w:p>
@@ -8220,6 +9003,9 @@
               <w:ind w:firstLine="0"/>
             </w:pPr>
             <w:r>
+              <w:rPr>
+                <w:sz w:val="18"/>
+              </w:rPr>
               <w:t>2.76</w:t>
             </w:r>
           </w:p>
@@ -8240,6 +9026,9 @@
               <w:ind w:firstLine="0"/>
             </w:pPr>
             <w:r>
+              <w:rPr>
+                <w:sz w:val="18"/>
+              </w:rPr>
               <w:t>.0899</w:t>
             </w:r>
           </w:p>
@@ -8282,6 +9071,7 @@
       <w:r>
         <w:rPr>
           <w:noProof/>
+          <w:sz w:val="18"/>
         </w:rPr>
         <w:drawing>
           <wp:inline distT="0" distB="0" distL="0" distR="0" wp14:anchorId="30F27A11" wp14:editId="65D71D9F">
@@ -8331,6 +9121,9 @@
         </w:rPr>
       </w:pPr>
       <w:r>
+        <w:rPr>
+          <w:sz w:val="18"/>
+        </w:rPr>
         <w:t>Fig. 6. Exploratory Pareto space under the evaluated objectives; stars mark non-dominated artifacts.</w:t>
       </w:r>
     </w:p>
@@ -8464,351 +9257,318 @@
         <w:t>References</w:t>
       </w:r>
     </w:p>
-    <w:tbl>
-      <w:tblPr>
-        <w:tblW w:type="auto" w:w="0"/>
-        <w:tblLayout w:type="fixed"/>
-        <w:tblLook w:firstColumn="1" w:firstRow="1" w:lastColumn="0" w:lastRow="0" w:noHBand="0" w:noVBand="1" w:val="04A0"/>
-        <w:tblBorders>
-          <w:top w:val="nil"/>
-          <w:left w:val="nil"/>
-          <w:bottom w:val="nil"/>
-          <w:right w:val="nil"/>
-          <w:insideH w:val="nil"/>
-          <w:insideV w:val="nil"/>
-        </w:tblBorders>
-      </w:tblPr>
-      <w:tblGrid>
-        <w:gridCol w:w="3459"/>
-        <w:gridCol w:w="3459"/>
-      </w:tblGrid>
-      <w:tr>
-        <w:tc>
-          <w:tcPr>
-            <w:tcW w:type="dxa" w:w="3427"/>
-            <w:vAlign w:val="top"/>
-          </w:tcPr>
-          <w:p>
-            <w:pPr>
-              <w:pStyle w:val="EndNoteBibliography"/>
-              <w:spacing w:before="0" w:after="0" w:line="128" w:lineRule="exact"/>
-            </w:pPr>
-            <w:r>
-              <w:rPr>
-                <w:rFonts w:ascii="Times New Roman" w:hAnsi="Times New Roman"/>
-                <w:sz w:val="12"/>
-              </w:rPr>
-              <w:t>[1] J. Yi et al., ‘Audio Deepfake Detection: A Survey,’ arXiv:2308.14970, 2023. doi:10.48550/arXiv.2308.14970.</w:t>
-            </w:r>
-          </w:p>
-          <w:p>
-            <w:pPr>
-              <w:pStyle w:val="EndNoteBibliography"/>
-              <w:spacing w:before="0" w:after="0" w:line="128" w:lineRule="exact"/>
-            </w:pPr>
-            <w:r>
-              <w:rPr>
-                <w:rFonts w:ascii="Times New Roman" w:hAnsi="Times New Roman"/>
-                <w:sz w:val="12"/>
-              </w:rPr>
-              <w:t>[2] M. Li, Y. Ahmadiadli, and X.-P. Zhang, ‘A Survey on Speech Deepfake Detection,’ ACM Computing Surveys, vol. 57, no. 7, pp. 1-38, 2025. doi:10.1145/3711898.</w:t>
-            </w:r>
-          </w:p>
-          <w:p>
-            <w:pPr>
-              <w:pStyle w:val="EndNoteBibliography"/>
-              <w:spacing w:before="0" w:after="0" w:line="128" w:lineRule="exact"/>
-            </w:pPr>
-            <w:r>
-              <w:rPr>
-                <w:rFonts w:ascii="Times New Roman" w:hAnsi="Times New Roman"/>
-                <w:sz w:val="12"/>
-              </w:rPr>
-              <w:t>[3] M. Todisco et al., ‘ASVspoof 2019: Future Horizons in Spoofed and Fake Audio Detection,’ Proc. Interspeech, pp. 1008-1012, 2019. doi:10.21437/Interspeech.2019-2249.</w:t>
-            </w:r>
-          </w:p>
-          <w:p>
-            <w:pPr>
-              <w:pStyle w:val="EndNoteBibliography"/>
-              <w:spacing w:before="0" w:after="0" w:line="128" w:lineRule="exact"/>
-            </w:pPr>
-            <w:r>
-              <w:rPr>
-                <w:rFonts w:ascii="Times New Roman" w:hAnsi="Times New Roman"/>
-                <w:sz w:val="12"/>
-              </w:rPr>
-              <w:t>[4] J. Frank and L. Schönherr, ‘WaveFake: A Data Set to Facilitate Audio Deepfake Detection,’ NeurIPS Datasets and Benchmarks, 2021, arXiv:2111.02813. doi:10.48550/arXiv.2111.02813.</w:t>
-            </w:r>
-          </w:p>
-          <w:p>
-            <w:pPr>
-              <w:pStyle w:val="EndNoteBibliography"/>
-              <w:spacing w:before="0" w:after="0" w:line="128" w:lineRule="exact"/>
-            </w:pPr>
-            <w:r>
-              <w:rPr>
-                <w:rFonts w:ascii="Times New Roman" w:hAnsi="Times New Roman"/>
-                <w:sz w:val="12"/>
-              </w:rPr>
-              <w:t>[5] J. Yamagishi et al., ‘ASVspoof 2021: Accelerating Progress in Spoofed and Deepfake Speech Detection,’ Proc. ASVspoof 2021 Workshop, pp. 47-54, 2021. doi:10.21437/ASVSPOOF.2021-8.</w:t>
-            </w:r>
-          </w:p>
-          <w:p>
-            <w:pPr>
-              <w:pStyle w:val="EndNoteBibliography"/>
-              <w:spacing w:before="0" w:after="0" w:line="128" w:lineRule="exact"/>
-            </w:pPr>
-            <w:r>
-              <w:rPr>
-                <w:rFonts w:ascii="Times New Roman" w:hAnsi="Times New Roman"/>
-                <w:sz w:val="12"/>
-              </w:rPr>
-              <w:t>[6] H. Tak et al., ‘End-to-End Anti-Spoofing with RawNet2,’ Proc. ICASSP, pp. 6369-6373, 2021. doi:10.1109/ICASSP39728.2021.9414234.</w:t>
-            </w:r>
-          </w:p>
-          <w:p>
-            <w:pPr>
-              <w:pStyle w:val="EndNoteBibliography"/>
-              <w:spacing w:before="0" w:after="0" w:line="128" w:lineRule="exact"/>
-            </w:pPr>
-            <w:r>
-              <w:rPr>
-                <w:rFonts w:ascii="Times New Roman" w:hAnsi="Times New Roman"/>
-                <w:sz w:val="12"/>
-              </w:rPr>
-              <w:t>[7] M. Ravanelli and Y. Bengio, ‘Speaker Recognition from Raw Waveform with SincNet,’ Proc. IEEE SLT Workshop, pp. 1021-1028, 2018. doi:10.1109/SLT.2018.8639585.</w:t>
-            </w:r>
-          </w:p>
-          <w:p>
-            <w:pPr>
-              <w:pStyle w:val="EndNoteBibliography"/>
-              <w:spacing w:before="0" w:after="0" w:line="128" w:lineRule="exact"/>
-            </w:pPr>
-            <w:r>
-              <w:rPr>
-                <w:rFonts w:ascii="Times New Roman" w:hAnsi="Times New Roman"/>
-                <w:sz w:val="12"/>
-              </w:rPr>
-              <w:t>[8] J.-w. Jung et al., ‘AASIST: Audio Anti-Spoofing Using Integrated Spectro-Temporal Graph Attention Networks,’ Proc. ICASSP, pp. 6367-6371, 2022. doi:10.1109/ICASSP43922.2022.9747766.</w:t>
-            </w:r>
-          </w:p>
-          <w:p>
-            <w:pPr>
-              <w:pStyle w:val="EndNoteBibliography"/>
-              <w:spacing w:before="0" w:after="0" w:line="128" w:lineRule="exact"/>
-            </w:pPr>
-            <w:r>
-              <w:rPr>
-                <w:rFonts w:ascii="Times New Roman" w:hAnsi="Times New Roman"/>
-                <w:sz w:val="12"/>
-              </w:rPr>
-              <w:t>[9] H. Tak et al., ‘Automatic Speaker Verification Spoofing and Deepfake Detection Using wav2vec 2.0 and Data Augmentation,’ Proc. Odyssey, pp. 112-119, 2022. doi:10.21437/Odyssey.2022-16.</w:t>
-            </w:r>
-          </w:p>
-          <w:p>
-            <w:pPr>
-              <w:pStyle w:val="EndNoteBibliography"/>
-              <w:spacing w:before="0" w:after="0" w:line="128" w:lineRule="exact"/>
-            </w:pPr>
-            <w:r>
-              <w:rPr>
-                <w:rFonts w:ascii="Times New Roman" w:hAnsi="Times New Roman"/>
-                <w:sz w:val="12"/>
-              </w:rPr>
-              <w:t>[10] O. Pascu et al., ‘Towards Generalisable and Calibrated Audio Deepfake Detection with Self-Supervised Representations,’ Proc. Interspeech, pp. 4828-4832, 2024. doi:10.21437/Interspeech.2024-1302.</w:t>
-            </w:r>
-          </w:p>
-          <w:p>
-            <w:pPr>
-              <w:pStyle w:val="EndNoteBibliography"/>
-              <w:spacing w:before="0" w:after="0" w:line="128" w:lineRule="exact"/>
-            </w:pPr>
-            <w:r>
-              <w:rPr>
-                <w:rFonts w:ascii="Times New Roman" w:hAnsi="Times New Roman"/>
-                <w:sz w:val="12"/>
-              </w:rPr>
-              <w:t>[11] N. M. Müller, P. Czempin, F. Dieckmann, A. Froghyar, and K. Böttinger, ‘Does Audio Deepfake Detection Generalize?’ Proc. Interspeech, pp. 2783-2787, 2022. doi:10.21437/Interspeech.2022-108.</w:t>
-            </w:r>
-          </w:p>
-          <w:p>
-            <w:pPr>
-              <w:pStyle w:val="EndNoteBibliography"/>
-              <w:spacing w:before="0" w:after="0" w:line="128" w:lineRule="exact"/>
-            </w:pPr>
-            <w:r>
-              <w:rPr>
-                <w:rFonts w:ascii="Times New Roman" w:hAnsi="Times New Roman"/>
-                <w:sz w:val="12"/>
-              </w:rPr>
-              <w:t>[12] P. Kawa, M. Plata, and P. Syga, ‘Attack Agnostic Dataset: Towards Generalization and Stabilization of Audio Deepfake Detection,’ Proc. Interspeech, pp. 4023-4027, 2022. doi:10.21437/Interspeech.2022-10078.</w:t>
-            </w:r>
-          </w:p>
-        </w:tc>
-        <w:tc>
-          <w:tcPr>
-            <w:tcW w:type="dxa" w:w="3427"/>
-            <w:vAlign w:val="top"/>
-          </w:tcPr>
-          <w:p>
-            <w:pPr>
-              <w:pStyle w:val="EndNoteBibliography"/>
-              <w:spacing w:before="0" w:after="0" w:line="128" w:lineRule="exact"/>
-            </w:pPr>
-            <w:r>
-              <w:rPr>
-                <w:rFonts w:ascii="Times New Roman" w:hAnsi="Times New Roman"/>
-                <w:sz w:val="12"/>
-              </w:rPr>
-              <w:t>[13] N. M. Müller et al., ‘Harder or Different? Understanding Generalization of Audio Deepfake Detection,’ Proc. Interspeech, pp. 2705-2709, 2024. doi:10.21437/Interspeech.2024-247.</w:t>
-            </w:r>
-          </w:p>
-          <w:p>
-            <w:pPr>
-              <w:pStyle w:val="EndNoteBibliography"/>
-              <w:spacing w:before="0" w:after="0" w:line="128" w:lineRule="exact"/>
-            </w:pPr>
-            <w:r>
-              <w:rPr>
-                <w:rFonts w:ascii="Times New Roman" w:hAnsi="Times New Roman"/>
-                <w:sz w:val="12"/>
-              </w:rPr>
-              <w:t>[14] Y. Li et al., ‘Cross-Domain Audio Deepfake Detection: Dataset and Analysis,’ Proc. EMNLP, pp. 4977-4983, 2024. doi:10.18653/v1/2024.emnlp-main.286.</w:t>
-            </w:r>
-          </w:p>
-          <w:p>
-            <w:pPr>
-              <w:pStyle w:val="EndNoteBibliography"/>
-              <w:spacing w:before="0" w:after="0" w:line="128" w:lineRule="exact"/>
-            </w:pPr>
-            <w:r>
-              <w:rPr>
-                <w:rFonts w:ascii="Times New Roman" w:hAnsi="Times New Roman"/>
-                <w:sz w:val="12"/>
-              </w:rPr>
-              <w:t>[15] A. Howard et al., ‘Searching for MobileNetV3,’ Proc. ICCV, pp. 1314-1324, 2019. doi:10.1109/ICCV.2019.00140.</w:t>
-            </w:r>
-          </w:p>
-          <w:p>
-            <w:pPr>
-              <w:pStyle w:val="EndNoteBibliography"/>
-              <w:spacing w:before="0" w:after="0" w:line="128" w:lineRule="exact"/>
-            </w:pPr>
-            <w:r>
-              <w:rPr>
-                <w:rFonts w:ascii="Times New Roman" w:hAnsi="Times New Roman"/>
-                <w:sz w:val="12"/>
-              </w:rPr>
-              <w:t>[16] N. Ma et al., ‘ShuffleNet V2: Practical Guidelines for Efficient CNN Architecture Design,’ Proc. ECCV, pp. 116-131, 2018. doi:10.1007/978-3-030-01264-9_8.</w:t>
-            </w:r>
-          </w:p>
-          <w:p>
-            <w:pPr>
-              <w:pStyle w:val="EndNoteBibliography"/>
-              <w:spacing w:before="0" w:after="0" w:line="128" w:lineRule="exact"/>
-            </w:pPr>
-            <w:r>
-              <w:rPr>
-                <w:rFonts w:ascii="Times New Roman" w:hAnsi="Times New Roman"/>
-                <w:sz w:val="12"/>
-              </w:rPr>
-              <w:t>[17] M. Sandler et al., ‘MobileNetV2: Inverted Residuals and Linear Bottlenecks,’ Proc. CVPR, pp. 4510-4520, 2018. doi:10.1109/CVPR.2018.00474.</w:t>
-            </w:r>
-          </w:p>
-          <w:p>
-            <w:pPr>
-              <w:pStyle w:val="EndNoteBibliography"/>
-              <w:spacing w:before="0" w:after="0" w:line="128" w:lineRule="exact"/>
-            </w:pPr>
-            <w:r>
-              <w:rPr>
-                <w:rFonts w:ascii="Times New Roman" w:hAnsi="Times New Roman"/>
-                <w:sz w:val="12"/>
-              </w:rPr>
-              <w:t>[18] X. Zhang et al., ‘ShuffleNet: An Extremely Efficient Convolutional Neural Network for Mobile Devices,’ Proc. CVPR, pp. 6848-6856, 2018. doi:10.1109/CVPR.2018.00716.</w:t>
-            </w:r>
-          </w:p>
-          <w:p>
-            <w:pPr>
-              <w:pStyle w:val="EndNoteBibliography"/>
-              <w:spacing w:before="0" w:after="0" w:line="128" w:lineRule="exact"/>
-            </w:pPr>
-            <w:r>
-              <w:rPr>
-                <w:rFonts w:ascii="Times New Roman" w:hAnsi="Times New Roman"/>
-                <w:sz w:val="12"/>
-              </w:rPr>
-              <w:t>[19] M. Tan et al., ‘MnasNet: Platform-Aware Neural Architecture Search for Mobile,’ Proc. CVPR, pp. 2820-2828, 2019. doi:10.1109/CVPR.2019.00293.</w:t>
-            </w:r>
-          </w:p>
-          <w:p>
-            <w:pPr>
-              <w:pStyle w:val="EndNoteBibliography"/>
-              <w:spacing w:before="0" w:after="0" w:line="128" w:lineRule="exact"/>
-            </w:pPr>
-            <w:r>
-              <w:rPr>
-                <w:rFonts w:ascii="Times New Roman" w:hAnsi="Times New Roman"/>
-                <w:sz w:val="12"/>
-              </w:rPr>
-              <w:t>[20] M. Tan and Q. V. Le, ‘EfficientNet: Rethinking Model Scaling for Convolutional Neural Networks,’ Proc. ICML, PMLR, vol. 97, pp. 6105-6114, 2019. https://proceedings.mlr.press/v97/tan19a.html.</w:t>
-            </w:r>
-          </w:p>
-          <w:p>
-            <w:pPr>
-              <w:pStyle w:val="EndNoteBibliography"/>
-              <w:spacing w:before="0" w:after="0" w:line="128" w:lineRule="exact"/>
-            </w:pPr>
-            <w:r>
-              <w:rPr>
-                <w:rFonts w:ascii="Times New Roman" w:hAnsi="Times New Roman"/>
-                <w:sz w:val="12"/>
-              </w:rPr>
-              <w:t>[21] B. McFee et al., ‘librosa: Audio and Music Signal Analysis in Python,’ Proc. 14th Python in Science Conference, pp. 18-25, 2015. doi:10.25080/Majora-7b98e3ed-003.</w:t>
-            </w:r>
-          </w:p>
-          <w:p>
-            <w:pPr>
-              <w:pStyle w:val="EndNoteBibliography"/>
-              <w:spacing w:before="0" w:after="0" w:line="128" w:lineRule="exact"/>
-            </w:pPr>
-            <w:r>
-              <w:rPr>
-                <w:rFonts w:ascii="Times New Roman" w:hAnsi="Times New Roman"/>
-                <w:sz w:val="12"/>
-              </w:rPr>
-              <w:t>[22] A. Das et al., ‘Generalizable Audio Spoofing Detection Using Non-Semantic Representations,’ Proc. Interspeech, pp. 4553-4557, 2025. doi:10.21437/Interspeech.2025-1555.</w:t>
-            </w:r>
-          </w:p>
-          <w:p>
-            <w:pPr>
-              <w:pStyle w:val="EndNoteBibliography"/>
-              <w:spacing w:before="0" w:after="0" w:line="128" w:lineRule="exact"/>
-            </w:pPr>
-            <w:r>
-              <w:rPr>
-                <w:rFonts w:ascii="Times New Roman" w:hAnsi="Times New Roman"/>
-                <w:sz w:val="12"/>
-              </w:rPr>
-              <w:t>[23] N. Müller et al., ‘Replay Attacks Against Audio Deepfake Detection,’ Proc. Interspeech, pp. 2245-2249, 2025. doi:10.21437/Interspeech.2025-20.</w:t>
-            </w:r>
-          </w:p>
-          <w:p>
-            <w:pPr>
-              <w:pStyle w:val="EndNoteBibliography"/>
-              <w:spacing w:before="0" w:after="0" w:line="128" w:lineRule="exact"/>
-            </w:pPr>
-            <w:r>
-              <w:rPr>
-                <w:rFonts w:ascii="Times New Roman" w:hAnsi="Times New Roman"/>
-                <w:sz w:val="12"/>
-              </w:rPr>
-              <w:t>[24] I.-P. Ciobanu et al., ‘XMAD-Bench: Cross-Domain Multilingual Audio Deepfake Benchmark,’ Findings of EACL, pp. 3109-3120, 2026. doi:10.18653/v1/2026.findings-eacl.162.</w:t>
-            </w:r>
-          </w:p>
-        </w:tc>
-      </w:tr>
-    </w:tbl>
+    <w:p>
+      <w:pPr>
+        <w:pStyle w:val="EndNoteBibliography"/>
+        <w:spacing w:before="0" w:after="20" w:line="240" w:lineRule="auto"/>
+      </w:pPr>
+      <w:r>
+        <w:rPr>
+          <w:rFonts w:ascii="Times New Roman" w:hAnsi="Times New Roman"/>
+          <w:sz w:val="18"/>
+        </w:rPr>
+        <w:t>[1] J. Yi et al., ‘Audio Deepfake Detection: A Survey,’ arXiv:2308.14970, 2023. doi:10.48550/arXiv.2308.14970.</w:t>
+      </w:r>
+    </w:p>
+    <w:p>
+      <w:pPr>
+        <w:pStyle w:val="EndNoteBibliography"/>
+        <w:spacing w:before="0" w:after="20" w:line="240" w:lineRule="auto"/>
+      </w:pPr>
+      <w:r>
+        <w:rPr>
+          <w:rFonts w:ascii="Times New Roman" w:hAnsi="Times New Roman"/>
+          <w:sz w:val="18"/>
+        </w:rPr>
+        <w:t>[2] M. Li, Y. Ahmadiadli, and X.-P. Zhang, ‘A Survey on Speech Deepfake Detection,’ ACM Computing Surveys, vol. 57, no. 7, pp. 1-38, 2025. doi:10.1145/3711898.</w:t>
+      </w:r>
+    </w:p>
+    <w:p>
+      <w:pPr>
+        <w:pStyle w:val="EndNoteBibliography"/>
+        <w:spacing w:before="0" w:after="20" w:line="240" w:lineRule="auto"/>
+      </w:pPr>
+      <w:r>
+        <w:rPr>
+          <w:rFonts w:ascii="Times New Roman" w:hAnsi="Times New Roman"/>
+          <w:sz w:val="18"/>
+        </w:rPr>
+        <w:t>[3] M. Todisco et al., ‘ASVspoof 2019: Future Horizons in Spoofed and Fake Audio Detection,’ Proc. Interspeech, pp. 1008-1012, 2019. doi:10.21437/Interspeech.2019-2249.</w:t>
+      </w:r>
+    </w:p>
+    <w:p>
+      <w:pPr>
+        <w:pStyle w:val="EndNoteBibliography"/>
+        <w:spacing w:before="0" w:after="20" w:line="240" w:lineRule="auto"/>
+      </w:pPr>
+      <w:r>
+        <w:rPr>
+          <w:rFonts w:ascii="Times New Roman" w:hAnsi="Times New Roman"/>
+          <w:sz w:val="18"/>
+        </w:rPr>
+        <w:t>[4] J. Frank and L. Schönherr, ‘WaveFake: A Data Set to Facilitate Audio Deepfake Detection,’ NeurIPS Datasets and Benchmarks, 2021, arXiv:2111.02813. doi:10.48550/arXiv.2111.02813.</w:t>
+      </w:r>
+    </w:p>
+    <w:p>
+      <w:pPr>
+        <w:pStyle w:val="EndNoteBibliography"/>
+        <w:spacing w:before="0" w:after="20" w:line="240" w:lineRule="auto"/>
+      </w:pPr>
+      <w:r>
+        <w:rPr>
+          <w:rFonts w:ascii="Times New Roman" w:hAnsi="Times New Roman"/>
+          <w:sz w:val="18"/>
+        </w:rPr>
+        <w:t>[5] J. Yamagishi et al., ‘ASVspoof 2021: Accelerating Progress in Spoofed and Deepfake Speech Detection,’ Proc. ASVspoof 2021 Workshop, pp. 47-54, 2021. doi:10.21437/ASVSPOOF.2021-8.</w:t>
+      </w:r>
+    </w:p>
+    <w:p>
+      <w:pPr>
+        <w:pStyle w:val="EndNoteBibliography"/>
+        <w:spacing w:before="0" w:after="20" w:line="240" w:lineRule="auto"/>
+      </w:pPr>
+      <w:r>
+        <w:rPr>
+          <w:rFonts w:ascii="Times New Roman" w:hAnsi="Times New Roman"/>
+          <w:sz w:val="18"/>
+        </w:rPr>
+        <w:t>[6] H. Tak et al., ‘End-to-End Anti-Spoofing with RawNet2,’ Proc. ICASSP, pp. 6369-6373, 2021. doi:10.1109/ICASSP39728.2021.9414234.</w:t>
+      </w:r>
+    </w:p>
+    <w:p>
+      <w:pPr>
+        <w:pStyle w:val="EndNoteBibliography"/>
+        <w:spacing w:before="0" w:after="20" w:line="240" w:lineRule="auto"/>
+      </w:pPr>
+      <w:r>
+        <w:rPr>
+          <w:rFonts w:ascii="Times New Roman" w:hAnsi="Times New Roman"/>
+          <w:sz w:val="18"/>
+        </w:rPr>
+        <w:t>[7] M. Ravanelli and Y. Bengio, ‘Speaker Recognition from Raw Waveform with SincNet,’ Proc. IEEE SLT Workshop, pp. 1021-1028, 2018. doi:10.1109/SLT.2018.8639585.</w:t>
+      </w:r>
+    </w:p>
+    <w:p>
+      <w:pPr>
+        <w:pStyle w:val="EndNoteBibliography"/>
+        <w:spacing w:before="0" w:after="20" w:line="240" w:lineRule="auto"/>
+      </w:pPr>
+      <w:r>
+        <w:rPr>
+          <w:rFonts w:ascii="Times New Roman" w:hAnsi="Times New Roman"/>
+          <w:sz w:val="18"/>
+        </w:rPr>
+        <w:t>[8] J.-w. Jung et al., ‘AASIST: Audio Anti-Spoofing Using Integrated Spectro-Temporal Graph Attention Networks,’ Proc. ICASSP, pp. 6367-6371, 2022. doi:10.1109/ICASSP43922.2022.9747766.</w:t>
+      </w:r>
+    </w:p>
+    <w:p>
+      <w:pPr>
+        <w:pStyle w:val="EndNoteBibliography"/>
+        <w:spacing w:before="0" w:after="20" w:line="240" w:lineRule="auto"/>
+      </w:pPr>
+      <w:r>
+        <w:rPr>
+          <w:rFonts w:ascii="Times New Roman" w:hAnsi="Times New Roman"/>
+          <w:sz w:val="18"/>
+        </w:rPr>
+        <w:t>[9] H. Tak et al., ‘Automatic Speaker Verification Spoofing and Deepfake Detection Using wav2vec 2.0 and Data Augmentation,’ Proc. Odyssey, pp. 112-119, 2022. doi:10.21437/Odyssey.2022-16.</w:t>
+      </w:r>
+    </w:p>
+    <w:p>
+      <w:pPr>
+        <w:pStyle w:val="EndNoteBibliography"/>
+        <w:spacing w:before="0" w:after="20" w:line="240" w:lineRule="auto"/>
+      </w:pPr>
+      <w:r>
+        <w:rPr>
+          <w:rFonts w:ascii="Times New Roman" w:hAnsi="Times New Roman"/>
+          <w:sz w:val="18"/>
+        </w:rPr>
+        <w:t>[10] O. Pascu et al., ‘Towards Generalisable and Calibrated Audio Deepfake Detection with Self-Supervised Representations,’ Proc. Interspeech, pp. 4828-4832, 2024. doi:10.21437/Interspeech.2024-1302.</w:t>
+      </w:r>
+    </w:p>
+    <w:p>
+      <w:pPr>
+        <w:pStyle w:val="EndNoteBibliography"/>
+        <w:spacing w:before="0" w:after="20" w:line="240" w:lineRule="auto"/>
+      </w:pPr>
+      <w:r>
+        <w:rPr>
+          <w:rFonts w:ascii="Times New Roman" w:hAnsi="Times New Roman"/>
+          <w:sz w:val="18"/>
+        </w:rPr>
+        <w:t>[11] N. M. Müller, P. Czempin, F. Dieckmann, A. Froghyar, and K. Böttinger, ‘Does Audio Deepfake Detection Generalize?’ Proc. Interspeech, pp. 2783-2787, 2022. doi:10.21437/Interspeech.2022-108.</w:t>
+      </w:r>
+    </w:p>
+    <w:p>
+      <w:pPr>
+        <w:pStyle w:val="EndNoteBibliography"/>
+        <w:spacing w:before="0" w:after="20" w:line="240" w:lineRule="auto"/>
+      </w:pPr>
+      <w:r>
+        <w:rPr>
+          <w:rFonts w:ascii="Times New Roman" w:hAnsi="Times New Roman"/>
+          <w:sz w:val="18"/>
+        </w:rPr>
+        <w:t>[12] P. Kawa, M. Plata, and P. Syga, ‘Attack Agnostic Dataset: Towards Generalization and Stabilization of Audio Deepfake Detection,’ Proc. Interspeech, pp. 4023-4027, 2022. doi:10.21437/Interspeech.2022-10078.</w:t>
+      </w:r>
+    </w:p>
+    <w:p>
+      <w:pPr>
+        <w:pStyle w:val="EndNoteBibliography"/>
+        <w:spacing w:before="0" w:after="20" w:line="240" w:lineRule="auto"/>
+      </w:pPr>
+      <w:r>
+        <w:rPr>
+          <w:rFonts w:ascii="Times New Roman" w:hAnsi="Times New Roman"/>
+          <w:sz w:val="18"/>
+        </w:rPr>
+        <w:t>[13] N. M. Müller et al., ‘Harder or Different? Understanding Generalization of Audio Deepfake Detection,’ Proc. Interspeech, pp. 2705-2709, 2024. doi:10.21437/Interspeech.2024-247.</w:t>
+      </w:r>
+    </w:p>
+    <w:p>
+      <w:pPr>
+        <w:pStyle w:val="EndNoteBibliography"/>
+        <w:spacing w:before="0" w:after="20" w:line="240" w:lineRule="auto"/>
+      </w:pPr>
+      <w:r>
+        <w:rPr>
+          <w:rFonts w:ascii="Times New Roman" w:hAnsi="Times New Roman"/>
+          <w:sz w:val="18"/>
+        </w:rPr>
+        <w:t>[14] Y. Li et al., ‘Cross-Domain Audio Deepfake Detection: Dataset and Analysis,’ Proc. EMNLP, pp. 4977-4983, 2024. doi:10.18653/v1/2024.emnlp-main.286.</w:t>
+      </w:r>
+    </w:p>
+    <w:p>
+      <w:pPr>
+        <w:pStyle w:val="EndNoteBibliography"/>
+        <w:spacing w:before="0" w:after="20" w:line="240" w:lineRule="auto"/>
+      </w:pPr>
+      <w:r>
+        <w:rPr>
+          <w:rFonts w:ascii="Times New Roman" w:hAnsi="Times New Roman"/>
+          <w:sz w:val="18"/>
+        </w:rPr>
+        <w:t>[15] A. Howard et al., ‘Searching for MobileNetV3,’ Proc. ICCV, pp. 1314-1324, 2019. doi:10.1109/ICCV.2019.00140.</w:t>
+      </w:r>
+    </w:p>
+    <w:p>
+      <w:pPr>
+        <w:pStyle w:val="EndNoteBibliography"/>
+        <w:spacing w:before="0" w:after="20" w:line="240" w:lineRule="auto"/>
+      </w:pPr>
+      <w:r>
+        <w:rPr>
+          <w:rFonts w:ascii="Times New Roman" w:hAnsi="Times New Roman"/>
+          <w:sz w:val="18"/>
+        </w:rPr>
+        <w:t>[16] N. Ma et al., ‘ShuffleNet V2: Practical Guidelines for Efficient CNN Architecture Design,’ Proc. ECCV, pp. 116-131, 2018. doi:10.1007/978-3-030-01264-9_8.</w:t>
+      </w:r>
+    </w:p>
+    <w:p>
+      <w:pPr>
+        <w:pStyle w:val="EndNoteBibliography"/>
+        <w:spacing w:before="0" w:after="20" w:line="240" w:lineRule="auto"/>
+      </w:pPr>
+      <w:r>
+        <w:rPr>
+          <w:rFonts w:ascii="Times New Roman" w:hAnsi="Times New Roman"/>
+          <w:sz w:val="18"/>
+        </w:rPr>
+        <w:t>[17] M. Sandler et al., ‘MobileNetV2: Inverted Residuals and Linear Bottlenecks,’ Proc. CVPR, pp. 4510-4520, 2018. doi:10.1109/CVPR.2018.00474.</w:t>
+      </w:r>
+    </w:p>
+    <w:p>
+      <w:pPr>
+        <w:pStyle w:val="EndNoteBibliography"/>
+        <w:spacing w:before="0" w:after="20" w:line="240" w:lineRule="auto"/>
+      </w:pPr>
+      <w:r>
+        <w:rPr>
+          <w:rFonts w:ascii="Times New Roman" w:hAnsi="Times New Roman"/>
+          <w:sz w:val="18"/>
+        </w:rPr>
+        <w:t>[18] X. Zhang et al., ‘ShuffleNet: An Extremely Efficient Convolutional Neural Network for Mobile Devices,’ Proc. CVPR, pp. 6848-6856, 2018. doi:10.1109/CVPR.2018.00716.</w:t>
+      </w:r>
+    </w:p>
+    <w:p>
+      <w:pPr>
+        <w:pStyle w:val="EndNoteBibliography"/>
+        <w:spacing w:before="0" w:after="20" w:line="240" w:lineRule="auto"/>
+      </w:pPr>
+      <w:r>
+        <w:rPr>
+          <w:rFonts w:ascii="Times New Roman" w:hAnsi="Times New Roman"/>
+          <w:sz w:val="18"/>
+        </w:rPr>
+        <w:t>[19] M. Tan et al., ‘MnasNet: Platform-Aware Neural Architecture Search for Mobile,’ Proc. CVPR, pp. 2820-2828, 2019. doi:10.1109/CVPR.2019.00293.</w:t>
+      </w:r>
+    </w:p>
+    <w:p>
+      <w:pPr>
+        <w:pStyle w:val="EndNoteBibliography"/>
+        <w:spacing w:before="0" w:after="20" w:line="240" w:lineRule="auto"/>
+      </w:pPr>
+      <w:r>
+        <w:rPr>
+          <w:rFonts w:ascii="Times New Roman" w:hAnsi="Times New Roman"/>
+          <w:sz w:val="18"/>
+        </w:rPr>
+        <w:t>[20] M. Tan and Q. V. Le, ‘EfficientNet: Rethinking Model Scaling for Convolutional Neural Networks,’ Proc. ICML, PMLR, vol. 97, pp. 6105-6114, 2019. https://proceedings.mlr.press/v97/tan19a.html.</w:t>
+      </w:r>
+    </w:p>
+    <w:p>
+      <w:pPr>
+        <w:pStyle w:val="EndNoteBibliography"/>
+        <w:spacing w:before="0" w:after="20" w:line="240" w:lineRule="auto"/>
+      </w:pPr>
+      <w:r>
+        <w:rPr>
+          <w:rFonts w:ascii="Times New Roman" w:hAnsi="Times New Roman"/>
+          <w:sz w:val="18"/>
+        </w:rPr>
+        <w:t>[21] B. McFee et al., ‘librosa: Audio and Music Signal Analysis in Python,’ Proc. 14th Python in Science Conference, pp. 18-25, 2015. doi:10.25080/Majora-7b98e3ed-003.</w:t>
+      </w:r>
+    </w:p>
+    <w:p>
+      <w:pPr>
+        <w:pStyle w:val="EndNoteBibliography"/>
+        <w:spacing w:before="0" w:after="20" w:line="240" w:lineRule="auto"/>
+      </w:pPr>
+      <w:r>
+        <w:rPr>
+          <w:rFonts w:ascii="Times New Roman" w:hAnsi="Times New Roman"/>
+          <w:sz w:val="18"/>
+        </w:rPr>
+        <w:t>[22] A. Das et al., ‘Generalizable Audio Spoofing Detection Using Non-Semantic Representations,’ Proc. Interspeech, pp. 4553-4557, 2025. doi:10.21437/Interspeech.2025-1555.</w:t>
+      </w:r>
+    </w:p>
+    <w:p>
+      <w:pPr>
+        <w:pStyle w:val="EndNoteBibliography"/>
+        <w:spacing w:before="0" w:after="20" w:line="240" w:lineRule="auto"/>
+      </w:pPr>
+      <w:r>
+        <w:rPr>
+          <w:rFonts w:ascii="Times New Roman" w:hAnsi="Times New Roman"/>
+          <w:sz w:val="18"/>
+        </w:rPr>
+        <w:t>[23] N. Müller et al., ‘Replay Attacks Against Audio Deepfake Detection,’ Proc. Interspeech, pp. 2245-2249, 2025. doi:10.21437/Interspeech.2025-20.</w:t>
+      </w:r>
+    </w:p>
+    <w:p>
+      <w:pPr>
+        <w:pStyle w:val="EndNoteBibliography"/>
+        <w:spacing w:before="0" w:after="20" w:line="240" w:lineRule="auto"/>
+      </w:pPr>
+      <w:r>
+        <w:rPr>
+          <w:rFonts w:ascii="Times New Roman" w:hAnsi="Times New Roman"/>
+          <w:sz w:val="18"/>
+        </w:rPr>
+        <w:t>[24] I.-P. Ciobanu et al., ‘XMAD-Bench: Cross-Domain Multilingual Audio Deepfake Benchmark,’ Findings of EACL, pp. 3109-3120, 2026. doi:10.18653/v1/2026.findings-eacl.162.</w:t>
+      </w:r>
+    </w:p>
     <w:p>
       <w:pPr>
         <w:pStyle w:val="p1a"/>
@@ -10263,7 +11023,7 @@
     </w:pPr>
     <w:rPr>
       <w:rFonts w:eastAsia="Times New Roman"/>
-      <w:sz w:val="20"/>
+      <w:sz w:val="18"/>
     </w:rPr>
   </w:style>
   <w:style w:type="paragraph" w:styleId="Heading10">
@@ -10379,6 +11139,7 @@
     <w:qFormat/>
     <w:rPr>
       <w:rFonts w:ascii="Arial" w:eastAsia="SimHei" w:hAnsi="Arial" w:cs="Arial"/>
+      <w:sz w:val="18"/>
     </w:rPr>
   </w:style>
   <w:style w:type="paragraph" w:styleId="Footer">

</xml_diff>